<commit_message>
Add brief methodology discussion to proposal and results.
</commit_message>
<xml_diff>
--- a/projectproposal.docx
+++ b/projectproposal.docx
@@ -2,7 +2,7 @@
 <file path=word/document.xml><?xml version="1.0" encoding="utf-8"?>
 <w:document xmlns:w="http://schemas.openxmlformats.org/wordprocessingml/2006/main" xmlns:m="http://schemas.openxmlformats.org/officeDocument/2006/math" xmlns:r="http://schemas.openxmlformats.org/officeDocument/2006/relationships" xmlns:o="urn:schemas-microsoft-com:office:office" xmlns:v="urn:schemas-microsoft-com:vml" xmlns:w10="urn:schemas-microsoft-com:office:word" xmlns:a="http://schemas.openxmlformats.org/drawingml/2006/main" xmlns:pic="http://schemas.openxmlformats.org/drawingml/2006/picture" xmlns:wp="http://schemas.openxmlformats.org/drawingml/2006/wordprocessingDrawing">
   <w:body>
-    <w:bookmarkStart w:id="17" w:name="independent-study-proposal"/>
+    <w:bookmarkStart w:id="18" w:name="independent-study-proposal"/>
     <w:p>
       <w:pPr>
         <w:pStyle w:val="Heading1"/>
@@ -798,7 +798,167 @@
     </w:p>
     <w:bookmarkEnd w:id="11"/>
     <w:bookmarkEnd w:id="12"/>
-    <w:bookmarkStart w:id="13" w:name="data-stack"/>
+    <w:bookmarkStart w:id="13" w:name="methodology-discussion-brief"/>
+    <w:p>
+      <w:pPr>
+        <w:pStyle w:val="Heading2"/>
+      </w:pPr>
+      <w:r>
+        <w:t xml:space="preserve">Methodology discussion (brief)</w:t>
+      </w:r>
+    </w:p>
+    <w:p>
+      <w:pPr>
+        <w:pStyle w:val="FirstParagraph"/>
+      </w:pPr>
+      <w:r>
+        <w:t xml:space="preserve">The core idea is test–retest reliability across a</w:t>
+      </w:r>
+      <w:r>
+        <w:t xml:space="preserve"> </w:t>
+      </w:r>
+      <w:r>
+        <w:rPr>
+          <w:b/>
+          <w:bCs/>
+        </w:rPr>
+        <w:t xml:space="preserve">league change</w:t>
+      </w:r>
+      <w:r>
+        <w:t xml:space="preserve">, not across seasons in the same league. For each per-90 metric we compute Pearson</w:t>
+      </w:r>
+      <w:r>
+        <w:t xml:space="preserve"> </w:t>
+      </w:r>
+      <w:r>
+        <w:rPr>
+          <w:i/>
+          <w:iCs/>
+        </w:rPr>
+        <w:t xml:space="preserve">r</w:t>
+      </w:r>
+      <w:r>
+        <w:t xml:space="preserve"> </w:t>
+      </w:r>
+      <w:r>
+        <w:t xml:space="preserve">between a player’s prior-league season and their first Bundesliga season. Metrics with</w:t>
+      </w:r>
+      <w:r>
+        <w:t xml:space="preserve"> </w:t>
+      </w:r>
+      <w:r>
+        <w:rPr>
+          <w:i/>
+          <w:iCs/>
+        </w:rPr>
+        <w:t xml:space="preserve">r</w:t>
+      </w:r>
+      <w:r>
+        <w:t xml:space="preserve"> </w:t>
+      </w:r>
+      <w:r>
+        <w:t xml:space="preserve">≥</w:t>
+      </w:r>
+      <w:r>
+        <w:t xml:space="preserve"> </w:t>
+      </w:r>
+      <w:r>
+        <w:rPr>
+          <w:b/>
+          <w:bCs/>
+        </w:rPr>
+        <w:t xml:space="preserve">0.70</w:t>
+      </w:r>
+      <w:r>
+        <w:t xml:space="preserve"> </w:t>
+      </w:r>
+      <w:r>
+        <w:t xml:space="preserve">are treated as portable (“travel well”); the rest are flagged as more style- or context-dependent.</w:t>
+      </w:r>
+    </w:p>
+    <w:p>
+      <w:pPr>
+        <w:pStyle w:val="BodyText"/>
+      </w:pPr>
+      <w:r>
+        <w:t xml:space="preserve">Those that clear the gate then go through a</w:t>
+      </w:r>
+      <w:r>
+        <w:t xml:space="preserve"> </w:t>
+      </w:r>
+      <w:r>
+        <w:rPr>
+          <w:b/>
+          <w:bCs/>
+        </w:rPr>
+        <w:t xml:space="preserve">redundancy</w:t>
+      </w:r>
+      <w:r>
+        <w:t xml:space="preserve"> </w:t>
+      </w:r>
+      <w:r>
+        <w:t xml:space="preserve">screen (pairwise |</w:t>
+      </w:r>
+      <w:r>
+        <w:rPr>
+          <w:i/>
+          <w:iCs/>
+        </w:rPr>
+        <w:t xml:space="preserve">r</w:t>
+      </w:r>
+      <w:r>
+        <w:t xml:space="preserve">| ≥ 0.70 within the stable set). Step 2 is human: choose which representative to keep when two stable metrics largely measure the same thing. Final scout cards and</w:t>
+      </w:r>
+      <w:r>
+        <w:t xml:space="preserve"> </w:t>
+      </w:r>
+      <w:r>
+        <w:rPr>
+          <w:b/>
+          <w:bCs/>
+        </w:rPr>
+        <w:t xml:space="preserve">pizza charts</w:t>
+      </w:r>
+      <w:r>
+        <w:t xml:space="preserve"> </w:t>
+      </w:r>
+      <w:r>
+        <w:t xml:space="preserve">use only that kept set, with</w:t>
+      </w:r>
+      <w:r>
+        <w:t xml:space="preserve"> </w:t>
+      </w:r>
+      <w:r>
+        <w:rPr>
+          <w:b/>
+          <w:bCs/>
+        </w:rPr>
+        <w:t xml:space="preserve">dotted reference lines for average Bundesliga peers</w:t>
+      </w:r>
+      <w:r>
+        <w:t xml:space="preserve"> </w:t>
+      </w:r>
+      <w:r>
+        <w:t xml:space="preserve">(and a top-peer ring) so arrivals are read against destination norms—not prior-league raw rates.</w:t>
+      </w:r>
+    </w:p>
+    <w:p>
+      <w:pPr>
+        <w:pStyle w:val="BodyText"/>
+      </w:pPr>
+      <w:r>
+        <w:t xml:space="preserve">Inbound status is inferred from playing records (first Bundesliga season / prior competition ≠ Bundesliga), so we do not rely on scraping Transfermarkt. A larger FBref cohort anchors Tier 1; StatsBomb open data is the event-level deep dive on a smaller overlapping sample. Open-data caveat: partial match coverage and mixed prior contexts (club + international) can compress or inflate some correlations, which is why findings are validated across tiers rather than treated as final on open data alone.</w:t>
+      </w:r>
+    </w:p>
+    <w:p>
+      <w:r>
+        <w:pict>
+          <v:rect style="width:0;height:1.5pt" o:hralign="center" o:hrstd="t" o:hr="t"/>
+        </w:pict>
+      </w:r>
+    </w:p>
+    <w:bookmarkEnd w:id="13"/>
+    <w:bookmarkStart w:id="14" w:name="data-stack"/>
     <w:p>
       <w:pPr>
         <w:pStyle w:val="Heading2"/>
@@ -924,8 +1084,8 @@
         </w:pict>
       </w:r>
     </w:p>
-    <w:bookmarkEnd w:id="13"/>
-    <w:bookmarkStart w:id="14" w:name="deliverables-current-package"/>
+    <w:bookmarkEnd w:id="14"/>
+    <w:bookmarkStart w:id="15" w:name="deliverables-current-package"/>
     <w:p>
       <w:pPr>
         <w:pStyle w:val="Heading2"/>
@@ -1159,8 +1319,8 @@
         </w:pict>
       </w:r>
     </w:p>
-    <w:bookmarkEnd w:id="14"/>
-    <w:bookmarkStart w:id="15" w:name="timeline-3-weeks"/>
+    <w:bookmarkEnd w:id="15"/>
+    <w:bookmarkStart w:id="16" w:name="timeline-3-weeks"/>
     <w:p>
       <w:pPr>
         <w:pStyle w:val="Heading2"/>
@@ -1323,8 +1483,8 @@
         </w:pict>
       </w:r>
     </w:p>
-    <w:bookmarkEnd w:id="15"/>
-    <w:bookmarkStart w:id="16" w:name="why-this-works"/>
+    <w:bookmarkEnd w:id="16"/>
+    <w:bookmarkStart w:id="17" w:name="why-this-works"/>
     <w:p>
       <w:pPr>
         <w:pStyle w:val="Heading2"/>
@@ -1463,8 +1623,8 @@
         <w:t xml:space="preserve">Attributions: FBref / Sports Reference; StatsBomb Open Data (where used).</w:t>
       </w:r>
     </w:p>
-    <w:bookmarkEnd w:id="16"/>
     <w:bookmarkEnd w:id="17"/>
+    <w:bookmarkEnd w:id="18"/>
     <w:sectPr>
       <w:footnotePr>
         <w:numRestart w:val="eachSect"/>

</xml_diff>

<commit_message>
Clarify proposal and deck language for external readers.
Spell out the pipeline, metric floors, and league-relative scaling; add a glossary slide and keep absolute per-90 rates after peer scaling failed.

Co-authored-by: Cursor <cursoragent@cursor.com>
</commit_message>
<xml_diff>
--- a/projectproposal.docx
+++ b/projectproposal.docx
@@ -61,7 +61,7 @@
     </w:p>
     <w:p>
       <w:r>
-        <w:t>| Tier 1 — Wide (FBref) | Prior → first Bundesliga Y1 at scale | FBref player-season stats across 19 leagues | 329 analysis-ready pairs |</w:t>
+        <w:t>| Tier 1 — Wide (FBref) | Prior → first Bundesliga Year-1 at scale | Football Reference (FBref) player-season stats across 19 leagues | 329 analysis-ready pairs |</w:t>
       </w:r>
     </w:p>
     <w:p>
@@ -72,13 +72,13 @@
     <w:p/>
     <w:p>
       <w:r>
-        <w:t>This extends the NYRB scouting-metric framework (stability → redundancy → pizza / profiles → success), focused on which stats travel well from the prior league into the Bundesliga — not Transfermarkt market value.</w:t>
+        <w:t>This extends the NYRB scouting-metric framework: metric stability testing with a floor, filtering to metric redundancy testing with a floor, filtering to a final per-position metric list for pizza chart–based player profiles, and finally testing for league-based success — focused on which stats travel well from the prior league into the Bundesliga, not Transfermarkt market value.</w:t>
       </w:r>
     </w:p>
     <w:p/>
     <w:p>
       <w:r>
-        <w:t>Inbound players are identified from FBref season records (first Bundesliga season / prior league ≠ Bundesliga), not from scraped Transfermarkt transfer tables.</w:t>
+        <w:t>Inbound players are identified from Football Reference (FBref) season statistics (a player’s first Bundesliga season / their prior professional league if non-Bundesliga), not from scraped Transfermarkt transfer tables.</w:t>
       </w:r>
     </w:p>
     <w:p/>
@@ -90,7 +90,7 @@
     <w:p/>
     <w:p>
       <w:r>
-        <w:t>FBref (Sports Reference) is the primary public dataset for scale metrics: viewable online; usable for coursework with attribution and rate-limited access. Respect their terms; do not redistribute raw dumps beyond the course.</w:t>
+        <w:t>Football Reference (FBref) / Sports Reference is the primary public dataset for scale metrics: viewable online; usable for coursework with attribution and rate-limited access. Respect their terms; do not redistribute raw dumps beyond the course.</w:t>
       </w:r>
     </w:p>
     <w:p/>
@@ -120,7 +120,7 @@
     <w:p/>
     <w:p>
       <w:r>
-        <w:t>- Who: Players with a first 1. Bundesliga season in end-years 2021–2025, with prior and Y1 minutes ≥ 300′, and a usable prior season outside 1. BL.</w:t>
+        <w:t>- Who: Players with a first 1. Bundesliga season in end-years 2021–2025, with prior and Year-1 minutes ≥ 300′, and a usable prior season outside the 1. Bundesliga.</w:t>
       </w:r>
     </w:p>
     <w:p>
@@ -130,12 +130,12 @@
     </w:p>
     <w:p>
       <w:r>
-        <w:t>- What we test: per-90 / rate metrics → 105 tested → category stability gates → 43 gated → light redundancy → 32 shortlisted.</w:t>
+        <w:t>- What we test: per-90 / rate metrics → 105 metrics tested → 43 metrics met the stability floor → 32 metrics met the redundancy floor for the final list.</w:t>
       </w:r>
     </w:p>
     <w:p>
       <w:r>
-        <w:t>- Why: Honest multi-league N for “which traits travel?” and “which feeders look strongest on Y1 minutes?”</w:t>
+        <w:t>- Why: Honest multi-league N for “which traits travel?” and “which feeders look strongest on Year-1 minutes?”</w:t>
       </w:r>
     </w:p>
     <w:p/>
@@ -150,7 +150,7 @@
     <w:p/>
     <w:p>
       <w:r>
-        <w:t>- Who: Same inbound logic on open data; BL open dumps only 2015/16 + 2023/24; priors from all male open competitions/seasons available (17 competitions in the working set). Minute floors stay on (relaxed for open-data thinness): prior ≥ 45′, BL Y1 ≥ 30′.</w:t>
+        <w:t>- Who: Same inbound logic on open data; 1. Bundesliga open dumps only 2015/16 + 2023/24; priors from all male open competitions/seasons available (17 competitions in the working set). Minute floors stay on (relaxed for open-data thinness): prior ≥ 45′, Bundesliga Year-1 ≥ 30′.</w:t>
       </w:r>
     </w:p>
     <w:p>
@@ -160,17 +160,17 @@
     </w:p>
     <w:p>
       <w:r>
-        <w:t xml:space="preserve">  1. Stability — correlate prior vs Bundesliga Y1 per-90. Gate r ≥ 0.40 → 7 of 16 metrics pass.</w:t>
+        <w:t xml:space="preserve">  1. Stability — correlate prior vs Bundesliga Year-1 per-90. Gate Pearson r ≥ 0.40 → 7 of 16 metrics pass.</w:t>
       </w:r>
     </w:p>
     <w:p>
       <w:r>
-        <w:t xml:space="preserve">  2. Redundancy — near-duplicates only at |r| ≥ 0.85 (so e.g. passes stays with progressive passes) → 7 kept.</w:t>
+        <w:t xml:space="preserve">  2. Redundancy — near-duplicates only at Pearson |r| ≥ 0.85 (so e.g. passes stays with progressive passes) → 7 kept.</w:t>
       </w:r>
     </w:p>
     <w:p>
       <w:r>
-        <w:t xml:space="preserve">  3. Pizza / explorer — profiles from that shortlist; success tests use Y1 minutes.</w:t>
+        <w:t xml:space="preserve">  3. Pizza / explorer — profiles from that shortlist; success tests use Year-1 Bundesliga minutes.</w:t>
       </w:r>
     </w:p>
     <w:p>
@@ -181,7 +181,7 @@
     <w:p/>
     <w:p>
       <w:r>
-        <w:t>Outputs: traits that transferred well (stability), a short non-redundant scout card (redundancy), interactive explorer / pizza charts, and feeder-league / trait→Y1 success readouts.</w:t>
+        <w:t>Outputs: traits that transferred well (stability), a short non-redundant scout card (redundancy), interactive explorer / pizza charts, and feeder-league / trait→Year-1 success readouts.</w:t>
       </w:r>
     </w:p>
     <w:p/>
@@ -208,31 +208,31 @@
     <w:p/>
     <w:p>
       <w:r>
-        <w:t>FBref gates (category-specific): Attacking / Passing / Other r ≥ 0.60; Defending / Carrying r ≥ 0.50. That yields 43 metrics from 105 tested. Redundancy at |r| ≥ 0.95 (pick order: stability → sample size → prefer rate/contextual), with force-keeps (SoT/90, Gls/90, Tkld Take, Att Total) → final shortlist 32.</w:t>
+        <w:t>FBref gates (category-specific): Attacking / Passing / Other Pearson r ≥ 0.60; Defending / Carrying Pearson r ≥ 0.50 (a slightly lower floor so enough defensive/carrying metrics remain for a usable shortlist). That yields 43 metrics that met the stability floor from 105 metrics tested. Redundancy at Pearson |r| ≥ 0.95 (pick order: stability → sample size → prefer rate/contextual) → 32 metrics met the redundancy floor for the final list.</w:t>
       </w:r>
     </w:p>
     <w:p/>
     <w:p>
       <w:r>
-        <w:t>StatsBomb gate: r ≥ 0.40 → 7 metrics; redundancy |r| ≥ 0.85 → keep all 7 (including passes).</w:t>
+        <w:t>StatsBomb gate: Pearson r ≥ 0.40 → 7 metrics; redundancy Pearson |r| ≥ 0.85 → keep all 7 (including passes).</w:t>
       </w:r>
     </w:p>
     <w:p/>
     <w:p>
       <w:r>
-        <w:t>League-relative scaling (within-league z / percentile) was tested on FBref rate→Y1 stability and did not help, so absolute per-90 rates were kept for both sources.</w:t>
+        <w:t>League-relative scaling: We tried scoring each rate as “how high is this vs peers in the same prior league” (within-league z-score or percentile) instead of the raw per-90. It did not improve prior→Bundesliga Year-1 stability on FBref, so we kept absolute per-90 rates for both sources.</w:t>
       </w:r>
     </w:p>
     <w:p/>
     <w:p>
       <w:r>
-        <w:t>Inbound status is inferred from playing records (first Bundesliga season / prior competition ≠ 1. BL). Success proxy for Phase 2 = Year-1 Bundesliga minutes (playing-time success), not market value.</w:t>
+        <w:t>Inbound status is inferred from playing records (first Bundesliga season / prior competition ≠ 1. Bundesliga). Success proxy for Phase 2 = Year-1 Bundesliga minutes (playing-time success), not market value.</w:t>
       </w:r>
     </w:p>
     <w:p/>
     <w:p>
       <w:r>
-        <w:t>Sample: Destination = 1. Bundesliga only. FBref first-BL window = end years 2021–2025, with the minutes restriction still applied (prior ≥ 300′ and Y1 ≥ 300′) — that is how we get analysis-ready N = 329, not every BL appearance. StatsBomb keeps its own lower floors (prior ≥ 45′, Y1 ≥ 30′) on open-data priors as above.</w:t>
+        <w:t>Sample: Destination = 1. Bundesliga only. FBref first-Bundesliga window = end years 2021–2025, with the minutes restriction still applied (prior ≥ 300′ and Year-1 ≥ 300′) — that is how we get analysis-ready N = 329, not every Bundesliga appearance. StatsBomb keeps its own lower floors (prior ≥ 45′, Year-1 ≥ 30′) on open-data priors as above.</w:t>
       </w:r>
     </w:p>
     <w:p/>
@@ -253,7 +253,7 @@
     <w:p/>
     <w:p>
       <w:r>
-        <w:t>Season dumps (slimmed to inbound-roster players): 2. Bundesliga · Eredivisie · Austria · Portugal · Belgium · Swiss · Turkey · Championship · Ligue 2 · Segunda · Serie B · Denmark · Poland · Czech (plus Big Five caches for Y1 / Big-5 priors). Working analysis uses 19 leagues populating the FBref tables; paired inbound N = 329.</w:t>
+        <w:t>Season dumps (slimmed to inbound-roster players): 2. Bundesliga · Eredivisie · Austria · Portugal · Belgium · Swiss · Turkey · Championship · Ligue 2 · Segunda · Serie B · Denmark · Poland · Czech (plus Big Five caches for Year-1 / Big-5 priors). Working analysis uses 19 leagues populating the FBref tables; paired inbound N = 329.</w:t>
       </w:r>
     </w:p>
     <w:p/>
@@ -274,7 +274,7 @@
     <w:p/>
     <w:p>
       <w:r>
-        <w:t>1. FBref — primary layer for stability / redundancy / pizza / success at scale (329 pairs · 32 traits).</w:t>
+        <w:t>1. Football Reference (FBref) — primary layer for stability / redundancy / pizza / success at scale (329 pairs · 32 traits).</w:t>
       </w:r>
     </w:p>
     <w:p>
@@ -315,7 +315,7 @@
     </w:p>
     <w:p>
       <w:r>
-        <w:t>| 2 | `bundesliga_transfer_traits.pptx` | Method + final results deck (includes project steps timeline + conclusion) |</w:t>
+        <w:t>| 2 | `bundesliga_transfer_traits.pptx` | Method + final results deck (includes project steps timeline + conclusion + metric glossary) |</w:t>
       </w:r>
     </w:p>
     <w:p>
@@ -330,7 +330,7 @@
     </w:p>
     <w:p>
       <w:r>
-        <w:t>| 5 | `README.md` / `results/` | Package notes + CSVs (stability, redundancy, success indicators) |</w:t>
+        <w:t>| 5 | `README.md` | Package notes + feeder-regression tables |</w:t>
       </w:r>
     </w:p>
     <w:p/>
@@ -351,13 +351,12 @@
     <w:p/>
     <w:p>
       <w:r>
-        <w:t>- Build the inbound cohort: first 1. BL season in the study window, prior season ≠ 1. BL, and clear the minutes floors (FBref prior/Y1 ≥ 300′; StatsBomb prior ≥ 45′ / Y1 ≥ 30′); pull that prior-league season’s stats</w:t>
+        <w:t>- Build the inbound cohort: first 1. Bundesliga season in the study window, prior season ≠ 1. Bundesliga, and clear the minutes floors (FBref prior/Year-1 ≥ 300′; StatsBomb prior ≥ 45′ / Year-1 ≥ 30′); pull that prior-league season’s stats</w:t>
       </w:r>
     </w:p>
-    <w:p/>
     <w:p>
       <w:r>
-        <w:t>- Stability — correlate prior → BL Year-1; choose source-specific thresholds so we keep enough metrics without pretending weak correlations are portable</w:t>
+        <w:t>- Stability — correlate prior → Bundesliga Year-1; choose source-specific thresholds so we keep enough metrics without pretending weak correlations are portable</w:t>
       </w:r>
     </w:p>
     <w:p>
@@ -367,7 +366,7 @@
     </w:p>
     <w:p>
       <w:r>
-        <w:t>- Profiles &amp; significance — explorer / pizza graphics; Spearman trait &amp; league tests vs Y1 minutes</w:t>
+        <w:t>- Profiles &amp; significance — explorer / pizza graphics; Spearman trait &amp; league tests vs Year-1 Bundesliga minutes</w:t>
       </w:r>
     </w:p>
     <w:p/>
@@ -388,7 +387,7 @@
     <w:p/>
     <w:p>
       <w:r>
-        <w:t>- Honest N: FBref 329 paired seasons for the scale story; StatsBomb 96 for event depth — not a claim that open data alone has hundreds of clean feeder→BL pairs.</w:t>
+        <w:t>- Honest N: FBref 329 paired seasons for the scale story; StatsBomb 96 for event depth — not a claim that open data alone has hundreds of clean feeder→Bundesliga pairs.</w:t>
       </w:r>
     </w:p>
     <w:p>
@@ -414,7 +413,7 @@
     <w:p/>
     <w:p>
       <w:r>
-        <w:t>Attributions: FBref / Sports Reference; StatsBomb Open Data (where used).</w:t>
+        <w:t>Attributions: Football Reference / Sports Reference; StatsBomb Open Data (where used).</w:t>
       </w:r>
     </w:p>
     <w:p/>

</xml_diff>

<commit_message>
Replace Y1 shorthand with Year 1 in Bundesliga across deliverables.
Makes the first-season outcome explicit in the proposal, README, deck, and explorer.

Co-authored-by: Cursor <cursoragent@cursor.com>
</commit_message>
<xml_diff>
--- a/projectproposal.docx
+++ b/projectproposal.docx
@@ -61,7 +61,7 @@
     </w:p>
     <w:p>
       <w:r>
-        <w:t>| Tier 1 — Wide (FBref) | Prior → first Bundesliga Year-1 at scale | Football Reference (FBref) player-season stats across 19 leagues | 329 analysis-ready pairs |</w:t>
+        <w:t>| Tier 1 — Wide (FBref) | Prior → Year 1 in Bundesliga at scale | Football Reference (FBref) player-season stats across 19 leagues | 329 analysis-ready pairs |</w:t>
       </w:r>
     </w:p>
     <w:p>
@@ -120,7 +120,7 @@
     <w:p/>
     <w:p>
       <w:r>
-        <w:t>- Who: Players with a first 1. Bundesliga season in end-years 2021–2025, with prior and Year-1 minutes ≥ 300′, and a usable prior season outside the 1. Bundesliga.</w:t>
+        <w:t>- Who: Players with a first 1. Bundesliga season in end-years 2021–2025, with prior and Year 1 in Bundesliga minutes ≥ 300′, and a usable prior season outside the 1. Bundesliga.</w:t>
       </w:r>
     </w:p>
     <w:p>
@@ -135,7 +135,7 @@
     </w:p>
     <w:p>
       <w:r>
-        <w:t>- Why: Honest multi-league N for “which traits travel?” and “which feeders look strongest on Year-1 minutes?”</w:t>
+        <w:t>- Why: Honest multi-league N for “which traits travel?” and “which feeders look strongest on Year 1 in Bundesliga minutes?”</w:t>
       </w:r>
     </w:p>
     <w:p/>
@@ -150,7 +150,7 @@
     <w:p/>
     <w:p>
       <w:r>
-        <w:t>- Who: Same inbound logic on open data; 1. Bundesliga open dumps only 2015/16 + 2023/24; priors from all male open competitions/seasons available (17 competitions in the working set). Minute floors stay on (relaxed for open-data thinness): prior ≥ 45′, Bundesliga Year-1 ≥ 30′.</w:t>
+        <w:t>- Who: Same inbound logic on open data; 1. Bundesliga open dumps only 2015/16 + 2023/24; priors from all male open competitions/seasons available (17 competitions in the working set). Minute floors stay on (relaxed for open-data thinness): prior ≥ 45′, Year 1 in Bundesliga ≥ 30′.</w:t>
       </w:r>
     </w:p>
     <w:p>
@@ -160,7 +160,7 @@
     </w:p>
     <w:p>
       <w:r>
-        <w:t xml:space="preserve">  1. Stability — correlate prior vs Bundesliga Year-1 per-90. Gate Pearson r ≥ 0.40 → 7 of 16 metrics pass.</w:t>
+        <w:t xml:space="preserve">  1. Stability — correlate prior vs Year 1 in Bundesliga per-90. Gate Pearson r ≥ 0.40 → 7 of 16 metrics pass.</w:t>
       </w:r>
     </w:p>
     <w:p>
@@ -170,7 +170,7 @@
     </w:p>
     <w:p>
       <w:r>
-        <w:t xml:space="preserve">  3. Pizza / explorer — profiles from that shortlist; success tests use Year-1 Bundesliga minutes.</w:t>
+        <w:t xml:space="preserve">  3. Pizza / explorer — profiles from that shortlist; success tests use Year 1 in Bundesliga minutes.</w:t>
       </w:r>
     </w:p>
     <w:p>
@@ -181,7 +181,7 @@
     <w:p/>
     <w:p>
       <w:r>
-        <w:t>Outputs: traits that transferred well (stability), a short non-redundant scout card (redundancy), interactive explorer / pizza charts, and feeder-league / trait→Year-1 success readouts.</w:t>
+        <w:t>Outputs: traits that transferred well (stability), a short non-redundant scout card (redundancy), interactive explorer / pizza charts, and feeder-league / trait→Year 1 in Bundesliga success readouts.</w:t>
       </w:r>
     </w:p>
     <w:p/>
@@ -220,19 +220,19 @@
     <w:p/>
     <w:p>
       <w:r>
-        <w:t>League-relative scaling: We tried scoring each rate as “how high is this vs peers in the same prior league” (within-league z-score or percentile) instead of the raw per-90. It did not improve prior→Bundesliga Year-1 stability on FBref, so we kept absolute per-90 rates for both sources.</w:t>
+        <w:t>League-relative scaling: We tried scoring each rate as “how high is this vs peers in the same prior league” (within-league z-score or percentile) instead of the raw per-90. It did not improve prior→Year 1 in Bundesliga stability on FBref, so we kept absolute per-90 rates for both sources.</w:t>
       </w:r>
     </w:p>
     <w:p/>
     <w:p>
       <w:r>
-        <w:t>Inbound status is inferred from playing records (first Bundesliga season / prior competition ≠ 1. Bundesliga). Success proxy for Phase 2 = Year-1 Bundesliga minutes (playing-time success), not market value.</w:t>
+        <w:t>Inbound status is inferred from playing records (first Bundesliga season / prior competition ≠ 1. Bundesliga). Success proxy for Phase 2 = Year 1 in Bundesliga minutes (playing-time success), not market value.</w:t>
       </w:r>
     </w:p>
     <w:p/>
     <w:p>
       <w:r>
-        <w:t>Sample: Destination = 1. Bundesliga only. FBref first-Bundesliga window = end years 2021–2025, with the minutes restriction still applied (prior ≥ 300′ and Year-1 ≥ 300′) — that is how we get analysis-ready N = 329, not every Bundesliga appearance. StatsBomb keeps its own lower floors (prior ≥ 45′, Year-1 ≥ 30′) on open-data priors as above.</w:t>
+        <w:t>Sample: Destination = 1. Bundesliga only. FBref first-Bundesliga window = end years 2021–2025, with the minutes restriction still applied (prior ≥ 300′ and Year 1 in Bundesliga ≥ 300′) — that is how we get analysis-ready N = 329, not every Bundesliga appearance. StatsBomb keeps its own lower floors (prior ≥ 45′, Year 1 in Bundesliga ≥ 30′) on open-data priors as above.</w:t>
       </w:r>
     </w:p>
     <w:p/>
@@ -253,7 +253,7 @@
     <w:p/>
     <w:p>
       <w:r>
-        <w:t>Season dumps (slimmed to inbound-roster players): 2. Bundesliga · Eredivisie · Austria · Portugal · Belgium · Swiss · Turkey · Championship · Ligue 2 · Segunda · Serie B · Denmark · Poland · Czech (plus Big Five caches for Year-1 / Big-5 priors). Working analysis uses 19 leagues populating the FBref tables; paired inbound N = 329.</w:t>
+        <w:t>Season dumps (slimmed to inbound-roster players): 2. Bundesliga · Eredivisie · Austria · Portugal · Belgium · Swiss · Turkey · Championship · Ligue 2 · Segunda · Serie B · Denmark · Poland · Czech (plus Big Five caches for Year 1 in Bundesliga / Big-5 priors). Working analysis uses 19 leagues populating the FBref tables; paired inbound N = 329.</w:t>
       </w:r>
     </w:p>
     <w:p/>
@@ -351,12 +351,12 @@
     <w:p/>
     <w:p>
       <w:r>
-        <w:t>- Build the inbound cohort: first 1. Bundesliga season in the study window, prior season ≠ 1. Bundesliga, and clear the minutes floors (FBref prior/Year-1 ≥ 300′; StatsBomb prior ≥ 45′ / Year-1 ≥ 30′); pull that prior-league season’s stats</w:t>
+        <w:t>- Build the inbound cohort: first 1. Bundesliga season in the study window, prior season ≠ 1. Bundesliga, and clear the minutes floors (FBref prior/Year 1 in Bundesliga ≥ 300′; StatsBomb prior ≥ 45′ / Year 1 in Bundesliga ≥ 30′); pull that prior-league season’s stats</w:t>
       </w:r>
     </w:p>
     <w:p>
       <w:r>
-        <w:t>- Stability — correlate prior → Bundesliga Year-1; choose source-specific thresholds so we keep enough metrics without pretending weak correlations are portable</w:t>
+        <w:t>- Stability — correlate prior → Year 1 in Bundesliga; choose source-specific thresholds so we keep enough metrics without pretending weak correlations are portable</w:t>
       </w:r>
     </w:p>
     <w:p>
@@ -366,7 +366,7 @@
     </w:p>
     <w:p>
       <w:r>
-        <w:t>- Profiles &amp; significance — explorer / pizza graphics; Spearman trait &amp; league tests vs Year-1 Bundesliga minutes</w:t>
+        <w:t>- Profiles &amp; significance — explorer / pizza graphics; Spearman trait &amp; league tests vs Year 1 in Bundesliga minutes</w:t>
       </w:r>
     </w:p>
     <w:p/>

</xml_diff>

<commit_message>
Rewrite proposal as a self-contained memo for external readers.
Define terms, expand the pipeline in sentences, and spell out sample floors so the memo stands alone without the deck.

Co-authored-by: Cursor <cursoragent@cursor.com>
</commit_message>
<xml_diff>
--- a/projectproposal.docx
+++ b/projectproposal.docx
@@ -7,23 +7,124 @@
         <w:pStyle w:val="Heading1"/>
       </w:pPr>
       <w:r>
-        <w:t>Independent Study Proposal</w:t>
+        <w:t>Independent Study Proposal / Memo</w:t>
       </w:r>
     </w:p>
     <w:p/>
     <w:p>
       <w:r>
-        <w:t>Working title: Which traits travel into the Bundesliga — and which source leagues should scouts prioritize?</w:t>
+        <w:rPr>
+          <w:rFonts w:ascii="Calibri" w:hAnsi="Calibri"/>
+          <w:sz w:val="22"/>
+        </w:rPr>
+      </w:r>
+      <w:r>
+        <w:rPr>
+          <w:rFonts w:ascii="Calibri" w:hAnsi="Calibri"/>
+          <w:b/>
+          <w:sz w:val="22"/>
+        </w:rPr>
+        <w:t>Working title:</w:t>
+      </w:r>
+      <w:r>
+        <w:rPr>
+          <w:rFonts w:ascii="Calibri" w:hAnsi="Calibri"/>
+          <w:sz w:val="22"/>
+        </w:rPr>
+        <w:t xml:space="preserve"> Which traits travel into the Bundesliga — and which source leagues should scouts prioritize?</w:t>
       </w:r>
     </w:p>
     <w:p>
       <w:r>
-        <w:t>Scope: Bundesliga destination only (narrow one-league inbound study)</w:t>
+        <w:rPr>
+          <w:rFonts w:ascii="Calibri" w:hAnsi="Calibri"/>
+          <w:sz w:val="22"/>
+        </w:rPr>
+      </w:r>
+      <w:r>
+        <w:rPr>
+          <w:rFonts w:ascii="Calibri" w:hAnsi="Calibri"/>
+          <w:b/>
+          <w:sz w:val="22"/>
+        </w:rPr>
+        <w:t>Author:</w:t>
+      </w:r>
+      <w:r>
+        <w:rPr>
+          <w:rFonts w:ascii="Calibri" w:hAnsi="Calibri"/>
+          <w:sz w:val="22"/>
+        </w:rPr>
+        <w:t xml:space="preserve"> Colby Morris · Berkeley Haas independent study</w:t>
+      </w:r>
+    </w:p>
+    <w:p>
+      <w:r>
+        <w:rPr>
+          <w:rFonts w:ascii="Calibri" w:hAnsi="Calibri"/>
+          <w:sz w:val="22"/>
+        </w:rPr>
+      </w:r>
+      <w:r>
+        <w:rPr>
+          <w:rFonts w:ascii="Calibri" w:hAnsi="Calibri"/>
+          <w:b/>
+          <w:sz w:val="22"/>
+        </w:rPr>
+        <w:t>Scope:</w:t>
+      </w:r>
+      <w:r>
+        <w:rPr>
+          <w:rFonts w:ascii="Calibri" w:hAnsi="Calibri"/>
+          <w:sz w:val="22"/>
+        </w:rPr>
+        <w:t xml:space="preserve"> Destination = </w:t>
+      </w:r>
+      <w:r>
+        <w:rPr>
+          <w:rFonts w:ascii="Calibri" w:hAnsi="Calibri"/>
+          <w:b/>
+          <w:sz w:val="22"/>
+        </w:rPr>
+        <w:t>1. Bundesliga</w:t>
+      </w:r>
+      <w:r>
+        <w:rPr>
+          <w:rFonts w:ascii="Calibri" w:hAnsi="Calibri"/>
+          <w:sz w:val="22"/>
+        </w:rPr>
+        <w:t xml:space="preserve"> only (inbound transfers into Germany’s top men’s division).</w:t>
+      </w:r>
+    </w:p>
+    <w:p>
+      <w:r>
+        <w:rPr>
+          <w:rFonts w:ascii="Calibri" w:hAnsi="Calibri"/>
+          <w:sz w:val="22"/>
+        </w:rPr>
+      </w:r>
+      <w:r>
+        <w:rPr>
+          <w:rFonts w:ascii="Calibri" w:hAnsi="Calibri"/>
+          <w:b/>
+          <w:sz w:val="22"/>
+        </w:rPr>
+        <w:t>Public package:</w:t>
+      </w:r>
+      <w:r>
+        <w:rPr>
+          <w:rFonts w:ascii="Calibri" w:hAnsi="Calibri"/>
+          <w:sz w:val="22"/>
+        </w:rPr>
+        <w:t xml:space="preserve"> https://github.com/colbymorris08/bundesliga-transfer-traits</w:t>
       </w:r>
     </w:p>
     <w:p/>
     <w:p>
       <w:r>
+        <w:rPr>
+          <w:rFonts w:ascii="Calibri" w:hAnsi="Calibri"/>
+          <w:sz w:val="22"/>
+        </w:rPr>
         <w:t>---</w:t>
       </w:r>
     </w:p>
@@ -33,69 +134,281 @@
         <w:pStyle w:val="Heading2"/>
       </w:pPr>
       <w:r>
-        <w:t>Research question</w:t>
+        <w:t>What this project is</w:t>
       </w:r>
     </w:p>
     <w:p/>
     <w:p>
       <w:r>
-        <w:t>When players transfer into the Bundesliga from other leagues, which performance traits remain stable vs. league-context, and which source leagues produce the most effective arrivals?</w:t>
+        <w:rPr>
+          <w:rFonts w:ascii="Calibri" w:hAnsi="Calibri"/>
+          <w:sz w:val="22"/>
+        </w:rPr>
+        <w:t xml:space="preserve">Clubs and scouts often ask two related questions when a player moves </w:t>
+      </w:r>
+      <w:r>
+        <w:rPr>
+          <w:rFonts w:ascii="Calibri" w:hAnsi="Calibri"/>
+          <w:b/>
+          <w:sz w:val="22"/>
+        </w:rPr>
+        <w:t>into the Bundesliga</w:t>
+      </w:r>
+      <w:r>
+        <w:rPr>
+          <w:rFonts w:ascii="Calibri" w:hAnsi="Calibri"/>
+          <w:sz w:val="22"/>
+        </w:rPr>
+        <w:t xml:space="preserve"> from another competition:</w:t>
       </w:r>
     </w:p>
     <w:p/>
     <w:p>
-      <w:r>
-        <w:t>Two evidence layers:</w:t>
+      <w:pPr>
+        <w:pStyle w:val="ListNumber"/>
+      </w:pPr>
+      <w:r>
+        <w:rPr>
+          <w:rFonts w:ascii="Calibri" w:hAnsi="Calibri"/>
+          <w:sz w:val="22"/>
+        </w:rPr>
+        <w:t xml:space="preserve">Which </w:t>
+      </w:r>
+      <w:r>
+        <w:rPr>
+          <w:rFonts w:ascii="Calibri" w:hAnsi="Calibri"/>
+          <w:b/>
+          <w:sz w:val="22"/>
+        </w:rPr>
+        <w:t>performance traits</w:t>
+      </w:r>
+      <w:r>
+        <w:rPr>
+          <w:rFonts w:ascii="Calibri" w:hAnsi="Calibri"/>
+          <w:sz w:val="22"/>
+        </w:rPr>
+        <w:t xml:space="preserve"> (passing volume, progressive carries, defensive actions, and so on) look </w:t>
+      </w:r>
+      <w:r>
+        <w:rPr>
+          <w:rFonts w:ascii="Calibri" w:hAnsi="Calibri"/>
+          <w:b/>
+          <w:sz w:val="22"/>
+        </w:rPr>
+        <w:t>similar before and after</w:t>
+      </w:r>
+      <w:r>
+        <w:rPr>
+          <w:rFonts w:ascii="Calibri" w:hAnsi="Calibri"/>
+          <w:sz w:val="22"/>
+        </w:rPr>
+        <w:t xml:space="preserve"> the move — i.e., which stats “travel” rather than reflecting only the prior league’s style or pace?</w:t>
+      </w:r>
+    </w:p>
+    <w:p>
+      <w:pPr>
+        <w:pStyle w:val="ListNumber"/>
+      </w:pPr>
+      <w:r>
+        <w:rPr>
+          <w:rFonts w:ascii="Calibri" w:hAnsi="Calibri"/>
+          <w:sz w:val="22"/>
+        </w:rPr>
+        <w:t xml:space="preserve">Which </w:t>
+      </w:r>
+      <w:r>
+        <w:rPr>
+          <w:rFonts w:ascii="Calibri" w:hAnsi="Calibri"/>
+          <w:b/>
+          <w:sz w:val="22"/>
+        </w:rPr>
+        <w:t>prior leagues</w:t>
+      </w:r>
+      <w:r>
+        <w:rPr>
+          <w:rFonts w:ascii="Calibri" w:hAnsi="Calibri"/>
+          <w:sz w:val="22"/>
+        </w:rPr>
+        <w:t xml:space="preserve"> (and which prior trait profiles) line up with a stronger </w:t>
+      </w:r>
+      <w:r>
+        <w:rPr>
+          <w:rFonts w:ascii="Calibri" w:hAnsi="Calibri"/>
+          <w:b/>
+          <w:sz w:val="22"/>
+        </w:rPr>
+        <w:t>first Bundesliga season</w:t>
+      </w:r>
+      <w:r>
+        <w:rPr>
+          <w:rFonts w:ascii="Calibri" w:hAnsi="Calibri"/>
+          <w:sz w:val="22"/>
+        </w:rPr>
+        <w:t>?</w:t>
       </w:r>
     </w:p>
     <w:p/>
     <w:p>
       <w:r>
-        <w:t>| Tier | Role | Data backbone | Headline N |</w:t>
-      </w:r>
-    </w:p>
-    <w:p>
-      <w:r>
-        <w:t>|------|------|---------------|------------|</w:t>
-      </w:r>
-    </w:p>
-    <w:p>
-      <w:r>
-        <w:t>| Tier 1 — Wide (FBref) | Prior → Year 1 in Bundesliga at scale | Football Reference (FBref) player-season stats across 19 leagues | 329 analysis-ready pairs |</w:t>
-      </w:r>
-    </w:p>
-    <w:p>
-      <w:r>
-        <w:t>| Tier 2 — Deep (StatsBomb) | Event-level portability check on the same inbound logic | StatsBomb Open Data (17 competitions as priors) | 96 cohort players |</w:t>
+        <w:rPr>
+          <w:rFonts w:ascii="Calibri" w:hAnsi="Calibri"/>
+          <w:sz w:val="22"/>
+        </w:rPr>
+        <w:t xml:space="preserve">This project answers those questions with a fixed, transparent pipeline on public data. It is </w:t>
+      </w:r>
+      <w:r>
+        <w:rPr>
+          <w:rFonts w:ascii="Calibri" w:hAnsi="Calibri"/>
+          <w:b/>
+          <w:sz w:val="22"/>
+        </w:rPr>
+        <w:t>not</w:t>
+      </w:r>
+      <w:r>
+        <w:rPr>
+          <w:rFonts w:ascii="Calibri" w:hAnsi="Calibri"/>
+          <w:sz w:val="22"/>
+        </w:rPr>
+        <w:t xml:space="preserve"> a market-value or Transfermarkt study. The open-data success marker is </w:t>
+      </w:r>
+      <w:r>
+        <w:rPr>
+          <w:rFonts w:ascii="Calibri" w:hAnsi="Calibri"/>
+          <w:b/>
+          <w:sz w:val="22"/>
+        </w:rPr>
+        <w:t>minutes played in the player’s first Bundesliga season</w:t>
+      </w:r>
+      <w:r>
+        <w:rPr>
+          <w:rFonts w:ascii="Calibri" w:hAnsi="Calibri"/>
+          <w:sz w:val="22"/>
+        </w:rPr>
+        <w:t xml:space="preserve"> (“Year 1 in Bundesliga minutes”): more minutes means the club gave the arrival a real role.</w:t>
       </w:r>
     </w:p>
     <w:p/>
     <w:p>
       <w:r>
-        <w:t>This extends the NYRB scouting-metric framework: metric stability testing with a floor, filtering to metric redundancy testing with a floor, filtering to a final per-position metric list for pizza chart–based player profiles, and finally testing for league-based success — focused on which stats travel well from the prior league into the Bundesliga, not Transfermarkt market value.</w:t>
+        <w:rPr>
+          <w:rFonts w:ascii="Calibri" w:hAnsi="Calibri"/>
+          <w:sz w:val="22"/>
+        </w:rPr>
+        <w:t>The work extends a scouting-metric framework used in a New York Red Bulls (NYRB) project setting, written out as four stages rather than jargon arrows:</w:t>
       </w:r>
     </w:p>
     <w:p/>
     <w:p>
-      <w:r>
-        <w:t>Inbound players are identified from Football Reference (FBref) season statistics (a player’s first Bundesliga season / their prior professional league if non-Bundesliga), not from scraped Transfermarkt transfer tables.</w:t>
+      <w:pPr>
+        <w:pStyle w:val="ListNumber"/>
+      </w:pPr>
+      <w:r>
+        <w:rPr>
+          <w:rFonts w:ascii="Calibri" w:hAnsi="Calibri"/>
+          <w:sz w:val="22"/>
+        </w:rPr>
+      </w:r>
+      <w:r>
+        <w:rPr>
+          <w:rFonts w:ascii="Calibri" w:hAnsi="Calibri"/>
+          <w:b/>
+          <w:sz w:val="22"/>
+        </w:rPr>
+        <w:t>Metric stability testing with a floor</w:t>
+      </w:r>
+      <w:r>
+        <w:rPr>
+          <w:rFonts w:ascii="Calibri" w:hAnsi="Calibri"/>
+          <w:sz w:val="22"/>
+        </w:rPr>
+        <w:t xml:space="preserve"> — for each rate statistic, correlate the prior-league season with Year 1 in the Bundesliga; keep only metrics that clear a minimum correlation.</w:t>
+      </w:r>
+    </w:p>
+    <w:p>
+      <w:pPr>
+        <w:pStyle w:val="ListNumber"/>
+      </w:pPr>
+      <w:r>
+        <w:rPr>
+          <w:rFonts w:ascii="Calibri" w:hAnsi="Calibri"/>
+          <w:sz w:val="22"/>
+        </w:rPr>
+      </w:r>
+      <w:r>
+        <w:rPr>
+          <w:rFonts w:ascii="Calibri" w:hAnsi="Calibri"/>
+          <w:b/>
+          <w:sz w:val="22"/>
+        </w:rPr>
+        <w:t>Metric redundancy testing with a floor</w:t>
+      </w:r>
+      <w:r>
+        <w:rPr>
+          <w:rFonts w:ascii="Calibri" w:hAnsi="Calibri"/>
+          <w:sz w:val="22"/>
+        </w:rPr>
+        <w:t xml:space="preserve"> — among the surviving metrics, drop near-duplicates so the scout card is short and non-redundant.</w:t>
+      </w:r>
+    </w:p>
+    <w:p>
+      <w:pPr>
+        <w:pStyle w:val="ListNumber"/>
+      </w:pPr>
+      <w:r>
+        <w:rPr>
+          <w:rFonts w:ascii="Calibri" w:hAnsi="Calibri"/>
+          <w:sz w:val="22"/>
+        </w:rPr>
+      </w:r>
+      <w:r>
+        <w:rPr>
+          <w:rFonts w:ascii="Calibri" w:hAnsi="Calibri"/>
+          <w:b/>
+          <w:sz w:val="22"/>
+        </w:rPr>
+        <w:t>Final per-position metric list → pizza / radar profiles</w:t>
+      </w:r>
+      <w:r>
+        <w:rPr>
+          <w:rFonts w:ascii="Calibri" w:hAnsi="Calibri"/>
+          <w:sz w:val="22"/>
+        </w:rPr>
+        <w:t xml:space="preserve"> — use that shortlist to build player profiles (interactive explorer and pizza-style category radars).</w:t>
+      </w:r>
+    </w:p>
+    <w:p>
+      <w:pPr>
+        <w:pStyle w:val="ListNumber"/>
+      </w:pPr>
+      <w:r>
+        <w:rPr>
+          <w:rFonts w:ascii="Calibri" w:hAnsi="Calibri"/>
+          <w:sz w:val="22"/>
+        </w:rPr>
+      </w:r>
+      <w:r>
+        <w:rPr>
+          <w:rFonts w:ascii="Calibri" w:hAnsi="Calibri"/>
+          <w:b/>
+          <w:sz w:val="22"/>
+        </w:rPr>
+        <w:t>League- and trait-based success testing</w:t>
+      </w:r>
+      <w:r>
+        <w:rPr>
+          <w:rFonts w:ascii="Calibri" w:hAnsi="Calibri"/>
+          <w:sz w:val="22"/>
+        </w:rPr>
+        <w:t xml:space="preserve"> — ask which prior traits and feeder leagues line up with more Year 1 in Bundesliga minutes (and, exploratorily, whether league labels still matter after controls).</w:t>
       </w:r>
     </w:p>
     <w:p/>
     <w:p>
       <w:r>
-        <w:t>---</w:t>
-      </w:r>
-    </w:p>
-    <w:p/>
-    <w:p>
-      <w:r>
-        <w:t>Football Reference (FBref) / Sports Reference is the primary public dataset for scale metrics: viewable online; usable for coursework with attribution and rate-limited access. Respect their terms; do not redistribute raw dumps beyond the course.</w:t>
-      </w:r>
-    </w:p>
-    <w:p/>
-    <w:p>
-      <w:r>
+        <w:rPr>
+          <w:rFonts w:ascii="Calibri" w:hAnsi="Calibri"/>
+          <w:sz w:val="22"/>
+        </w:rPr>
         <w:t>---</w:t>
       </w:r>
     </w:p>
@@ -105,7 +418,2207 @@
         <w:pStyle w:val="Heading2"/>
       </w:pPr>
       <w:r>
-        <w:t>Design (Bundesliga only)</w:t>
+        <w:t>Research question (explicit)</w:t>
+      </w:r>
+    </w:p>
+    <w:p/>
+    <w:p>
+      <w:r>
+        <w:rPr>
+          <w:rFonts w:ascii="Calibri" w:hAnsi="Calibri"/>
+          <w:sz w:val="22"/>
+        </w:rPr>
+        <w:t xml:space="preserve">When players transfer </w:t>
+      </w:r>
+      <w:r>
+        <w:rPr>
+          <w:rFonts w:ascii="Calibri" w:hAnsi="Calibri"/>
+          <w:b/>
+          <w:sz w:val="22"/>
+        </w:rPr>
+        <w:t>into the Bundesliga</w:t>
+      </w:r>
+      <w:r>
+        <w:rPr>
+          <w:rFonts w:ascii="Calibri" w:hAnsi="Calibri"/>
+          <w:sz w:val="22"/>
+        </w:rPr>
+        <w:t xml:space="preserve"> from other leagues, which performance traits remain </w:t>
+      </w:r>
+      <w:r>
+        <w:rPr>
+          <w:rFonts w:ascii="Calibri" w:hAnsi="Calibri"/>
+          <w:b/>
+          <w:sz w:val="22"/>
+        </w:rPr>
+        <w:t>stable across that league change</w:t>
+      </w:r>
+      <w:r>
+        <w:rPr>
+          <w:rFonts w:ascii="Calibri" w:hAnsi="Calibri"/>
+          <w:sz w:val="22"/>
+        </w:rPr>
+        <w:t xml:space="preserve">, and which </w:t>
+      </w:r>
+      <w:r>
+        <w:rPr>
+          <w:rFonts w:ascii="Calibri" w:hAnsi="Calibri"/>
+          <w:b/>
+          <w:sz w:val="22"/>
+        </w:rPr>
+        <w:t>source (feeder) leagues</w:t>
+      </w:r>
+      <w:r>
+        <w:rPr>
+          <w:rFonts w:ascii="Calibri" w:hAnsi="Calibri"/>
+          <w:sz w:val="22"/>
+        </w:rPr>
+        <w:t xml:space="preserve"> — and prior trait profiles — produce the most effective arrivals, where “effective” means </w:t>
+      </w:r>
+      <w:r>
+        <w:rPr>
+          <w:rFonts w:ascii="Calibri" w:hAnsi="Calibri"/>
+          <w:b/>
+          <w:sz w:val="22"/>
+        </w:rPr>
+        <w:t>more Year 1 in Bundesliga minutes</w:t>
+      </w:r>
+      <w:r>
+        <w:rPr>
+          <w:rFonts w:ascii="Calibri" w:hAnsi="Calibri"/>
+          <w:sz w:val="22"/>
+        </w:rPr>
+        <w:t>?</w:t>
+      </w:r>
+    </w:p>
+    <w:p/>
+    <w:p>
+      <w:r>
+        <w:rPr>
+          <w:rFonts w:ascii="Calibri" w:hAnsi="Calibri"/>
+          <w:sz w:val="22"/>
+        </w:rPr>
+        <w:t>“Stable vs. league-context” means: a high (or low) ranking on a per-90 rate in the prior league tends to recur in the first Bundesliga season, rather than disappearing once the player changes competition.</w:t>
+      </w:r>
+    </w:p>
+    <w:p/>
+    <w:p>
+      <w:r>
+        <w:rPr>
+          <w:rFonts w:ascii="Calibri" w:hAnsi="Calibri"/>
+          <w:sz w:val="22"/>
+        </w:rPr>
+        <w:t>---</w:t>
+      </w:r>
+    </w:p>
+    <w:p/>
+    <w:p>
+      <w:pPr>
+        <w:pStyle w:val="Heading2"/>
+      </w:pPr>
+      <w:r>
+        <w:t>Definitions (read once; used throughout)</w:t>
+      </w:r>
+    </w:p>
+    <w:p/>
+    <w:tbl>
+      <w:tblPr>
+        <w:tblStyle w:val="TableGrid"/>
+        <w:tblW w:type="auto" w:w="0"/>
+        <w:tblLook w:firstColumn="1" w:firstRow="1" w:lastColumn="0" w:lastRow="0" w:noHBand="0" w:noVBand="1" w:val="04A0"/>
+      </w:tblPr>
+      <w:tblGrid>
+        <w:gridCol w:w="1560"/>
+        <w:gridCol w:w="1560"/>
+        <w:gridCol w:w="1560"/>
+        <w:gridCol w:w="1560"/>
+        <w:gridCol w:w="1560"/>
+        <w:gridCol w:w="1560"/>
+      </w:tblGrid>
+      <w:tr>
+        <w:tc>
+          <w:tcPr>
+            <w:tcW w:type="dxa" w:w="1560"/>
+          </w:tcPr>
+          <w:p>
+            <w:r>
+              <w:rPr>
+                <w:b/>
+              </w:rPr>
+            </w:r>
+            <w:r>
+              <w:rPr>
+                <w:rFonts w:ascii="Calibri" w:hAnsi="Calibri"/>
+                <w:b/>
+                <w:sz w:val="22"/>
+              </w:rPr>
+              <w:t>Term</w:t>
+            </w:r>
+          </w:p>
+        </w:tc>
+        <w:tc>
+          <w:tcPr>
+            <w:tcW w:type="dxa" w:w="1560"/>
+          </w:tcPr>
+          <w:p>
+            <w:r>
+              <w:rPr>
+                <w:b/>
+              </w:rPr>
+            </w:r>
+            <w:r>
+              <w:rPr>
+                <w:rFonts w:ascii="Calibri" w:hAnsi="Calibri"/>
+                <w:b/>
+                <w:sz w:val="22"/>
+              </w:rPr>
+              <w:t>Meaning in this memo</w:t>
+            </w:r>
+          </w:p>
+        </w:tc>
+        <w:tc>
+          <w:tcPr>
+            <w:tcW w:type="dxa" w:w="1560"/>
+          </w:tcPr>
+          <w:p>
+            <w:r>
+              <w:rPr>
+                <w:b/>
+              </w:rPr>
+            </w:r>
+            <w:r>
+              <w:rPr>
+                <w:rFonts w:ascii="Calibri" w:hAnsi="Calibri"/>
+                <w:b/>
+                <w:sz w:val="22"/>
+              </w:rPr>
+            </w:r>
+          </w:p>
+        </w:tc>
+        <w:tc>
+          <w:tcPr>
+            <w:tcW w:type="dxa" w:w="1560"/>
+          </w:tcPr>
+          <w:p>
+            <w:r>
+              <w:rPr>
+                <w:b/>
+              </w:rPr>
+            </w:r>
+            <w:r>
+              <w:rPr>
+                <w:rFonts w:ascii="Calibri" w:hAnsi="Calibri"/>
+                <w:b/>
+                <w:sz w:val="22"/>
+              </w:rPr>
+            </w:r>
+          </w:p>
+        </w:tc>
+        <w:tc>
+          <w:tcPr>
+            <w:tcW w:type="dxa" w:w="1560"/>
+          </w:tcPr>
+          <w:p>
+            <w:r>
+              <w:rPr>
+                <w:b/>
+              </w:rPr>
+            </w:r>
+            <w:r>
+              <w:rPr>
+                <w:rFonts w:ascii="Calibri" w:hAnsi="Calibri"/>
+                <w:b/>
+                <w:sz w:val="22"/>
+              </w:rPr>
+            </w:r>
+          </w:p>
+        </w:tc>
+        <w:tc>
+          <w:tcPr>
+            <w:tcW w:type="dxa" w:w="1560"/>
+          </w:tcPr>
+          <w:p>
+            <w:r>
+              <w:rPr>
+                <w:b/>
+              </w:rPr>
+            </w:r>
+            <w:r>
+              <w:rPr>
+                <w:rFonts w:ascii="Calibri" w:hAnsi="Calibri"/>
+                <w:b/>
+                <w:sz w:val="22"/>
+              </w:rPr>
+            </w:r>
+          </w:p>
+        </w:tc>
+      </w:tr>
+      <w:tr>
+        <w:tc>
+          <w:tcPr>
+            <w:tcW w:type="dxa" w:w="1560"/>
+          </w:tcPr>
+          <w:p>
+            <w:r/>
+            <w:r>
+              <w:rPr>
+                <w:rFonts w:ascii="Calibri" w:hAnsi="Calibri"/>
+                <w:sz w:val="22"/>
+              </w:rPr>
+            </w:r>
+            <w:r>
+              <w:rPr>
+                <w:rFonts w:ascii="Calibri" w:hAnsi="Calibri"/>
+                <w:b/>
+                <w:sz w:val="22"/>
+              </w:rPr>
+              <w:t>1. Bundesliga</w:t>
+            </w:r>
+            <w:r>
+              <w:rPr>
+                <w:rFonts w:ascii="Calibri" w:hAnsi="Calibri"/>
+                <w:sz w:val="22"/>
+              </w:rPr>
+            </w:r>
+          </w:p>
+        </w:tc>
+        <w:tc>
+          <w:tcPr>
+            <w:tcW w:type="dxa" w:w="1560"/>
+          </w:tcPr>
+          <w:p>
+            <w:r/>
+            <w:r>
+              <w:rPr>
+                <w:rFonts w:ascii="Calibri" w:hAnsi="Calibri"/>
+                <w:sz w:val="22"/>
+              </w:rPr>
+              <w:t>Germany’s top men’s professional league (destination for every analysis pair).</w:t>
+            </w:r>
+          </w:p>
+        </w:tc>
+        <w:tc>
+          <w:tcPr>
+            <w:tcW w:type="dxa" w:w="1560"/>
+          </w:tcPr>
+          <w:p>
+            <w:r/>
+            <w:r>
+              <w:rPr>
+                <w:rFonts w:ascii="Calibri" w:hAnsi="Calibri"/>
+                <w:sz w:val="22"/>
+              </w:rPr>
+            </w:r>
+          </w:p>
+        </w:tc>
+        <w:tc>
+          <w:tcPr>
+            <w:tcW w:type="dxa" w:w="1560"/>
+          </w:tcPr>
+          <w:p>
+            <w:r/>
+            <w:r>
+              <w:rPr>
+                <w:rFonts w:ascii="Calibri" w:hAnsi="Calibri"/>
+                <w:sz w:val="22"/>
+              </w:rPr>
+            </w:r>
+          </w:p>
+        </w:tc>
+        <w:tc>
+          <w:tcPr>
+            <w:tcW w:type="dxa" w:w="1560"/>
+          </w:tcPr>
+          <w:p>
+            <w:r/>
+            <w:r>
+              <w:rPr>
+                <w:rFonts w:ascii="Calibri" w:hAnsi="Calibri"/>
+                <w:sz w:val="22"/>
+              </w:rPr>
+            </w:r>
+          </w:p>
+        </w:tc>
+        <w:tc>
+          <w:tcPr>
+            <w:tcW w:type="dxa" w:w="1560"/>
+          </w:tcPr>
+          <w:p>
+            <w:r/>
+            <w:r>
+              <w:rPr>
+                <w:rFonts w:ascii="Calibri" w:hAnsi="Calibri"/>
+                <w:sz w:val="22"/>
+              </w:rPr>
+            </w:r>
+          </w:p>
+        </w:tc>
+      </w:tr>
+      <w:tr>
+        <w:tc>
+          <w:tcPr>
+            <w:tcW w:type="dxa" w:w="1560"/>
+          </w:tcPr>
+          <w:p>
+            <w:r/>
+            <w:r>
+              <w:rPr>
+                <w:rFonts w:ascii="Calibri" w:hAnsi="Calibri"/>
+                <w:sz w:val="22"/>
+              </w:rPr>
+            </w:r>
+            <w:r>
+              <w:rPr>
+                <w:rFonts w:ascii="Calibri" w:hAnsi="Calibri"/>
+                <w:b/>
+                <w:sz w:val="22"/>
+              </w:rPr>
+              <w:t>Inbound / first Bundesliga season</w:t>
+            </w:r>
+            <w:r>
+              <w:rPr>
+                <w:rFonts w:ascii="Calibri" w:hAnsi="Calibri"/>
+                <w:sz w:val="22"/>
+              </w:rPr>
+            </w:r>
+          </w:p>
+        </w:tc>
+        <w:tc>
+          <w:tcPr>
+            <w:tcW w:type="dxa" w:w="1560"/>
+          </w:tcPr>
+          <w:p>
+            <w:r/>
+            <w:r>
+              <w:rPr>
+                <w:rFonts w:ascii="Calibri" w:hAnsi="Calibri"/>
+                <w:sz w:val="22"/>
+              </w:rPr>
+              <w:t>A player’s first season with recorded 1. Bundesliga minutes in the study window.</w:t>
+            </w:r>
+          </w:p>
+        </w:tc>
+        <w:tc>
+          <w:tcPr>
+            <w:tcW w:type="dxa" w:w="1560"/>
+          </w:tcPr>
+          <w:p>
+            <w:r/>
+            <w:r>
+              <w:rPr>
+                <w:rFonts w:ascii="Calibri" w:hAnsi="Calibri"/>
+                <w:sz w:val="22"/>
+              </w:rPr>
+            </w:r>
+          </w:p>
+        </w:tc>
+        <w:tc>
+          <w:tcPr>
+            <w:tcW w:type="dxa" w:w="1560"/>
+          </w:tcPr>
+          <w:p>
+            <w:r/>
+            <w:r>
+              <w:rPr>
+                <w:rFonts w:ascii="Calibri" w:hAnsi="Calibri"/>
+                <w:sz w:val="22"/>
+              </w:rPr>
+            </w:r>
+          </w:p>
+        </w:tc>
+        <w:tc>
+          <w:tcPr>
+            <w:tcW w:type="dxa" w:w="1560"/>
+          </w:tcPr>
+          <w:p>
+            <w:r/>
+            <w:r>
+              <w:rPr>
+                <w:rFonts w:ascii="Calibri" w:hAnsi="Calibri"/>
+                <w:sz w:val="22"/>
+              </w:rPr>
+            </w:r>
+          </w:p>
+        </w:tc>
+        <w:tc>
+          <w:tcPr>
+            <w:tcW w:type="dxa" w:w="1560"/>
+          </w:tcPr>
+          <w:p>
+            <w:r/>
+            <w:r>
+              <w:rPr>
+                <w:rFonts w:ascii="Calibri" w:hAnsi="Calibri"/>
+                <w:sz w:val="22"/>
+              </w:rPr>
+            </w:r>
+          </w:p>
+        </w:tc>
+      </w:tr>
+      <w:tr>
+        <w:tc>
+          <w:tcPr>
+            <w:tcW w:type="dxa" w:w="1560"/>
+          </w:tcPr>
+          <w:p>
+            <w:r/>
+            <w:r>
+              <w:rPr>
+                <w:rFonts w:ascii="Calibri" w:hAnsi="Calibri"/>
+                <w:sz w:val="22"/>
+              </w:rPr>
+            </w:r>
+            <w:r>
+              <w:rPr>
+                <w:rFonts w:ascii="Calibri" w:hAnsi="Calibri"/>
+                <w:b/>
+                <w:sz w:val="22"/>
+              </w:rPr>
+              <w:t>Prior season</w:t>
+            </w:r>
+            <w:r>
+              <w:rPr>
+                <w:rFonts w:ascii="Calibri" w:hAnsi="Calibri"/>
+                <w:sz w:val="22"/>
+              </w:rPr>
+            </w:r>
+          </w:p>
+        </w:tc>
+        <w:tc>
+          <w:tcPr>
+            <w:tcW w:type="dxa" w:w="1560"/>
+          </w:tcPr>
+          <w:p>
+            <w:r/>
+            <w:r>
+              <w:rPr>
+                <w:rFonts w:ascii="Calibri" w:hAnsi="Calibri"/>
+                <w:sz w:val="22"/>
+              </w:rPr>
+              <w:t xml:space="preserve">The professional season immediately before that first Bundesliga season, played in a </w:t>
+            </w:r>
+            <w:r>
+              <w:rPr>
+                <w:rFonts w:ascii="Calibri" w:hAnsi="Calibri"/>
+                <w:b/>
+                <w:sz w:val="22"/>
+              </w:rPr>
+              <w:t>non–1. Bundesliga</w:t>
+            </w:r>
+            <w:r>
+              <w:rPr>
+                <w:rFonts w:ascii="Calibri" w:hAnsi="Calibri"/>
+                <w:sz w:val="22"/>
+              </w:rPr>
+              <w:t xml:space="preserve"> competition.</w:t>
+            </w:r>
+          </w:p>
+        </w:tc>
+        <w:tc>
+          <w:tcPr>
+            <w:tcW w:type="dxa" w:w="1560"/>
+          </w:tcPr>
+          <w:p>
+            <w:r/>
+            <w:r>
+              <w:rPr>
+                <w:rFonts w:ascii="Calibri" w:hAnsi="Calibri"/>
+                <w:sz w:val="22"/>
+              </w:rPr>
+            </w:r>
+          </w:p>
+        </w:tc>
+        <w:tc>
+          <w:tcPr>
+            <w:tcW w:type="dxa" w:w="1560"/>
+          </w:tcPr>
+          <w:p>
+            <w:r/>
+            <w:r>
+              <w:rPr>
+                <w:rFonts w:ascii="Calibri" w:hAnsi="Calibri"/>
+                <w:sz w:val="22"/>
+              </w:rPr>
+            </w:r>
+          </w:p>
+        </w:tc>
+        <w:tc>
+          <w:tcPr>
+            <w:tcW w:type="dxa" w:w="1560"/>
+          </w:tcPr>
+          <w:p>
+            <w:r/>
+            <w:r>
+              <w:rPr>
+                <w:rFonts w:ascii="Calibri" w:hAnsi="Calibri"/>
+                <w:sz w:val="22"/>
+              </w:rPr>
+            </w:r>
+          </w:p>
+        </w:tc>
+        <w:tc>
+          <w:tcPr>
+            <w:tcW w:type="dxa" w:w="1560"/>
+          </w:tcPr>
+          <w:p>
+            <w:r/>
+            <w:r>
+              <w:rPr>
+                <w:rFonts w:ascii="Calibri" w:hAnsi="Calibri"/>
+                <w:sz w:val="22"/>
+              </w:rPr>
+            </w:r>
+          </w:p>
+        </w:tc>
+      </w:tr>
+      <w:tr>
+        <w:tc>
+          <w:tcPr>
+            <w:tcW w:type="dxa" w:w="1560"/>
+          </w:tcPr>
+          <w:p>
+            <w:r/>
+            <w:r>
+              <w:rPr>
+                <w:rFonts w:ascii="Calibri" w:hAnsi="Calibri"/>
+                <w:sz w:val="22"/>
+              </w:rPr>
+            </w:r>
+            <w:r>
+              <w:rPr>
+                <w:rFonts w:ascii="Calibri" w:hAnsi="Calibri"/>
+                <w:b/>
+                <w:sz w:val="22"/>
+              </w:rPr>
+              <w:t>Year 1 in Bundesliga</w:t>
+            </w:r>
+            <w:r>
+              <w:rPr>
+                <w:rFonts w:ascii="Calibri" w:hAnsi="Calibri"/>
+                <w:sz w:val="22"/>
+              </w:rPr>
+            </w:r>
+          </w:p>
+        </w:tc>
+        <w:tc>
+          <w:tcPr>
+            <w:tcW w:type="dxa" w:w="1560"/>
+          </w:tcPr>
+          <w:p>
+            <w:r/>
+            <w:r>
+              <w:rPr>
+                <w:rFonts w:ascii="Calibri" w:hAnsi="Calibri"/>
+                <w:sz w:val="22"/>
+              </w:rPr>
+              <w:t>That first Bundesliga season (sometimes abbreviated Y1 elsewhere; this memo spells it out).</w:t>
+            </w:r>
+          </w:p>
+        </w:tc>
+        <w:tc>
+          <w:tcPr>
+            <w:tcW w:type="dxa" w:w="1560"/>
+          </w:tcPr>
+          <w:p>
+            <w:r/>
+            <w:r>
+              <w:rPr>
+                <w:rFonts w:ascii="Calibri" w:hAnsi="Calibri"/>
+                <w:sz w:val="22"/>
+              </w:rPr>
+            </w:r>
+          </w:p>
+        </w:tc>
+        <w:tc>
+          <w:tcPr>
+            <w:tcW w:type="dxa" w:w="1560"/>
+          </w:tcPr>
+          <w:p>
+            <w:r/>
+            <w:r>
+              <w:rPr>
+                <w:rFonts w:ascii="Calibri" w:hAnsi="Calibri"/>
+                <w:sz w:val="22"/>
+              </w:rPr>
+            </w:r>
+          </w:p>
+        </w:tc>
+        <w:tc>
+          <w:tcPr>
+            <w:tcW w:type="dxa" w:w="1560"/>
+          </w:tcPr>
+          <w:p>
+            <w:r/>
+            <w:r>
+              <w:rPr>
+                <w:rFonts w:ascii="Calibri" w:hAnsi="Calibri"/>
+                <w:sz w:val="22"/>
+              </w:rPr>
+            </w:r>
+          </w:p>
+        </w:tc>
+        <w:tc>
+          <w:tcPr>
+            <w:tcW w:type="dxa" w:w="1560"/>
+          </w:tcPr>
+          <w:p>
+            <w:r/>
+            <w:r>
+              <w:rPr>
+                <w:rFonts w:ascii="Calibri" w:hAnsi="Calibri"/>
+                <w:sz w:val="22"/>
+              </w:rPr>
+            </w:r>
+          </w:p>
+        </w:tc>
+      </w:tr>
+      <w:tr>
+        <w:tc>
+          <w:tcPr>
+            <w:tcW w:type="dxa" w:w="1560"/>
+          </w:tcPr>
+          <w:p>
+            <w:r/>
+            <w:r>
+              <w:rPr>
+                <w:rFonts w:ascii="Calibri" w:hAnsi="Calibri"/>
+                <w:sz w:val="22"/>
+              </w:rPr>
+            </w:r>
+            <w:r>
+              <w:rPr>
+                <w:rFonts w:ascii="Calibri" w:hAnsi="Calibri"/>
+                <w:b/>
+                <w:sz w:val="22"/>
+              </w:rPr>
+              <w:t>Feeder / source league</w:t>
+            </w:r>
+            <w:r>
+              <w:rPr>
+                <w:rFonts w:ascii="Calibri" w:hAnsi="Calibri"/>
+                <w:sz w:val="22"/>
+              </w:rPr>
+            </w:r>
+          </w:p>
+        </w:tc>
+        <w:tc>
+          <w:tcPr>
+            <w:tcW w:type="dxa" w:w="1560"/>
+          </w:tcPr>
+          <w:p>
+            <w:r/>
+            <w:r>
+              <w:rPr>
+                <w:rFonts w:ascii="Calibri" w:hAnsi="Calibri"/>
+                <w:sz w:val="22"/>
+              </w:rPr>
+              <w:t>The prior competition the player came from (e.g. Ligue 1, Championship, 2. Bundesliga).</w:t>
+            </w:r>
+          </w:p>
+        </w:tc>
+        <w:tc>
+          <w:tcPr>
+            <w:tcW w:type="dxa" w:w="1560"/>
+          </w:tcPr>
+          <w:p>
+            <w:r/>
+            <w:r>
+              <w:rPr>
+                <w:rFonts w:ascii="Calibri" w:hAnsi="Calibri"/>
+                <w:sz w:val="22"/>
+              </w:rPr>
+            </w:r>
+          </w:p>
+        </w:tc>
+        <w:tc>
+          <w:tcPr>
+            <w:tcW w:type="dxa" w:w="1560"/>
+          </w:tcPr>
+          <w:p>
+            <w:r/>
+            <w:r>
+              <w:rPr>
+                <w:rFonts w:ascii="Calibri" w:hAnsi="Calibri"/>
+                <w:sz w:val="22"/>
+              </w:rPr>
+            </w:r>
+          </w:p>
+        </w:tc>
+        <w:tc>
+          <w:tcPr>
+            <w:tcW w:type="dxa" w:w="1560"/>
+          </w:tcPr>
+          <w:p>
+            <w:r/>
+            <w:r>
+              <w:rPr>
+                <w:rFonts w:ascii="Calibri" w:hAnsi="Calibri"/>
+                <w:sz w:val="22"/>
+              </w:rPr>
+            </w:r>
+          </w:p>
+        </w:tc>
+        <w:tc>
+          <w:tcPr>
+            <w:tcW w:type="dxa" w:w="1560"/>
+          </w:tcPr>
+          <w:p>
+            <w:r/>
+            <w:r>
+              <w:rPr>
+                <w:rFonts w:ascii="Calibri" w:hAnsi="Calibri"/>
+                <w:sz w:val="22"/>
+              </w:rPr>
+            </w:r>
+          </w:p>
+        </w:tc>
+      </w:tr>
+      <w:tr>
+        <w:tc>
+          <w:tcPr>
+            <w:tcW w:type="dxa" w:w="1560"/>
+          </w:tcPr>
+          <w:p>
+            <w:r/>
+            <w:r>
+              <w:rPr>
+                <w:rFonts w:ascii="Calibri" w:hAnsi="Calibri"/>
+                <w:sz w:val="22"/>
+              </w:rPr>
+            </w:r>
+            <w:r>
+              <w:rPr>
+                <w:rFonts w:ascii="Calibri" w:hAnsi="Calibri"/>
+                <w:b/>
+                <w:sz w:val="22"/>
+              </w:rPr>
+              <w:t>Per-90 / rate metric</w:t>
+            </w:r>
+            <w:r>
+              <w:rPr>
+                <w:rFonts w:ascii="Calibri" w:hAnsi="Calibri"/>
+                <w:sz w:val="22"/>
+              </w:rPr>
+            </w:r>
+          </w:p>
+        </w:tc>
+        <w:tc>
+          <w:tcPr>
+            <w:tcW w:type="dxa" w:w="1560"/>
+          </w:tcPr>
+          <w:p>
+            <w:r/>
+            <w:r>
+              <w:rPr>
+                <w:rFonts w:ascii="Calibri" w:hAnsi="Calibri"/>
+                <w:sz w:val="22"/>
+              </w:rPr>
+              <w:t>A counting or rate statistic scaled to 90 minutes played (volume and intensity comparable across minutes totals).</w:t>
+            </w:r>
+          </w:p>
+        </w:tc>
+        <w:tc>
+          <w:tcPr>
+            <w:tcW w:type="dxa" w:w="1560"/>
+          </w:tcPr>
+          <w:p>
+            <w:r/>
+            <w:r>
+              <w:rPr>
+                <w:rFonts w:ascii="Calibri" w:hAnsi="Calibri"/>
+                <w:sz w:val="22"/>
+              </w:rPr>
+            </w:r>
+          </w:p>
+        </w:tc>
+        <w:tc>
+          <w:tcPr>
+            <w:tcW w:type="dxa" w:w="1560"/>
+          </w:tcPr>
+          <w:p>
+            <w:r/>
+            <w:r>
+              <w:rPr>
+                <w:rFonts w:ascii="Calibri" w:hAnsi="Calibri"/>
+                <w:sz w:val="22"/>
+              </w:rPr>
+            </w:r>
+          </w:p>
+        </w:tc>
+        <w:tc>
+          <w:tcPr>
+            <w:tcW w:type="dxa" w:w="1560"/>
+          </w:tcPr>
+          <w:p>
+            <w:r/>
+            <w:r>
+              <w:rPr>
+                <w:rFonts w:ascii="Calibri" w:hAnsi="Calibri"/>
+                <w:sz w:val="22"/>
+              </w:rPr>
+            </w:r>
+          </w:p>
+        </w:tc>
+        <w:tc>
+          <w:tcPr>
+            <w:tcW w:type="dxa" w:w="1560"/>
+          </w:tcPr>
+          <w:p>
+            <w:r/>
+            <w:r>
+              <w:rPr>
+                <w:rFonts w:ascii="Calibri" w:hAnsi="Calibri"/>
+                <w:sz w:val="22"/>
+              </w:rPr>
+            </w:r>
+          </w:p>
+        </w:tc>
+      </w:tr>
+      <w:tr>
+        <w:tc>
+          <w:tcPr>
+            <w:tcW w:type="dxa" w:w="1560"/>
+          </w:tcPr>
+          <w:p>
+            <w:r/>
+            <w:r>
+              <w:rPr>
+                <w:rFonts w:ascii="Calibri" w:hAnsi="Calibri"/>
+                <w:sz w:val="22"/>
+              </w:rPr>
+            </w:r>
+            <w:r>
+              <w:rPr>
+                <w:rFonts w:ascii="Calibri" w:hAnsi="Calibri"/>
+                <w:b/>
+                <w:sz w:val="22"/>
+              </w:rPr>
+              <w:t>Football Reference (FBref)</w:t>
+            </w:r>
+            <w:r>
+              <w:rPr>
+                <w:rFonts w:ascii="Calibri" w:hAnsi="Calibri"/>
+                <w:sz w:val="22"/>
+              </w:rPr>
+            </w:r>
+          </w:p>
+        </w:tc>
+        <w:tc>
+          <w:tcPr>
+            <w:tcW w:type="dxa" w:w="1560"/>
+          </w:tcPr>
+          <w:p>
+            <w:r/>
+            <w:r>
+              <w:rPr>
+                <w:rFonts w:ascii="Calibri" w:hAnsi="Calibri"/>
+                <w:sz w:val="22"/>
+              </w:rPr>
+              <w:t xml:space="preserve">Sports Reference’s public soccer tables — the </w:t>
+            </w:r>
+            <w:r>
+              <w:rPr>
+                <w:rFonts w:ascii="Calibri" w:hAnsi="Calibri"/>
+                <w:b/>
+                <w:sz w:val="22"/>
+              </w:rPr>
+              <w:t>scale</w:t>
+            </w:r>
+            <w:r>
+              <w:rPr>
+                <w:rFonts w:ascii="Calibri" w:hAnsi="Calibri"/>
+                <w:sz w:val="22"/>
+              </w:rPr>
+              <w:t xml:space="preserve"> layer (many leagues, season stats).</w:t>
+            </w:r>
+          </w:p>
+        </w:tc>
+        <w:tc>
+          <w:tcPr>
+            <w:tcW w:type="dxa" w:w="1560"/>
+          </w:tcPr>
+          <w:p>
+            <w:r/>
+            <w:r>
+              <w:rPr>
+                <w:rFonts w:ascii="Calibri" w:hAnsi="Calibri"/>
+                <w:sz w:val="22"/>
+              </w:rPr>
+            </w:r>
+          </w:p>
+        </w:tc>
+        <w:tc>
+          <w:tcPr>
+            <w:tcW w:type="dxa" w:w="1560"/>
+          </w:tcPr>
+          <w:p>
+            <w:r/>
+            <w:r>
+              <w:rPr>
+                <w:rFonts w:ascii="Calibri" w:hAnsi="Calibri"/>
+                <w:sz w:val="22"/>
+              </w:rPr>
+            </w:r>
+          </w:p>
+        </w:tc>
+        <w:tc>
+          <w:tcPr>
+            <w:tcW w:type="dxa" w:w="1560"/>
+          </w:tcPr>
+          <w:p>
+            <w:r/>
+            <w:r>
+              <w:rPr>
+                <w:rFonts w:ascii="Calibri" w:hAnsi="Calibri"/>
+                <w:sz w:val="22"/>
+              </w:rPr>
+            </w:r>
+          </w:p>
+        </w:tc>
+        <w:tc>
+          <w:tcPr>
+            <w:tcW w:type="dxa" w:w="1560"/>
+          </w:tcPr>
+          <w:p>
+            <w:r/>
+            <w:r>
+              <w:rPr>
+                <w:rFonts w:ascii="Calibri" w:hAnsi="Calibri"/>
+                <w:sz w:val="22"/>
+              </w:rPr>
+            </w:r>
+          </w:p>
+        </w:tc>
+      </w:tr>
+      <w:tr>
+        <w:tc>
+          <w:tcPr>
+            <w:tcW w:type="dxa" w:w="1560"/>
+          </w:tcPr>
+          <w:p>
+            <w:r/>
+            <w:r>
+              <w:rPr>
+                <w:rFonts w:ascii="Calibri" w:hAnsi="Calibri"/>
+                <w:sz w:val="22"/>
+              </w:rPr>
+            </w:r>
+            <w:r>
+              <w:rPr>
+                <w:rFonts w:ascii="Calibri" w:hAnsi="Calibri"/>
+                <w:b/>
+                <w:sz w:val="22"/>
+              </w:rPr>
+              <w:t>StatsBomb Open Data</w:t>
+            </w:r>
+            <w:r>
+              <w:rPr>
+                <w:rFonts w:ascii="Calibri" w:hAnsi="Calibri"/>
+                <w:sz w:val="22"/>
+              </w:rPr>
+            </w:r>
+          </w:p>
+        </w:tc>
+        <w:tc>
+          <w:tcPr>
+            <w:tcW w:type="dxa" w:w="1560"/>
+          </w:tcPr>
+          <w:p>
+            <w:r/>
+            <w:r>
+              <w:rPr>
+                <w:rFonts w:ascii="Calibri" w:hAnsi="Calibri"/>
+                <w:sz w:val="22"/>
+              </w:rPr>
+              <w:t xml:space="preserve">Free event-level match data — the </w:t>
+            </w:r>
+            <w:r>
+              <w:rPr>
+                <w:rFonts w:ascii="Calibri" w:hAnsi="Calibri"/>
+                <w:b/>
+                <w:sz w:val="22"/>
+              </w:rPr>
+              <w:t>deep</w:t>
+            </w:r>
+            <w:r>
+              <w:rPr>
+                <w:rFonts w:ascii="Calibri" w:hAnsi="Calibri"/>
+                <w:sz w:val="22"/>
+              </w:rPr>
+              <w:t xml:space="preserve"> layer (fewer clean Bundesliga seasons, richer event metrics).</w:t>
+            </w:r>
+          </w:p>
+        </w:tc>
+        <w:tc>
+          <w:tcPr>
+            <w:tcW w:type="dxa" w:w="1560"/>
+          </w:tcPr>
+          <w:p>
+            <w:r/>
+            <w:r>
+              <w:rPr>
+                <w:rFonts w:ascii="Calibri" w:hAnsi="Calibri"/>
+                <w:sz w:val="22"/>
+              </w:rPr>
+            </w:r>
+          </w:p>
+        </w:tc>
+        <w:tc>
+          <w:tcPr>
+            <w:tcW w:type="dxa" w:w="1560"/>
+          </w:tcPr>
+          <w:p>
+            <w:r/>
+            <w:r>
+              <w:rPr>
+                <w:rFonts w:ascii="Calibri" w:hAnsi="Calibri"/>
+                <w:sz w:val="22"/>
+              </w:rPr>
+            </w:r>
+          </w:p>
+        </w:tc>
+        <w:tc>
+          <w:tcPr>
+            <w:tcW w:type="dxa" w:w="1560"/>
+          </w:tcPr>
+          <w:p>
+            <w:r/>
+            <w:r>
+              <w:rPr>
+                <w:rFonts w:ascii="Calibri" w:hAnsi="Calibri"/>
+                <w:sz w:val="22"/>
+              </w:rPr>
+            </w:r>
+          </w:p>
+        </w:tc>
+        <w:tc>
+          <w:tcPr>
+            <w:tcW w:type="dxa" w:w="1560"/>
+          </w:tcPr>
+          <w:p>
+            <w:r/>
+            <w:r>
+              <w:rPr>
+                <w:rFonts w:ascii="Calibri" w:hAnsi="Calibri"/>
+                <w:sz w:val="22"/>
+              </w:rPr>
+            </w:r>
+          </w:p>
+        </w:tc>
+      </w:tr>
+      <w:tr>
+        <w:tc>
+          <w:tcPr>
+            <w:tcW w:type="dxa" w:w="1560"/>
+          </w:tcPr>
+          <w:p>
+            <w:r/>
+            <w:r>
+              <w:rPr>
+                <w:rFonts w:ascii="Calibri" w:hAnsi="Calibri"/>
+                <w:sz w:val="22"/>
+              </w:rPr>
+            </w:r>
+            <w:r>
+              <w:rPr>
+                <w:rFonts w:ascii="Calibri" w:hAnsi="Calibri"/>
+                <w:b/>
+                <w:sz w:val="22"/>
+              </w:rPr>
+              <w:t>Stability (Pearson r)</w:t>
+            </w:r>
+            <w:r>
+              <w:rPr>
+                <w:rFonts w:ascii="Calibri" w:hAnsi="Calibri"/>
+                <w:sz w:val="22"/>
+              </w:rPr>
+            </w:r>
+          </w:p>
+        </w:tc>
+        <w:tc>
+          <w:tcPr>
+            <w:tcW w:type="dxa" w:w="1560"/>
+          </w:tcPr>
+          <w:p>
+            <w:r/>
+            <w:r>
+              <w:rPr>
+                <w:rFonts w:ascii="Calibri" w:hAnsi="Calibri"/>
+                <w:sz w:val="22"/>
+              </w:rPr>
+              <w:t xml:space="preserve">Correlation of the </w:t>
+            </w:r>
+            <w:r>
+              <w:rPr>
+                <w:rFonts w:ascii="Calibri" w:hAnsi="Calibri"/>
+                <w:b/>
+                <w:sz w:val="22"/>
+              </w:rPr>
+              <w:t>same</w:t>
+            </w:r>
+            <w:r>
+              <w:rPr>
+                <w:rFonts w:ascii="Calibri" w:hAnsi="Calibri"/>
+                <w:sz w:val="22"/>
+              </w:rPr>
+              <w:t xml:space="preserve"> per-90 metric: prior season ↔ Year 1 in Bundesliga. High *r* ⇒ the trait travels.</w:t>
+            </w:r>
+          </w:p>
+        </w:tc>
+        <w:tc>
+          <w:tcPr>
+            <w:tcW w:type="dxa" w:w="1560"/>
+          </w:tcPr>
+          <w:p>
+            <w:r/>
+            <w:r>
+              <w:rPr>
+                <w:rFonts w:ascii="Calibri" w:hAnsi="Calibri"/>
+                <w:sz w:val="22"/>
+              </w:rPr>
+            </w:r>
+          </w:p>
+        </w:tc>
+        <w:tc>
+          <w:tcPr>
+            <w:tcW w:type="dxa" w:w="1560"/>
+          </w:tcPr>
+          <w:p>
+            <w:r/>
+            <w:r>
+              <w:rPr>
+                <w:rFonts w:ascii="Calibri" w:hAnsi="Calibri"/>
+                <w:sz w:val="22"/>
+              </w:rPr>
+            </w:r>
+          </w:p>
+        </w:tc>
+        <w:tc>
+          <w:tcPr>
+            <w:tcW w:type="dxa" w:w="1560"/>
+          </w:tcPr>
+          <w:p>
+            <w:r/>
+            <w:r>
+              <w:rPr>
+                <w:rFonts w:ascii="Calibri" w:hAnsi="Calibri"/>
+                <w:sz w:val="22"/>
+              </w:rPr>
+            </w:r>
+          </w:p>
+        </w:tc>
+        <w:tc>
+          <w:tcPr>
+            <w:tcW w:type="dxa" w:w="1560"/>
+          </w:tcPr>
+          <w:p>
+            <w:r/>
+            <w:r>
+              <w:rPr>
+                <w:rFonts w:ascii="Calibri" w:hAnsi="Calibri"/>
+                <w:sz w:val="22"/>
+              </w:rPr>
+            </w:r>
+          </w:p>
+        </w:tc>
+      </w:tr>
+      <w:tr>
+        <w:tc>
+          <w:tcPr>
+            <w:tcW w:type="dxa" w:w="1560"/>
+          </w:tcPr>
+          <w:p>
+            <w:r/>
+            <w:r>
+              <w:rPr>
+                <w:rFonts w:ascii="Calibri" w:hAnsi="Calibri"/>
+                <w:sz w:val="22"/>
+              </w:rPr>
+            </w:r>
+            <w:r>
+              <w:rPr>
+                <w:rFonts w:ascii="Calibri" w:hAnsi="Calibri"/>
+                <w:b/>
+                <w:sz w:val="22"/>
+              </w:rPr>
+              <w:t>Redundancy (Pearson \</w:t>
+            </w:r>
+          </w:p>
+        </w:tc>
+        <w:tc>
+          <w:tcPr>
+            <w:tcW w:type="dxa" w:w="1560"/>
+          </w:tcPr>
+          <w:p>
+            <w:r/>
+            <w:r>
+              <w:rPr>
+                <w:rFonts w:ascii="Calibri" w:hAnsi="Calibri"/>
+                <w:sz w:val="22"/>
+              </w:rPr>
+              <w:t>r\</w:t>
+            </w:r>
+          </w:p>
+        </w:tc>
+        <w:tc>
+          <w:tcPr>
+            <w:tcW w:type="dxa" w:w="1560"/>
+          </w:tcPr>
+          <w:p>
+            <w:r/>
+            <w:r>
+              <w:rPr>
+                <w:rFonts w:ascii="Calibri" w:hAnsi="Calibri"/>
+                <w:sz w:val="22"/>
+              </w:rPr>
+              <w:t>)</w:t>
+            </w:r>
+            <w:r>
+              <w:rPr>
+                <w:rFonts w:ascii="Calibri" w:hAnsi="Calibri"/>
+                <w:b/>
+                <w:sz w:val="22"/>
+              </w:rPr>
+            </w:r>
+          </w:p>
+        </w:tc>
+        <w:tc>
+          <w:tcPr>
+            <w:tcW w:type="dxa" w:w="1560"/>
+          </w:tcPr>
+          <w:p>
+            <w:r/>
+            <w:r>
+              <w:rPr>
+                <w:rFonts w:ascii="Calibri" w:hAnsi="Calibri"/>
+                <w:sz w:val="22"/>
+              </w:rPr>
+              <w:t xml:space="preserve">Correlation </w:t>
+            </w:r>
+            <w:r>
+              <w:rPr>
+                <w:rFonts w:ascii="Calibri" w:hAnsi="Calibri"/>
+                <w:b/>
+                <w:sz w:val="22"/>
+              </w:rPr>
+              <w:t>between two different</w:t>
+            </w:r>
+            <w:r>
+              <w:rPr>
+                <w:rFonts w:ascii="Calibri" w:hAnsi="Calibri"/>
+                <w:sz w:val="22"/>
+              </w:rPr>
+              <w:t xml:space="preserve"> metrics in the same season. Very high \</w:t>
+            </w:r>
+          </w:p>
+        </w:tc>
+        <w:tc>
+          <w:tcPr>
+            <w:tcW w:type="dxa" w:w="1560"/>
+          </w:tcPr>
+          <w:p>
+            <w:r/>
+            <w:r>
+              <w:rPr>
+                <w:rFonts w:ascii="Calibri" w:hAnsi="Calibri"/>
+                <w:sz w:val="22"/>
+              </w:rPr>
+              <w:t>r\</w:t>
+            </w:r>
+          </w:p>
+        </w:tc>
+        <w:tc>
+          <w:tcPr>
+            <w:tcW w:type="dxa" w:w="1560"/>
+          </w:tcPr>
+          <w:p>
+            <w:r/>
+            <w:r>
+              <w:rPr>
+                <w:rFonts w:ascii="Calibri" w:hAnsi="Calibri"/>
+                <w:sz w:val="22"/>
+              </w:rPr>
+              <w:t>⇒ near-duplicates; keep one.</w:t>
+            </w:r>
+          </w:p>
+        </w:tc>
+      </w:tr>
+      <w:tr>
+        <w:tc>
+          <w:tcPr>
+            <w:tcW w:type="dxa" w:w="1560"/>
+          </w:tcPr>
+          <w:p>
+            <w:r/>
+            <w:r>
+              <w:rPr>
+                <w:rFonts w:ascii="Calibri" w:hAnsi="Calibri"/>
+                <w:sz w:val="22"/>
+              </w:rPr>
+            </w:r>
+            <w:r>
+              <w:rPr>
+                <w:rFonts w:ascii="Calibri" w:hAnsi="Calibri"/>
+                <w:b/>
+                <w:sz w:val="22"/>
+              </w:rPr>
+              <w:t>Pizza / radar profile</w:t>
+            </w:r>
+            <w:r>
+              <w:rPr>
+                <w:rFonts w:ascii="Calibri" w:hAnsi="Calibri"/>
+                <w:sz w:val="22"/>
+              </w:rPr>
+            </w:r>
+          </w:p>
+        </w:tc>
+        <w:tc>
+          <w:tcPr>
+            <w:tcW w:type="dxa" w:w="1560"/>
+          </w:tcPr>
+          <w:p>
+            <w:r/>
+            <w:r>
+              <w:rPr>
+                <w:rFonts w:ascii="Calibri" w:hAnsi="Calibri"/>
+                <w:sz w:val="22"/>
+              </w:rPr>
+              <w:t>Category chart of the shortlisted traits (prior vs Year 1 in Bundesliga percentiles vs peers).</w:t>
+            </w:r>
+          </w:p>
+        </w:tc>
+        <w:tc>
+          <w:tcPr>
+            <w:tcW w:type="dxa" w:w="1560"/>
+          </w:tcPr>
+          <w:p>
+            <w:r/>
+            <w:r>
+              <w:rPr>
+                <w:rFonts w:ascii="Calibri" w:hAnsi="Calibri"/>
+                <w:sz w:val="22"/>
+              </w:rPr>
+            </w:r>
+          </w:p>
+        </w:tc>
+        <w:tc>
+          <w:tcPr>
+            <w:tcW w:type="dxa" w:w="1560"/>
+          </w:tcPr>
+          <w:p>
+            <w:r/>
+            <w:r>
+              <w:rPr>
+                <w:rFonts w:ascii="Calibri" w:hAnsi="Calibri"/>
+                <w:sz w:val="22"/>
+              </w:rPr>
+            </w:r>
+          </w:p>
+        </w:tc>
+        <w:tc>
+          <w:tcPr>
+            <w:tcW w:type="dxa" w:w="1560"/>
+          </w:tcPr>
+          <w:p>
+            <w:r/>
+            <w:r>
+              <w:rPr>
+                <w:rFonts w:ascii="Calibri" w:hAnsi="Calibri"/>
+                <w:sz w:val="22"/>
+              </w:rPr>
+            </w:r>
+          </w:p>
+        </w:tc>
+        <w:tc>
+          <w:tcPr>
+            <w:tcW w:type="dxa" w:w="1560"/>
+          </w:tcPr>
+          <w:p>
+            <w:r/>
+            <w:r>
+              <w:rPr>
+                <w:rFonts w:ascii="Calibri" w:hAnsi="Calibri"/>
+                <w:sz w:val="22"/>
+              </w:rPr>
+            </w:r>
+          </w:p>
+        </w:tc>
+      </w:tr>
+      <w:tr>
+        <w:tc>
+          <w:tcPr>
+            <w:tcW w:type="dxa" w:w="1560"/>
+          </w:tcPr>
+          <w:p>
+            <w:r/>
+            <w:r>
+              <w:rPr>
+                <w:rFonts w:ascii="Calibri" w:hAnsi="Calibri"/>
+                <w:sz w:val="22"/>
+              </w:rPr>
+            </w:r>
+            <w:r>
+              <w:rPr>
+                <w:rFonts w:ascii="Calibri" w:hAnsi="Calibri"/>
+                <w:b/>
+                <w:sz w:val="22"/>
+              </w:rPr>
+              <w:t>Success (Phase 2)</w:t>
+            </w:r>
+            <w:r>
+              <w:rPr>
+                <w:rFonts w:ascii="Calibri" w:hAnsi="Calibri"/>
+                <w:sz w:val="22"/>
+              </w:rPr>
+            </w:r>
+          </w:p>
+        </w:tc>
+        <w:tc>
+          <w:tcPr>
+            <w:tcW w:type="dxa" w:w="1560"/>
+          </w:tcPr>
+          <w:p>
+            <w:r/>
+            <w:r>
+              <w:rPr>
+                <w:rFonts w:ascii="Calibri" w:hAnsi="Calibri"/>
+                <w:sz w:val="22"/>
+              </w:rPr>
+            </w:r>
+            <w:r>
+              <w:rPr>
+                <w:rFonts w:ascii="Calibri" w:hAnsi="Calibri"/>
+                <w:b/>
+                <w:sz w:val="22"/>
+              </w:rPr>
+              <w:t>Year 1 in Bundesliga minutes</w:t>
+            </w:r>
+            <w:r>
+              <w:rPr>
+                <w:rFonts w:ascii="Calibri" w:hAnsi="Calibri"/>
+                <w:sz w:val="22"/>
+              </w:rPr>
+              <w:t xml:space="preserve"> (playing-time opportunity). Preferred club outcome would be Δ Transfermarkt market value; we do not scrape Transfermarkt (terms of service), so minutes are the open-data proxy.</w:t>
+            </w:r>
+          </w:p>
+        </w:tc>
+        <w:tc>
+          <w:tcPr>
+            <w:tcW w:type="dxa" w:w="1560"/>
+          </w:tcPr>
+          <w:p>
+            <w:r/>
+            <w:r>
+              <w:rPr>
+                <w:rFonts w:ascii="Calibri" w:hAnsi="Calibri"/>
+                <w:sz w:val="22"/>
+              </w:rPr>
+            </w:r>
+          </w:p>
+        </w:tc>
+        <w:tc>
+          <w:tcPr>
+            <w:tcW w:type="dxa" w:w="1560"/>
+          </w:tcPr>
+          <w:p>
+            <w:r/>
+            <w:r>
+              <w:rPr>
+                <w:rFonts w:ascii="Calibri" w:hAnsi="Calibri"/>
+                <w:sz w:val="22"/>
+              </w:rPr>
+            </w:r>
+          </w:p>
+        </w:tc>
+        <w:tc>
+          <w:tcPr>
+            <w:tcW w:type="dxa" w:w="1560"/>
+          </w:tcPr>
+          <w:p>
+            <w:r/>
+            <w:r>
+              <w:rPr>
+                <w:rFonts w:ascii="Calibri" w:hAnsi="Calibri"/>
+                <w:sz w:val="22"/>
+              </w:rPr>
+            </w:r>
+          </w:p>
+        </w:tc>
+        <w:tc>
+          <w:tcPr>
+            <w:tcW w:type="dxa" w:w="1560"/>
+          </w:tcPr>
+          <w:p>
+            <w:r/>
+            <w:r>
+              <w:rPr>
+                <w:rFonts w:ascii="Calibri" w:hAnsi="Calibri"/>
+                <w:sz w:val="22"/>
+              </w:rPr>
+            </w:r>
+          </w:p>
+        </w:tc>
+      </w:tr>
+      <w:tr>
+        <w:tc>
+          <w:tcPr>
+            <w:tcW w:type="dxa" w:w="1560"/>
+          </w:tcPr>
+          <w:p>
+            <w:r/>
+            <w:r>
+              <w:rPr>
+                <w:rFonts w:ascii="Calibri" w:hAnsi="Calibri"/>
+                <w:sz w:val="22"/>
+              </w:rPr>
+            </w:r>
+            <w:r>
+              <w:rPr>
+                <w:rFonts w:ascii="Calibri" w:hAnsi="Calibri"/>
+                <w:b/>
+                <w:sz w:val="22"/>
+              </w:rPr>
+              <w:t>Spearman ρ</w:t>
+            </w:r>
+            <w:r>
+              <w:rPr>
+                <w:rFonts w:ascii="Calibri" w:hAnsi="Calibri"/>
+                <w:sz w:val="22"/>
+              </w:rPr>
+            </w:r>
+          </w:p>
+        </w:tc>
+        <w:tc>
+          <w:tcPr>
+            <w:tcW w:type="dxa" w:w="1560"/>
+          </w:tcPr>
+          <w:p>
+            <w:r/>
+            <w:r>
+              <w:rPr>
+                <w:rFonts w:ascii="Calibri" w:hAnsi="Calibri"/>
+                <w:sz w:val="22"/>
+              </w:rPr>
+              <w:t>Rank correlation used in Phase 2 (prior trait percentile ↔ Year 1 minutes). Robust when minutes are skewed.</w:t>
+            </w:r>
+          </w:p>
+        </w:tc>
+        <w:tc>
+          <w:tcPr>
+            <w:tcW w:type="dxa" w:w="1560"/>
+          </w:tcPr>
+          <w:p>
+            <w:r/>
+            <w:r>
+              <w:rPr>
+                <w:rFonts w:ascii="Calibri" w:hAnsi="Calibri"/>
+                <w:sz w:val="22"/>
+              </w:rPr>
+            </w:r>
+          </w:p>
+        </w:tc>
+        <w:tc>
+          <w:tcPr>
+            <w:tcW w:type="dxa" w:w="1560"/>
+          </w:tcPr>
+          <w:p>
+            <w:r/>
+            <w:r>
+              <w:rPr>
+                <w:rFonts w:ascii="Calibri" w:hAnsi="Calibri"/>
+                <w:sz w:val="22"/>
+              </w:rPr>
+            </w:r>
+          </w:p>
+        </w:tc>
+        <w:tc>
+          <w:tcPr>
+            <w:tcW w:type="dxa" w:w="1560"/>
+          </w:tcPr>
+          <w:p>
+            <w:r/>
+            <w:r>
+              <w:rPr>
+                <w:rFonts w:ascii="Calibri" w:hAnsi="Calibri"/>
+                <w:sz w:val="22"/>
+              </w:rPr>
+            </w:r>
+          </w:p>
+        </w:tc>
+        <w:tc>
+          <w:tcPr>
+            <w:tcW w:type="dxa" w:w="1560"/>
+          </w:tcPr>
+          <w:p>
+            <w:r/>
+            <w:r>
+              <w:rPr>
+                <w:rFonts w:ascii="Calibri" w:hAnsi="Calibri"/>
+                <w:sz w:val="22"/>
+              </w:rPr>
+            </w:r>
+          </w:p>
+        </w:tc>
+      </w:tr>
+      <w:tr>
+        <w:tc>
+          <w:tcPr>
+            <w:tcW w:type="dxa" w:w="1560"/>
+          </w:tcPr>
+          <w:p>
+            <w:r/>
+            <w:r>
+              <w:rPr>
+                <w:rFonts w:ascii="Calibri" w:hAnsi="Calibri"/>
+                <w:sz w:val="22"/>
+              </w:rPr>
+            </w:r>
+            <w:r>
+              <w:rPr>
+                <w:rFonts w:ascii="Calibri" w:hAnsi="Calibri"/>
+                <w:b/>
+                <w:sz w:val="22"/>
+              </w:rPr>
+              <w:t>Analysis-ready pair</w:t>
+            </w:r>
+            <w:r>
+              <w:rPr>
+                <w:rFonts w:ascii="Calibri" w:hAnsi="Calibri"/>
+                <w:sz w:val="22"/>
+              </w:rPr>
+            </w:r>
+          </w:p>
+        </w:tc>
+        <w:tc>
+          <w:tcPr>
+            <w:tcW w:type="dxa" w:w="1560"/>
+          </w:tcPr>
+          <w:p>
+            <w:r/>
+            <w:r>
+              <w:rPr>
+                <w:rFonts w:ascii="Calibri" w:hAnsi="Calibri"/>
+                <w:sz w:val="22"/>
+              </w:rPr>
+              <w:t xml:space="preserve">One player with usable prior + Year 1 seasons that clear the </w:t>
+            </w:r>
+            <w:r>
+              <w:rPr>
+                <w:rFonts w:ascii="Calibri" w:hAnsi="Calibri"/>
+                <w:b/>
+                <w:sz w:val="22"/>
+              </w:rPr>
+              <w:t>minutes floors</w:t>
+            </w:r>
+            <w:r>
+              <w:rPr>
+                <w:rFonts w:ascii="Calibri" w:hAnsi="Calibri"/>
+                <w:sz w:val="22"/>
+              </w:rPr>
+              <w:t xml:space="preserve"> below — not every Bundesliga appearance.</w:t>
+            </w:r>
+          </w:p>
+        </w:tc>
+        <w:tc>
+          <w:tcPr>
+            <w:tcW w:type="dxa" w:w="1560"/>
+          </w:tcPr>
+          <w:p>
+            <w:r/>
+            <w:r>
+              <w:rPr>
+                <w:rFonts w:ascii="Calibri" w:hAnsi="Calibri"/>
+                <w:sz w:val="22"/>
+              </w:rPr>
+            </w:r>
+          </w:p>
+        </w:tc>
+        <w:tc>
+          <w:tcPr>
+            <w:tcW w:type="dxa" w:w="1560"/>
+          </w:tcPr>
+          <w:p>
+            <w:r/>
+            <w:r>
+              <w:rPr>
+                <w:rFonts w:ascii="Calibri" w:hAnsi="Calibri"/>
+                <w:sz w:val="22"/>
+              </w:rPr>
+            </w:r>
+          </w:p>
+        </w:tc>
+        <w:tc>
+          <w:tcPr>
+            <w:tcW w:type="dxa" w:w="1560"/>
+          </w:tcPr>
+          <w:p>
+            <w:r/>
+            <w:r>
+              <w:rPr>
+                <w:rFonts w:ascii="Calibri" w:hAnsi="Calibri"/>
+                <w:sz w:val="22"/>
+              </w:rPr>
+            </w:r>
+          </w:p>
+        </w:tc>
+        <w:tc>
+          <w:tcPr>
+            <w:tcW w:type="dxa" w:w="1560"/>
+          </w:tcPr>
+          <w:p>
+            <w:r/>
+            <w:r>
+              <w:rPr>
+                <w:rFonts w:ascii="Calibri" w:hAnsi="Calibri"/>
+                <w:sz w:val="22"/>
+              </w:rPr>
+            </w:r>
+          </w:p>
+        </w:tc>
+      </w:tr>
+    </w:tbl>
+    <w:p/>
+    <w:p>
+      <w:r>
+        <w:rPr>
+          <w:rFonts w:ascii="Calibri" w:hAnsi="Calibri"/>
+          <w:sz w:val="22"/>
+        </w:rPr>
+        <w:t xml:space="preserve">Inbound status is inferred from </w:t>
+      </w:r>
+      <w:r>
+        <w:rPr>
+          <w:rFonts w:ascii="Calibri" w:hAnsi="Calibri"/>
+          <w:b/>
+          <w:sz w:val="22"/>
+        </w:rPr>
+        <w:t>playing records</w:t>
+      </w:r>
+      <w:r>
+        <w:rPr>
+          <w:rFonts w:ascii="Calibri" w:hAnsi="Calibri"/>
+          <w:sz w:val="22"/>
+        </w:rPr>
+        <w:t xml:space="preserve"> (first Bundesliga season and prior competition ≠ 1. Bundesliga), not from scraped Transfermarkt transfer tables.</w:t>
+      </w:r>
+    </w:p>
+    <w:p/>
+    <w:p>
+      <w:r>
+        <w:rPr>
+          <w:rFonts w:ascii="Calibri" w:hAnsi="Calibri"/>
+          <w:sz w:val="22"/>
+        </w:rPr>
+        <w:t>---</w:t>
+      </w:r>
+    </w:p>
+    <w:p/>
+    <w:p>
+      <w:pPr>
+        <w:pStyle w:val="Heading2"/>
+      </w:pPr>
+      <w:r>
+        <w:t>Two evidence layers</w:t>
+      </w:r>
+    </w:p>
+    <w:p/>
+    <w:tbl>
+      <w:tblPr>
+        <w:tblStyle w:val="TableGrid"/>
+        <w:tblW w:type="auto" w:w="0"/>
+        <w:tblLook w:firstColumn="1" w:firstRow="1" w:lastColumn="0" w:lastRow="0" w:noHBand="0" w:noVBand="1" w:val="04A0"/>
+      </w:tblPr>
+      <w:tblGrid>
+        <w:gridCol w:w="2340"/>
+        <w:gridCol w:w="2340"/>
+        <w:gridCol w:w="2340"/>
+        <w:gridCol w:w="2340"/>
+      </w:tblGrid>
+      <w:tr>
+        <w:tc>
+          <w:tcPr>
+            <w:tcW w:type="dxa" w:w="2340"/>
+          </w:tcPr>
+          <w:p>
+            <w:r>
+              <w:rPr>
+                <w:b/>
+              </w:rPr>
+            </w:r>
+            <w:r>
+              <w:rPr>
+                <w:rFonts w:ascii="Calibri" w:hAnsi="Calibri"/>
+                <w:b/>
+                <w:sz w:val="22"/>
+              </w:rPr>
+              <w:t>Tier</w:t>
+            </w:r>
+          </w:p>
+        </w:tc>
+        <w:tc>
+          <w:tcPr>
+            <w:tcW w:type="dxa" w:w="2340"/>
+          </w:tcPr>
+          <w:p>
+            <w:r>
+              <w:rPr>
+                <w:b/>
+              </w:rPr>
+            </w:r>
+            <w:r>
+              <w:rPr>
+                <w:rFonts w:ascii="Calibri" w:hAnsi="Calibri"/>
+                <w:b/>
+                <w:sz w:val="22"/>
+              </w:rPr>
+              <w:t>Role</w:t>
+            </w:r>
+          </w:p>
+        </w:tc>
+        <w:tc>
+          <w:tcPr>
+            <w:tcW w:type="dxa" w:w="2340"/>
+          </w:tcPr>
+          <w:p>
+            <w:r>
+              <w:rPr>
+                <w:b/>
+              </w:rPr>
+            </w:r>
+            <w:r>
+              <w:rPr>
+                <w:rFonts w:ascii="Calibri" w:hAnsi="Calibri"/>
+                <w:b/>
+                <w:sz w:val="22"/>
+              </w:rPr>
+              <w:t>Data</w:t>
+            </w:r>
+          </w:p>
+        </w:tc>
+        <w:tc>
+          <w:tcPr>
+            <w:tcW w:type="dxa" w:w="2340"/>
+          </w:tcPr>
+          <w:p>
+            <w:r>
+              <w:rPr>
+                <w:b/>
+              </w:rPr>
+            </w:r>
+            <w:r>
+              <w:rPr>
+                <w:rFonts w:ascii="Calibri" w:hAnsi="Calibri"/>
+                <w:b/>
+                <w:sz w:val="22"/>
+              </w:rPr>
+              <w:t>Analysis-ready N</w:t>
+            </w:r>
+          </w:p>
+        </w:tc>
+      </w:tr>
+      <w:tr>
+        <w:tc>
+          <w:tcPr>
+            <w:tcW w:type="dxa" w:w="2340"/>
+          </w:tcPr>
+          <w:p>
+            <w:r/>
+            <w:r>
+              <w:rPr>
+                <w:rFonts w:ascii="Calibri" w:hAnsi="Calibri"/>
+                <w:sz w:val="22"/>
+              </w:rPr>
+            </w:r>
+            <w:r>
+              <w:rPr>
+                <w:rFonts w:ascii="Calibri" w:hAnsi="Calibri"/>
+                <w:b/>
+                <w:sz w:val="22"/>
+              </w:rPr>
+              <w:t>Tier 1 — Wide (FBref)</w:t>
+            </w:r>
+            <w:r>
+              <w:rPr>
+                <w:rFonts w:ascii="Calibri" w:hAnsi="Calibri"/>
+                <w:sz w:val="22"/>
+              </w:rPr>
+            </w:r>
+          </w:p>
+        </w:tc>
+        <w:tc>
+          <w:tcPr>
+            <w:tcW w:type="dxa" w:w="2340"/>
+          </w:tcPr>
+          <w:p>
+            <w:r/>
+            <w:r>
+              <w:rPr>
+                <w:rFonts w:ascii="Calibri" w:hAnsi="Calibri"/>
+                <w:sz w:val="22"/>
+              </w:rPr>
+              <w:t>Same pipeline at scale across many feeders</w:t>
+            </w:r>
+          </w:p>
+        </w:tc>
+        <w:tc>
+          <w:tcPr>
+            <w:tcW w:type="dxa" w:w="2340"/>
+          </w:tcPr>
+          <w:p>
+            <w:r/>
+            <w:r>
+              <w:rPr>
+                <w:rFonts w:ascii="Calibri" w:hAnsi="Calibri"/>
+                <w:sz w:val="22"/>
+              </w:rPr>
+              <w:t xml:space="preserve">Football Reference player-season stats, </w:t>
+            </w:r>
+            <w:r>
+              <w:rPr>
+                <w:rFonts w:ascii="Calibri" w:hAnsi="Calibri"/>
+                <w:b/>
+                <w:sz w:val="22"/>
+              </w:rPr>
+              <w:t>19 leagues</w:t>
+            </w:r>
+            <w:r>
+              <w:rPr>
+                <w:rFonts w:ascii="Calibri" w:hAnsi="Calibri"/>
+                <w:sz w:val="22"/>
+              </w:rPr>
+            </w:r>
+          </w:p>
+        </w:tc>
+        <w:tc>
+          <w:tcPr>
+            <w:tcW w:type="dxa" w:w="2340"/>
+          </w:tcPr>
+          <w:p>
+            <w:r/>
+            <w:r>
+              <w:rPr>
+                <w:rFonts w:ascii="Calibri" w:hAnsi="Calibri"/>
+                <w:sz w:val="22"/>
+              </w:rPr>
+            </w:r>
+            <w:r>
+              <w:rPr>
+                <w:rFonts w:ascii="Calibri" w:hAnsi="Calibri"/>
+                <w:b/>
+                <w:sz w:val="22"/>
+              </w:rPr>
+              <w:t>329</w:t>
+            </w:r>
+            <w:r>
+              <w:rPr>
+                <w:rFonts w:ascii="Calibri" w:hAnsi="Calibri"/>
+                <w:sz w:val="22"/>
+              </w:rPr>
+              <w:t xml:space="preserve"> prior→Year 1 pairs</w:t>
+            </w:r>
+          </w:p>
+        </w:tc>
+      </w:tr>
+      <w:tr>
+        <w:tc>
+          <w:tcPr>
+            <w:tcW w:type="dxa" w:w="2340"/>
+          </w:tcPr>
+          <w:p>
+            <w:r/>
+            <w:r>
+              <w:rPr>
+                <w:rFonts w:ascii="Calibri" w:hAnsi="Calibri"/>
+                <w:sz w:val="22"/>
+              </w:rPr>
+            </w:r>
+            <w:r>
+              <w:rPr>
+                <w:rFonts w:ascii="Calibri" w:hAnsi="Calibri"/>
+                <w:b/>
+                <w:sz w:val="22"/>
+              </w:rPr>
+              <w:t>Tier 2 — Deep (StatsBomb)</w:t>
+            </w:r>
+            <w:r>
+              <w:rPr>
+                <w:rFonts w:ascii="Calibri" w:hAnsi="Calibri"/>
+                <w:sz w:val="22"/>
+              </w:rPr>
+            </w:r>
+          </w:p>
+        </w:tc>
+        <w:tc>
+          <w:tcPr>
+            <w:tcW w:type="dxa" w:w="2340"/>
+          </w:tcPr>
+          <w:p>
+            <w:r/>
+            <w:r>
+              <w:rPr>
+                <w:rFonts w:ascii="Calibri" w:hAnsi="Calibri"/>
+                <w:sz w:val="22"/>
+              </w:rPr>
+              <w:t xml:space="preserve">Event-level check on the </w:t>
+            </w:r>
+            <w:r>
+              <w:rPr>
+                <w:rFonts w:ascii="Calibri" w:hAnsi="Calibri"/>
+                <w:b/>
+                <w:sz w:val="22"/>
+              </w:rPr>
+              <w:t>same inbound logic</w:t>
+            </w:r>
+            <w:r>
+              <w:rPr>
+                <w:rFonts w:ascii="Calibri" w:hAnsi="Calibri"/>
+                <w:sz w:val="22"/>
+              </w:rPr>
+            </w:r>
+          </w:p>
+        </w:tc>
+        <w:tc>
+          <w:tcPr>
+            <w:tcW w:type="dxa" w:w="2340"/>
+          </w:tcPr>
+          <w:p>
+            <w:r/>
+            <w:r>
+              <w:rPr>
+                <w:rFonts w:ascii="Calibri" w:hAnsi="Calibri"/>
+                <w:sz w:val="22"/>
+              </w:rPr>
+              <w:t xml:space="preserve">StatsBomb Open Data, </w:t>
+            </w:r>
+            <w:r>
+              <w:rPr>
+                <w:rFonts w:ascii="Calibri" w:hAnsi="Calibri"/>
+                <w:b/>
+                <w:sz w:val="22"/>
+              </w:rPr>
+              <w:t>17</w:t>
+            </w:r>
+            <w:r>
+              <w:rPr>
+                <w:rFonts w:ascii="Calibri" w:hAnsi="Calibri"/>
+                <w:sz w:val="22"/>
+              </w:rPr>
+              <w:t xml:space="preserve"> competitions as priors</w:t>
+            </w:r>
+          </w:p>
+        </w:tc>
+        <w:tc>
+          <w:tcPr>
+            <w:tcW w:type="dxa" w:w="2340"/>
+          </w:tcPr>
+          <w:p>
+            <w:r/>
+            <w:r>
+              <w:rPr>
+                <w:rFonts w:ascii="Calibri" w:hAnsi="Calibri"/>
+                <w:sz w:val="22"/>
+              </w:rPr>
+            </w:r>
+            <w:r>
+              <w:rPr>
+                <w:rFonts w:ascii="Calibri" w:hAnsi="Calibri"/>
+                <w:b/>
+                <w:sz w:val="22"/>
+              </w:rPr>
+              <w:t>96</w:t>
+            </w:r>
+            <w:r>
+              <w:rPr>
+                <w:rFonts w:ascii="Calibri" w:hAnsi="Calibri"/>
+                <w:sz w:val="22"/>
+              </w:rPr>
+              <w:t xml:space="preserve"> cohort players</w:t>
+            </w:r>
+          </w:p>
+        </w:tc>
+      </w:tr>
+    </w:tbl>
+    <w:p/>
+    <w:p>
+      <w:r>
+        <w:rPr>
+          <w:rFonts w:ascii="Calibri" w:hAnsi="Calibri"/>
+          <w:sz w:val="22"/>
+        </w:rPr>
+        <w:t xml:space="preserve">FBref answers “which rates travel?” and “which feeders look strongest?” at honest multi-league sample size. StatsBomb asks whether </w:t>
+      </w:r>
+      <w:r>
+        <w:rPr>
+          <w:rFonts w:ascii="Calibri" w:hAnsi="Calibri"/>
+          <w:b/>
+          <w:sz w:val="22"/>
+        </w:rPr>
+        <w:t>event-level trait families</w:t>
+      </w:r>
+      <w:r>
+        <w:rPr>
+          <w:rFonts w:ascii="Calibri" w:hAnsi="Calibri"/>
+          <w:sz w:val="22"/>
+        </w:rPr>
+        <w:t xml:space="preserve"> also travel; it is </w:t>
+      </w:r>
+      <w:r>
+        <w:rPr>
+          <w:rFonts w:ascii="Calibri" w:hAnsi="Calibri"/>
+          <w:b/>
+          <w:sz w:val="22"/>
+        </w:rPr>
+        <w:t>not</w:t>
+      </w:r>
+      <w:r>
+        <w:rPr>
+          <w:rFonts w:ascii="Calibri" w:hAnsi="Calibri"/>
+          <w:sz w:val="22"/>
+        </w:rPr>
+        <w:t xml:space="preserve"> a second league-ranking study. StatsBomb priors mix club and international competitions (e.g. FIFA World Cup, UEFA European Championship, UEFA Champions League), so that layer is noisier by design.</w:t>
+      </w:r>
+    </w:p>
+    <w:p/>
+    <w:p>
+      <w:r>
+        <w:rPr>
+          <w:rFonts w:ascii="Calibri" w:hAnsi="Calibri"/>
+          <w:sz w:val="22"/>
+        </w:rPr>
+      </w:r>
+      <w:r>
+        <w:rPr>
+          <w:rFonts w:ascii="Calibri" w:hAnsi="Calibri"/>
+          <w:b/>
+          <w:sz w:val="22"/>
+        </w:rPr>
+        <w:t>Attribution / use:</w:t>
+      </w:r>
+      <w:r>
+        <w:rPr>
+          <w:rFonts w:ascii="Calibri" w:hAnsi="Calibri"/>
+          <w:sz w:val="22"/>
+        </w:rPr>
+        <w:t xml:space="preserve"> FBref / Sports Reference is viewable online and usable for coursework with attribution and rate-limited access — respect their terms; do not redistribute raw dumps beyond the course. StatsBomb Open Data is used where available under their open license.</w:t>
+      </w:r>
+    </w:p>
+    <w:p/>
+    <w:p>
+      <w:r>
+        <w:rPr>
+          <w:rFonts w:ascii="Calibri" w:hAnsi="Calibri"/>
+          <w:sz w:val="22"/>
+        </w:rPr>
+        <w:t>---</w:t>
+      </w:r>
+    </w:p>
+    <w:p/>
+    <w:p>
+      <w:pPr>
+        <w:pStyle w:val="Heading2"/>
+      </w:pPr>
+      <w:r>
+        <w:t>Design — who is in the sample?</w:t>
       </w:r>
     </w:p>
     <w:p/>
@@ -119,23 +2632,268 @@
     </w:p>
     <w:p/>
     <w:p>
-      <w:r>
-        <w:t>- Who: Players with a first 1. Bundesliga season in end-years 2021–2025, with prior and Year 1 in Bundesliga minutes ≥ 300′, and a usable prior season outside the 1. Bundesliga.</w:t>
+      <w:pPr>
+        <w:pStyle w:val="ListBullet"/>
+      </w:pPr>
+      <w:r>
+        <w:rPr>
+          <w:rFonts w:ascii="Calibri" w:hAnsi="Calibri"/>
+          <w:sz w:val="22"/>
+        </w:rPr>
+      </w:r>
+      <w:r>
+        <w:rPr>
+          <w:rFonts w:ascii="Calibri" w:hAnsi="Calibri"/>
+          <w:b/>
+          <w:sz w:val="22"/>
+        </w:rPr>
+        <w:t>Who:</w:t>
+      </w:r>
+      <w:r>
+        <w:rPr>
+          <w:rFonts w:ascii="Calibri" w:hAnsi="Calibri"/>
+          <w:sz w:val="22"/>
+        </w:rPr>
+        <w:t xml:space="preserve"> Players with a first </w:t>
+      </w:r>
+      <w:r>
+        <w:rPr>
+          <w:rFonts w:ascii="Calibri" w:hAnsi="Calibri"/>
+          <w:b/>
+          <w:sz w:val="22"/>
+        </w:rPr>
+        <w:t>1. Bundesliga</w:t>
+      </w:r>
+      <w:r>
+        <w:rPr>
+          <w:rFonts w:ascii="Calibri" w:hAnsi="Calibri"/>
+          <w:sz w:val="22"/>
+        </w:rPr>
+        <w:t xml:space="preserve"> season in calendar end-years </w:t>
+      </w:r>
+      <w:r>
+        <w:rPr>
+          <w:rFonts w:ascii="Calibri" w:hAnsi="Calibri"/>
+          <w:b/>
+          <w:sz w:val="22"/>
+        </w:rPr>
+        <w:t>2021–2025</w:t>
+      </w:r>
+      <w:r>
+        <w:rPr>
+          <w:rFonts w:ascii="Calibri" w:hAnsi="Calibri"/>
+          <w:sz w:val="22"/>
+        </w:rPr>
+        <w:t>.</w:t>
       </w:r>
     </w:p>
     <w:p>
-      <w:r>
-        <w:t>- Where priors come from: season tables across 19 leagues (Big Five + 14 feeders), plus player-page fills where a league dump did not already cover the inbound.</w:t>
+      <w:pPr>
+        <w:pStyle w:val="ListBullet"/>
+      </w:pPr>
+      <w:r>
+        <w:rPr>
+          <w:rFonts w:ascii="Calibri" w:hAnsi="Calibri"/>
+          <w:sz w:val="22"/>
+        </w:rPr>
+      </w:r>
+      <w:r>
+        <w:rPr>
+          <w:rFonts w:ascii="Calibri" w:hAnsi="Calibri"/>
+          <w:b/>
+          <w:sz w:val="22"/>
+        </w:rPr>
+        <w:t>Minutes floors (both sides):</w:t>
+      </w:r>
+      <w:r>
+        <w:rPr>
+          <w:rFonts w:ascii="Calibri" w:hAnsi="Calibri"/>
+          <w:sz w:val="22"/>
+        </w:rPr>
+        <w:t xml:space="preserve"> prior season ≥ </w:t>
+      </w:r>
+      <w:r>
+        <w:rPr>
+          <w:rFonts w:ascii="Calibri" w:hAnsi="Calibri"/>
+          <w:b/>
+          <w:sz w:val="22"/>
+        </w:rPr>
+        <w:t>300′</w:t>
+      </w:r>
+      <w:r>
+        <w:rPr>
+          <w:rFonts w:ascii="Calibri" w:hAnsi="Calibri"/>
+          <w:sz w:val="22"/>
+        </w:rPr>
+        <w:t xml:space="preserve"> and Year 1 in Bundesliga ≥ </w:t>
+      </w:r>
+      <w:r>
+        <w:rPr>
+          <w:rFonts w:ascii="Calibri" w:hAnsi="Calibri"/>
+          <w:b/>
+          <w:sz w:val="22"/>
+        </w:rPr>
+        <w:t>300′</w:t>
+      </w:r>
+      <w:r>
+        <w:rPr>
+          <w:rFonts w:ascii="Calibri" w:hAnsi="Calibri"/>
+          <w:sz w:val="22"/>
+        </w:rPr>
+        <w:t xml:space="preserve">. Those floors — not “anyone who appeared in the Bundesliga” — produce </w:t>
+      </w:r>
+      <w:r>
+        <w:rPr>
+          <w:rFonts w:ascii="Calibri" w:hAnsi="Calibri"/>
+          <w:b/>
+          <w:sz w:val="22"/>
+        </w:rPr>
+        <w:t>N = 329</w:t>
+      </w:r>
+      <w:r>
+        <w:rPr>
+          <w:rFonts w:ascii="Calibri" w:hAnsi="Calibri"/>
+          <w:sz w:val="22"/>
+        </w:rPr>
+        <w:t>.</w:t>
       </w:r>
     </w:p>
     <w:p>
-      <w:r>
-        <w:t>- What we test: per-90 / rate metrics → 105 metrics tested → 43 metrics met the stability floor → 32 metrics met the redundancy floor for the final list.</w:t>
+      <w:pPr>
+        <w:pStyle w:val="ListBullet"/>
+      </w:pPr>
+      <w:r>
+        <w:rPr>
+          <w:rFonts w:ascii="Calibri" w:hAnsi="Calibri"/>
+          <w:sz w:val="22"/>
+        </w:rPr>
+      </w:r>
+      <w:r>
+        <w:rPr>
+          <w:rFonts w:ascii="Calibri" w:hAnsi="Calibri"/>
+          <w:b/>
+          <w:sz w:val="22"/>
+        </w:rPr>
+        <w:t>Prior sources:</w:t>
+      </w:r>
+      <w:r>
+        <w:rPr>
+          <w:rFonts w:ascii="Calibri" w:hAnsi="Calibri"/>
+          <w:sz w:val="22"/>
+        </w:rPr>
+        <w:t xml:space="preserve"> season tables across </w:t>
+      </w:r>
+      <w:r>
+        <w:rPr>
+          <w:rFonts w:ascii="Calibri" w:hAnsi="Calibri"/>
+          <w:b/>
+          <w:sz w:val="22"/>
+        </w:rPr>
+        <w:t>19 leagues</w:t>
+      </w:r>
+      <w:r>
+        <w:rPr>
+          <w:rFonts w:ascii="Calibri" w:hAnsi="Calibri"/>
+          <w:sz w:val="22"/>
+        </w:rPr>
+        <w:t xml:space="preserve"> (Big Five plus feeders such as 2. Bundesliga, Eredivisie, Championship, Segunda, Serie B, and others listed below), with player-page fills when a league dump did not already cover the inbound.</w:t>
       </w:r>
     </w:p>
     <w:p>
-      <w:r>
-        <w:t>- Why: Honest multi-league N for “which traits travel?” and “which feeders look strongest on Year 1 in Bundesliga minutes?”</w:t>
+      <w:pPr>
+        <w:pStyle w:val="ListBullet"/>
+      </w:pPr>
+      <w:r>
+        <w:rPr>
+          <w:rFonts w:ascii="Calibri" w:hAnsi="Calibri"/>
+          <w:sz w:val="22"/>
+        </w:rPr>
+      </w:r>
+      <w:r>
+        <w:rPr>
+          <w:rFonts w:ascii="Calibri" w:hAnsi="Calibri"/>
+          <w:b/>
+          <w:sz w:val="22"/>
+        </w:rPr>
+        <w:t>What we ran on rates:</w:t>
+      </w:r>
+      <w:r>
+        <w:rPr>
+          <w:rFonts w:ascii="Calibri" w:hAnsi="Calibri"/>
+          <w:sz w:val="22"/>
+        </w:rPr>
+        <w:t xml:space="preserve"> </w:t>
+      </w:r>
+      <w:r>
+        <w:rPr>
+          <w:rFonts w:ascii="Calibri" w:hAnsi="Calibri"/>
+          <w:b/>
+          <w:sz w:val="22"/>
+        </w:rPr>
+        <w:t>105 metrics tested</w:t>
+      </w:r>
+      <w:r>
+        <w:rPr>
+          <w:rFonts w:ascii="Calibri" w:hAnsi="Calibri"/>
+          <w:sz w:val="22"/>
+        </w:rPr>
+        <w:t xml:space="preserve"> → </w:t>
+      </w:r>
+      <w:r>
+        <w:rPr>
+          <w:rFonts w:ascii="Calibri" w:hAnsi="Calibri"/>
+          <w:b/>
+          <w:sz w:val="22"/>
+        </w:rPr>
+        <w:t>43 metrics met the stability floor</w:t>
+      </w:r>
+      <w:r>
+        <w:rPr>
+          <w:rFonts w:ascii="Calibri" w:hAnsi="Calibri"/>
+          <w:sz w:val="22"/>
+        </w:rPr>
+        <w:t xml:space="preserve"> → </w:t>
+      </w:r>
+      <w:r>
+        <w:rPr>
+          <w:rFonts w:ascii="Calibri" w:hAnsi="Calibri"/>
+          <w:b/>
+          <w:sz w:val="22"/>
+        </w:rPr>
+        <w:t>32 metrics met the redundancy floor</w:t>
+      </w:r>
+      <w:r>
+        <w:rPr>
+          <w:rFonts w:ascii="Calibri" w:hAnsi="Calibri"/>
+          <w:sz w:val="22"/>
+        </w:rPr>
+        <w:t xml:space="preserve"> for the final scout shortlist.</w:t>
+      </w:r>
+    </w:p>
+    <w:p>
+      <w:pPr>
+        <w:pStyle w:val="ListBullet"/>
+      </w:pPr>
+      <w:r>
+        <w:rPr>
+          <w:rFonts w:ascii="Calibri" w:hAnsi="Calibri"/>
+          <w:sz w:val="22"/>
+        </w:rPr>
+      </w:r>
+      <w:r>
+        <w:rPr>
+          <w:rFonts w:ascii="Calibri" w:hAnsi="Calibri"/>
+          <w:b/>
+          <w:sz w:val="22"/>
+        </w:rPr>
+        <w:t>Why this design:</w:t>
+      </w:r>
+      <w:r>
+        <w:rPr>
+          <w:rFonts w:ascii="Calibri" w:hAnsi="Calibri"/>
+          <w:sz w:val="22"/>
+        </w:rPr>
+        <w:t xml:space="preserve"> Honest multi-league N for “which traits travel?” and “which feeders look strongest on Year 1 in Bundesliga minutes?”</w:t>
       </w:r>
     </w:p>
     <w:p/>
@@ -149,44 +2907,406 @@
     </w:p>
     <w:p/>
     <w:p>
-      <w:r>
-        <w:t>- Who: Same inbound logic on open data; 1. Bundesliga open dumps only 2015/16 + 2023/24; priors from all male open competitions/seasons available (17 competitions in the working set). Minute floors stay on (relaxed for open-data thinness): prior ≥ 45′, Year 1 in Bundesliga ≥ 30′.</w:t>
+      <w:pPr>
+        <w:pStyle w:val="ListBullet"/>
+      </w:pPr>
+      <w:r>
+        <w:rPr>
+          <w:rFonts w:ascii="Calibri" w:hAnsi="Calibri"/>
+          <w:sz w:val="22"/>
+        </w:rPr>
+      </w:r>
+      <w:r>
+        <w:rPr>
+          <w:rFonts w:ascii="Calibri" w:hAnsi="Calibri"/>
+          <w:b/>
+          <w:sz w:val="22"/>
+        </w:rPr>
+        <w:t>Who:</w:t>
+      </w:r>
+      <w:r>
+        <w:rPr>
+          <w:rFonts w:ascii="Calibri" w:hAnsi="Calibri"/>
+          <w:sz w:val="22"/>
+        </w:rPr>
+        <w:t xml:space="preserve"> Same inbound logic on open data. Open 1. Bundesliga event dumps exist only for </w:t>
+      </w:r>
+      <w:r>
+        <w:rPr>
+          <w:rFonts w:ascii="Calibri" w:hAnsi="Calibri"/>
+          <w:b/>
+          <w:sz w:val="22"/>
+        </w:rPr>
+        <w:t>2015/16</w:t>
+      </w:r>
+      <w:r>
+        <w:rPr>
+          <w:rFonts w:ascii="Calibri" w:hAnsi="Calibri"/>
+          <w:sz w:val="22"/>
+        </w:rPr>
+        <w:t xml:space="preserve"> and </w:t>
+      </w:r>
+      <w:r>
+        <w:rPr>
+          <w:rFonts w:ascii="Calibri" w:hAnsi="Calibri"/>
+          <w:b/>
+          <w:sz w:val="22"/>
+        </w:rPr>
+        <w:t>2023/24</w:t>
+      </w:r>
+      <w:r>
+        <w:rPr>
+          <w:rFonts w:ascii="Calibri" w:hAnsi="Calibri"/>
+          <w:sz w:val="22"/>
+        </w:rPr>
+        <w:t xml:space="preserve">. Priors come from </w:t>
+      </w:r>
+      <w:r>
+        <w:rPr>
+          <w:rFonts w:ascii="Calibri" w:hAnsi="Calibri"/>
+          <w:b/>
+          <w:sz w:val="22"/>
+        </w:rPr>
+        <w:t>all male</w:t>
+      </w:r>
+      <w:r>
+        <w:rPr>
+          <w:rFonts w:ascii="Calibri" w:hAnsi="Calibri"/>
+          <w:sz w:val="22"/>
+        </w:rPr>
+        <w:t xml:space="preserve"> open competitions/seasons in the working set (</w:t>
+      </w:r>
+      <w:r>
+        <w:rPr>
+          <w:rFonts w:ascii="Calibri" w:hAnsi="Calibri"/>
+          <w:b/>
+          <w:sz w:val="22"/>
+        </w:rPr>
+        <w:t>17</w:t>
+      </w:r>
+      <w:r>
+        <w:rPr>
+          <w:rFonts w:ascii="Calibri" w:hAnsi="Calibri"/>
+          <w:sz w:val="22"/>
+        </w:rPr>
+        <w:t xml:space="preserve"> competitions).</w:t>
       </w:r>
     </w:p>
     <w:p>
-      <w:r>
-        <w:t>- Pipeline (same order):</w:t>
+      <w:pPr>
+        <w:pStyle w:val="ListBullet"/>
+      </w:pPr>
+      <w:r>
+        <w:rPr>
+          <w:rFonts w:ascii="Calibri" w:hAnsi="Calibri"/>
+          <w:sz w:val="22"/>
+        </w:rPr>
+      </w:r>
+      <w:r>
+        <w:rPr>
+          <w:rFonts w:ascii="Calibri" w:hAnsi="Calibri"/>
+          <w:b/>
+          <w:sz w:val="22"/>
+        </w:rPr>
+        <w:t>Minutes floors (relaxed for thin open data):</w:t>
+      </w:r>
+      <w:r>
+        <w:rPr>
+          <w:rFonts w:ascii="Calibri" w:hAnsi="Calibri"/>
+          <w:sz w:val="22"/>
+        </w:rPr>
+        <w:t xml:space="preserve"> prior ≥ </w:t>
+      </w:r>
+      <w:r>
+        <w:rPr>
+          <w:rFonts w:ascii="Calibri" w:hAnsi="Calibri"/>
+          <w:b/>
+          <w:sz w:val="22"/>
+        </w:rPr>
+        <w:t>45′</w:t>
+      </w:r>
+      <w:r>
+        <w:rPr>
+          <w:rFonts w:ascii="Calibri" w:hAnsi="Calibri"/>
+          <w:sz w:val="22"/>
+        </w:rPr>
+        <w:t xml:space="preserve">, Year 1 in Bundesliga ≥ </w:t>
+      </w:r>
+      <w:r>
+        <w:rPr>
+          <w:rFonts w:ascii="Calibri" w:hAnsi="Calibri"/>
+          <w:b/>
+          <w:sz w:val="22"/>
+        </w:rPr>
+        <w:t>30′</w:t>
+      </w:r>
+      <w:r>
+        <w:rPr>
+          <w:rFonts w:ascii="Calibri" w:hAnsi="Calibri"/>
+          <w:sz w:val="22"/>
+        </w:rPr>
+        <w:t>.</w:t>
       </w:r>
     </w:p>
     <w:p>
-      <w:r>
-        <w:t xml:space="preserve">  1. Stability — correlate prior vs Year 1 in Bundesliga per-90. Gate Pearson r ≥ 0.40 → 7 of 16 metrics pass.</w:t>
+      <w:pPr>
+        <w:pStyle w:val="ListBullet"/>
+      </w:pPr>
+      <w:r>
+        <w:rPr>
+          <w:rFonts w:ascii="Calibri" w:hAnsi="Calibri"/>
+          <w:sz w:val="22"/>
+        </w:rPr>
+      </w:r>
+      <w:r>
+        <w:rPr>
+          <w:rFonts w:ascii="Calibri" w:hAnsi="Calibri"/>
+          <w:b/>
+          <w:sz w:val="22"/>
+        </w:rPr>
+        <w:t>Same pipeline order:</w:t>
+      </w:r>
+      <w:r>
+        <w:rPr>
+          <w:rFonts w:ascii="Calibri" w:hAnsi="Calibri"/>
+          <w:sz w:val="22"/>
+        </w:rPr>
       </w:r>
     </w:p>
     <w:p>
       <w:r>
-        <w:t xml:space="preserve">  2. Redundancy — near-duplicates only at Pearson |r| ≥ 0.85 (so e.g. passes stays with progressive passes) → 7 kept.</w:t>
+        <w:rPr>
+          <w:rFonts w:ascii="Calibri" w:hAnsi="Calibri"/>
+          <w:sz w:val="22"/>
+        </w:rPr>
+        <w:t xml:space="preserve">  1. </w:t>
+      </w:r>
+      <w:r>
+        <w:rPr>
+          <w:rFonts w:ascii="Calibri" w:hAnsi="Calibri"/>
+          <w:b/>
+          <w:sz w:val="22"/>
+        </w:rPr>
+        <w:t>Stability</w:t>
+      </w:r>
+      <w:r>
+        <w:rPr>
+          <w:rFonts w:ascii="Calibri" w:hAnsi="Calibri"/>
+          <w:sz w:val="22"/>
+        </w:rPr>
+        <w:t xml:space="preserve"> — correlate prior vs Year 1 in Bundesliga per-90. Gate </w:t>
+      </w:r>
+      <w:r>
+        <w:rPr>
+          <w:rFonts w:ascii="Calibri" w:hAnsi="Calibri"/>
+          <w:b/>
+          <w:sz w:val="22"/>
+        </w:rPr>
+        <w:t>Pearson r ≥ 0.40</w:t>
+      </w:r>
+      <w:r>
+        <w:rPr>
+          <w:rFonts w:ascii="Calibri" w:hAnsi="Calibri"/>
+          <w:sz w:val="22"/>
+        </w:rPr>
+        <w:t xml:space="preserve"> → </w:t>
+      </w:r>
+      <w:r>
+        <w:rPr>
+          <w:rFonts w:ascii="Calibri" w:hAnsi="Calibri"/>
+          <w:b/>
+          <w:sz w:val="22"/>
+        </w:rPr>
+        <w:t>7 of 16</w:t>
+      </w:r>
+      <w:r>
+        <w:rPr>
+          <w:rFonts w:ascii="Calibri" w:hAnsi="Calibri"/>
+          <w:sz w:val="22"/>
+        </w:rPr>
+        <w:t xml:space="preserve"> metrics pass.</w:t>
       </w:r>
     </w:p>
     <w:p>
       <w:r>
-        <w:t xml:space="preserve">  3. Pizza / explorer — profiles from that shortlist; success tests use Year 1 in Bundesliga minutes.</w:t>
+        <w:rPr>
+          <w:rFonts w:ascii="Calibri" w:hAnsi="Calibri"/>
+          <w:sz w:val="22"/>
+        </w:rPr>
+        <w:t xml:space="preserve">  2. </w:t>
+      </w:r>
+      <w:r>
+        <w:rPr>
+          <w:rFonts w:ascii="Calibri" w:hAnsi="Calibri"/>
+          <w:b/>
+          <w:sz w:val="22"/>
+        </w:rPr>
+        <w:t>Redundancy</w:t>
+      </w:r>
+      <w:r>
+        <w:rPr>
+          <w:rFonts w:ascii="Calibri" w:hAnsi="Calibri"/>
+          <w:sz w:val="22"/>
+        </w:rPr>
+        <w:t xml:space="preserve"> — near-duplicates only at </w:t>
+      </w:r>
+      <w:r>
+        <w:rPr>
+          <w:rFonts w:ascii="Calibri" w:hAnsi="Calibri"/>
+          <w:b/>
+          <w:sz w:val="22"/>
+        </w:rPr>
+        <w:t>Pearson \|r\| ≥ 0.85</w:t>
+      </w:r>
+      <w:r>
+        <w:rPr>
+          <w:rFonts w:ascii="Calibri" w:hAnsi="Calibri"/>
+          <w:sz w:val="22"/>
+        </w:rPr>
+        <w:t xml:space="preserve"> (so, for example, pass volume can stay alongside progressive passes) → </w:t>
+      </w:r>
+      <w:r>
+        <w:rPr>
+          <w:rFonts w:ascii="Calibri" w:hAnsi="Calibri"/>
+          <w:b/>
+          <w:sz w:val="22"/>
+        </w:rPr>
+        <w:t>7 kept</w:t>
+      </w:r>
+      <w:r>
+        <w:rPr>
+          <w:rFonts w:ascii="Calibri" w:hAnsi="Calibri"/>
+          <w:sz w:val="22"/>
+        </w:rPr>
+        <w:t>.</w:t>
       </w:r>
     </w:p>
     <w:p>
       <w:r>
-        <w:t>- Role: Event-level confirmation of which trait *families* travel — not a second league-ranking study. Open-data priors are mixed (club + international), so StatsBomb is read as noisier than FBref.</w:t>
+        <w:rPr>
+          <w:rFonts w:ascii="Calibri" w:hAnsi="Calibri"/>
+          <w:sz w:val="22"/>
+        </w:rPr>
+        <w:t xml:space="preserve">  3. </w:t>
+      </w:r>
+      <w:r>
+        <w:rPr>
+          <w:rFonts w:ascii="Calibri" w:hAnsi="Calibri"/>
+          <w:b/>
+          <w:sz w:val="22"/>
+        </w:rPr>
+        <w:t>Pizza / explorer + success</w:t>
+      </w:r>
+      <w:r>
+        <w:rPr>
+          <w:rFonts w:ascii="Calibri" w:hAnsi="Calibri"/>
+          <w:sz w:val="22"/>
+        </w:rPr>
+        <w:t xml:space="preserve"> — profiles from that shortlist; Phase 2 uses </w:t>
+      </w:r>
+      <w:r>
+        <w:rPr>
+          <w:rFonts w:ascii="Calibri" w:hAnsi="Calibri"/>
+          <w:b/>
+          <w:sz w:val="22"/>
+        </w:rPr>
+        <w:t>Year 1 in Bundesliga minutes</w:t>
+      </w:r>
+      <w:r>
+        <w:rPr>
+          <w:rFonts w:ascii="Calibri" w:hAnsi="Calibri"/>
+          <w:sz w:val="22"/>
+        </w:rPr>
+        <w:t>.</w:t>
+      </w:r>
+    </w:p>
+    <w:p>
+      <w:pPr>
+        <w:pStyle w:val="ListBullet"/>
+      </w:pPr>
+      <w:r>
+        <w:rPr>
+          <w:rFonts w:ascii="Calibri" w:hAnsi="Calibri"/>
+          <w:sz w:val="22"/>
+        </w:rPr>
+      </w:r>
+      <w:r>
+        <w:rPr>
+          <w:rFonts w:ascii="Calibri" w:hAnsi="Calibri"/>
+          <w:b/>
+          <w:sz w:val="22"/>
+        </w:rPr>
+        <w:t>Role:</w:t>
+      </w:r>
+      <w:r>
+        <w:rPr>
+          <w:rFonts w:ascii="Calibri" w:hAnsi="Calibri"/>
+          <w:sz w:val="22"/>
+        </w:rPr>
+        <w:t xml:space="preserve"> Confirm which trait *families* travel at event granularity — not to re-rank feeder leagues.</w:t>
       </w:r>
     </w:p>
     <w:p/>
     <w:p>
       <w:r>
-        <w:t>Outputs: traits that transferred well (stability), a short non-redundant scout card (redundancy), interactive explorer / pizza charts, and feeder-league / trait→Year 1 in Bundesliga success readouts.</w:t>
+        <w:rPr>
+          <w:rFonts w:ascii="Calibri" w:hAnsi="Calibri"/>
+          <w:sz w:val="22"/>
+        </w:rPr>
+      </w:r>
+      <w:r>
+        <w:rPr>
+          <w:rFonts w:ascii="Calibri" w:hAnsi="Calibri"/>
+          <w:b/>
+          <w:sz w:val="22"/>
+        </w:rPr>
+        <w:t>FBref feeder dumps used (slimmed to inbound-roster players):</w:t>
+      </w:r>
+      <w:r>
+        <w:rPr>
+          <w:rFonts w:ascii="Calibri" w:hAnsi="Calibri"/>
+          <w:sz w:val="22"/>
+        </w:rPr>
+        <w:t xml:space="preserve"> 2. Bundesliga · Eredivisie · Austria · Portugal · Belgium · Swiss · Turkey · Championship · Ligue 2 · Segunda · Serie B · Denmark · Poland · Czech (plus Big Five caches for Year 1 / Big-5 priors). Working analysis uses </w:t>
+      </w:r>
+      <w:r>
+        <w:rPr>
+          <w:rFonts w:ascii="Calibri" w:hAnsi="Calibri"/>
+          <w:b/>
+          <w:sz w:val="22"/>
+        </w:rPr>
+        <w:t>19 leagues</w:t>
+      </w:r>
+      <w:r>
+        <w:rPr>
+          <w:rFonts w:ascii="Calibri" w:hAnsi="Calibri"/>
+          <w:sz w:val="22"/>
+        </w:rPr>
+        <w:t xml:space="preserve"> in the FBref tables; paired inbound </w:t>
+      </w:r>
+      <w:r>
+        <w:rPr>
+          <w:rFonts w:ascii="Calibri" w:hAnsi="Calibri"/>
+          <w:b/>
+          <w:sz w:val="22"/>
+        </w:rPr>
+        <w:t>N = 329</w:t>
+      </w:r>
+      <w:r>
+        <w:rPr>
+          <w:rFonts w:ascii="Calibri" w:hAnsi="Calibri"/>
+          <w:sz w:val="22"/>
+        </w:rPr>
+        <w:t>.</w:t>
       </w:r>
     </w:p>
     <w:p/>
     <w:p>
       <w:r>
+        <w:rPr>
+          <w:rFonts w:ascii="Calibri" w:hAnsi="Calibri"/>
+          <w:sz w:val="22"/>
+        </w:rPr>
         <w:t>---</w:t>
       </w:r>
     </w:p>
@@ -196,48 +3316,600 @@
         <w:pStyle w:val="Heading2"/>
       </w:pPr>
       <w:r>
-        <w:t>Methodology (brief)</w:t>
+        <w:t>Methodology (self-contained)</w:t>
       </w:r>
     </w:p>
     <w:p/>
     <w:p>
       <w:r>
-        <w:t>The core idea is test–retest reliability across a league change, not across seasons in the same league. For each per-90 metric we compute Pearson *r* between a player’s prior-league season and their first Bundesliga season.</w:t>
+        <w:rPr>
+          <w:rFonts w:ascii="Calibri" w:hAnsi="Calibri"/>
+          <w:sz w:val="22"/>
+        </w:rPr>
+        <w:t xml:space="preserve">The core idea is </w:t>
+      </w:r>
+      <w:r>
+        <w:rPr>
+          <w:rFonts w:ascii="Calibri" w:hAnsi="Calibri"/>
+          <w:b/>
+          <w:sz w:val="22"/>
+        </w:rPr>
+        <w:t>test–retest reliability across a league change</w:t>
+      </w:r>
+      <w:r>
+        <w:rPr>
+          <w:rFonts w:ascii="Calibri" w:hAnsi="Calibri"/>
+          <w:sz w:val="22"/>
+        </w:rPr>
+        <w:t xml:space="preserve">, not across two seasons in the same league. For each per-90 metric we compute </w:t>
+      </w:r>
+      <w:r>
+        <w:rPr>
+          <w:rFonts w:ascii="Calibri" w:hAnsi="Calibri"/>
+          <w:b/>
+          <w:sz w:val="22"/>
+        </w:rPr>
+        <w:t>Pearson r</w:t>
+      </w:r>
+      <w:r>
+        <w:rPr>
+          <w:rFonts w:ascii="Calibri" w:hAnsi="Calibri"/>
+          <w:sz w:val="22"/>
+        </w:rPr>
+        <w:t xml:space="preserve"> between the player’s prior-league season and their Year 1 in Bundesliga season.</w:t>
       </w:r>
     </w:p>
     <w:p/>
     <w:p>
-      <w:r>
-        <w:t>FBref gates (category-specific): Attacking / Passing / Other Pearson r ≥ 0.60; Defending / Carrying Pearson r ≥ 0.50 (a slightly lower floor so enough defensive/carrying metrics remain for a usable shortlist). That yields 43 metrics that met the stability floor from 105 metrics tested. Redundancy at Pearson |r| ≥ 0.95 (pick order: stability → sample size → prefer rate/contextual) → 32 metrics met the redundancy floor for the final list.</w:t>
+      <w:pPr>
+        <w:pStyle w:val="Heading3"/>
+      </w:pPr>
+      <w:r>
+        <w:t>Stability floors (what “met the stability floor” means)</w:t>
       </w:r>
     </w:p>
     <w:p/>
     <w:p>
       <w:r>
-        <w:t>StatsBomb gate: Pearson r ≥ 0.40 → 7 metrics; redundancy Pearson |r| ≥ 0.85 → keep all 7 (including passes).</w:t>
+        <w:rPr>
+          <w:rFonts w:ascii="Calibri" w:hAnsi="Calibri"/>
+          <w:sz w:val="22"/>
+        </w:rPr>
+      </w:r>
+      <w:r>
+        <w:rPr>
+          <w:rFonts w:ascii="Calibri" w:hAnsi="Calibri"/>
+          <w:b/>
+          <w:sz w:val="22"/>
+        </w:rPr>
+        <w:t>FBref (category-specific):</w:t>
+      </w:r>
+      <w:r>
+        <w:rPr>
+          <w:rFonts w:ascii="Calibri" w:hAnsi="Calibri"/>
+          <w:sz w:val="22"/>
+        </w:rPr>
       </w:r>
     </w:p>
     <w:p/>
     <w:p>
-      <w:r>
-        <w:t>League-relative scaling: We tried scoring each rate as “how high is this vs peers in the same prior league” (within-league z-score or percentile) instead of the raw per-90. It did not improve prior→Year 1 in Bundesliga stability on FBref, so we kept absolute per-90 rates for both sources.</w:t>
+      <w:pPr>
+        <w:pStyle w:val="ListBullet"/>
+      </w:pPr>
+      <w:r>
+        <w:rPr>
+          <w:rFonts w:ascii="Calibri" w:hAnsi="Calibri"/>
+          <w:sz w:val="22"/>
+        </w:rPr>
+        <w:t xml:space="preserve">Attacking / Passing / Other: </w:t>
+      </w:r>
+      <w:r>
+        <w:rPr>
+          <w:rFonts w:ascii="Calibri" w:hAnsi="Calibri"/>
+          <w:b/>
+          <w:sz w:val="22"/>
+        </w:rPr>
+        <w:t>Pearson r ≥ 0.60</w:t>
+      </w:r>
+      <w:r>
+        <w:rPr>
+          <w:rFonts w:ascii="Calibri" w:hAnsi="Calibri"/>
+          <w:sz w:val="22"/>
+        </w:rPr>
+      </w:r>
+    </w:p>
+    <w:p>
+      <w:pPr>
+        <w:pStyle w:val="ListBullet"/>
+      </w:pPr>
+      <w:r>
+        <w:rPr>
+          <w:rFonts w:ascii="Calibri" w:hAnsi="Calibri"/>
+          <w:sz w:val="22"/>
+        </w:rPr>
+        <w:t xml:space="preserve">Defending / Carrying: </w:t>
+      </w:r>
+      <w:r>
+        <w:rPr>
+          <w:rFonts w:ascii="Calibri" w:hAnsi="Calibri"/>
+          <w:b/>
+          <w:sz w:val="22"/>
+        </w:rPr>
+        <w:t>Pearson r ≥ 0.50</w:t>
+      </w:r>
+      <w:r>
+        <w:rPr>
+          <w:rFonts w:ascii="Calibri" w:hAnsi="Calibri"/>
+          <w:sz w:val="22"/>
+        </w:rPr>
+        <w:t xml:space="preserve"> (slightly lower so enough defensive and carrying metrics remain for a usable shortlist)</w:t>
       </w:r>
     </w:p>
     <w:p/>
     <w:p>
       <w:r>
-        <w:t>Inbound status is inferred from playing records (first Bundesliga season / prior competition ≠ 1. Bundesliga). Success proxy for Phase 2 = Year 1 in Bundesliga minutes (playing-time success), not market value.</w:t>
+        <w:rPr>
+          <w:rFonts w:ascii="Calibri" w:hAnsi="Calibri"/>
+          <w:sz w:val="22"/>
+        </w:rPr>
+        <w:t xml:space="preserve">Result: </w:t>
+      </w:r>
+      <w:r>
+        <w:rPr>
+          <w:rFonts w:ascii="Calibri" w:hAnsi="Calibri"/>
+          <w:b/>
+          <w:sz w:val="22"/>
+        </w:rPr>
+        <w:t>43 of 105</w:t>
+      </w:r>
+      <w:r>
+        <w:rPr>
+          <w:rFonts w:ascii="Calibri" w:hAnsi="Calibri"/>
+          <w:sz w:val="22"/>
+        </w:rPr>
+        <w:t xml:space="preserve"> tested metrics cleared the floor.</w:t>
       </w:r>
     </w:p>
     <w:p/>
     <w:p>
       <w:r>
-        <w:t>Sample: Destination = 1. Bundesliga only. FBref first-Bundesliga window = end years 2021–2025, with the minutes restriction still applied (prior ≥ 300′ and Year 1 in Bundesliga ≥ 300′) — that is how we get analysis-ready N = 329, not every Bundesliga appearance. StatsBomb keeps its own lower floors (prior ≥ 45′, Year 1 in Bundesliga ≥ 30′) on open-data priors as above.</w:t>
+        <w:rPr>
+          <w:rFonts w:ascii="Calibri" w:hAnsi="Calibri"/>
+          <w:sz w:val="22"/>
+        </w:rPr>
+      </w:r>
+      <w:r>
+        <w:rPr>
+          <w:rFonts w:ascii="Calibri" w:hAnsi="Calibri"/>
+          <w:b/>
+          <w:sz w:val="22"/>
+        </w:rPr>
+        <w:t>StatsBomb:</w:t>
+      </w:r>
+      <w:r>
+        <w:rPr>
+          <w:rFonts w:ascii="Calibri" w:hAnsi="Calibri"/>
+          <w:sz w:val="22"/>
+        </w:rPr>
+        <w:t xml:space="preserve"> </w:t>
+      </w:r>
+      <w:r>
+        <w:rPr>
+          <w:rFonts w:ascii="Calibri" w:hAnsi="Calibri"/>
+          <w:b/>
+          <w:sz w:val="22"/>
+        </w:rPr>
+        <w:t>Pearson r ≥ 0.40</w:t>
+      </w:r>
+      <w:r>
+        <w:rPr>
+          <w:rFonts w:ascii="Calibri" w:hAnsi="Calibri"/>
+          <w:sz w:val="22"/>
+        </w:rPr>
+        <w:t xml:space="preserve"> → </w:t>
+      </w:r>
+      <w:r>
+        <w:rPr>
+          <w:rFonts w:ascii="Calibri" w:hAnsi="Calibri"/>
+          <w:b/>
+          <w:sz w:val="22"/>
+        </w:rPr>
+        <w:t>7</w:t>
+      </w:r>
+      <w:r>
+        <w:rPr>
+          <w:rFonts w:ascii="Calibri" w:hAnsi="Calibri"/>
+          <w:sz w:val="22"/>
+        </w:rPr>
+        <w:t xml:space="preserve"> metrics.</w:t>
       </w:r>
     </w:p>
     <w:p/>
     <w:p>
-      <w:r>
+      <w:pPr>
+        <w:pStyle w:val="Heading3"/>
+      </w:pPr>
+      <w:r>
+        <w:t>Redundancy floors (what “met the redundancy floor” means)</w:t>
+      </w:r>
+    </w:p>
+    <w:p/>
+    <w:p>
+      <w:r>
+        <w:rPr>
+          <w:rFonts w:ascii="Calibri" w:hAnsi="Calibri"/>
+          <w:sz w:val="22"/>
+        </w:rPr>
+        <w:t>Among metrics that already cleared stability, drop near-duplicates:</w:t>
+      </w:r>
+    </w:p>
+    <w:p/>
+    <w:p>
+      <w:pPr>
+        <w:pStyle w:val="ListBullet"/>
+      </w:pPr>
+      <w:r>
+        <w:rPr>
+          <w:rFonts w:ascii="Calibri" w:hAnsi="Calibri"/>
+          <w:sz w:val="22"/>
+        </w:rPr>
+      </w:r>
+      <w:r>
+        <w:rPr>
+          <w:rFonts w:ascii="Calibri" w:hAnsi="Calibri"/>
+          <w:b/>
+          <w:sz w:val="22"/>
+        </w:rPr>
+        <w:t>FBref:</w:t>
+      </w:r>
+      <w:r>
+        <w:rPr>
+          <w:rFonts w:ascii="Calibri" w:hAnsi="Calibri"/>
+          <w:sz w:val="22"/>
+        </w:rPr>
+        <w:t xml:space="preserve"> </w:t>
+      </w:r>
+      <w:r>
+        <w:rPr>
+          <w:rFonts w:ascii="Calibri" w:hAnsi="Calibri"/>
+          <w:b/>
+          <w:sz w:val="22"/>
+        </w:rPr>
+        <w:t>Pearson \|r\| ≥ 0.95</w:t>
+      </w:r>
+      <w:r>
+        <w:rPr>
+          <w:rFonts w:ascii="Calibri" w:hAnsi="Calibri"/>
+          <w:sz w:val="22"/>
+        </w:rPr>
+        <w:t xml:space="preserve"> between two shortlist candidates. Pick order when choosing which to keep: higher stability first, then larger sample size, then prefer rate/contextual metrics → </w:t>
+      </w:r>
+      <w:r>
+        <w:rPr>
+          <w:rFonts w:ascii="Calibri" w:hAnsi="Calibri"/>
+          <w:b/>
+          <w:sz w:val="22"/>
+        </w:rPr>
+        <w:t>32</w:t>
+      </w:r>
+      <w:r>
+        <w:rPr>
+          <w:rFonts w:ascii="Calibri" w:hAnsi="Calibri"/>
+          <w:sz w:val="22"/>
+        </w:rPr>
+        <w:t xml:space="preserve"> remain.</w:t>
+      </w:r>
+    </w:p>
+    <w:p>
+      <w:pPr>
+        <w:pStyle w:val="ListBullet"/>
+      </w:pPr>
+      <w:r>
+        <w:rPr>
+          <w:rFonts w:ascii="Calibri" w:hAnsi="Calibri"/>
+          <w:sz w:val="22"/>
+        </w:rPr>
+      </w:r>
+      <w:r>
+        <w:rPr>
+          <w:rFonts w:ascii="Calibri" w:hAnsi="Calibri"/>
+          <w:b/>
+          <w:sz w:val="22"/>
+        </w:rPr>
+        <w:t>StatsBomb:</w:t>
+      </w:r>
+      <w:r>
+        <w:rPr>
+          <w:rFonts w:ascii="Calibri" w:hAnsi="Calibri"/>
+          <w:sz w:val="22"/>
+        </w:rPr>
+        <w:t xml:space="preserve"> </w:t>
+      </w:r>
+      <w:r>
+        <w:rPr>
+          <w:rFonts w:ascii="Calibri" w:hAnsi="Calibri"/>
+          <w:b/>
+          <w:sz w:val="22"/>
+        </w:rPr>
+        <w:t>Pearson \|r\| ≥ 0.85</w:t>
+      </w:r>
+      <w:r>
+        <w:rPr>
+          <w:rFonts w:ascii="Calibri" w:hAnsi="Calibri"/>
+          <w:sz w:val="22"/>
+        </w:rPr>
+        <w:t xml:space="preserve"> → all </w:t>
+      </w:r>
+      <w:r>
+        <w:rPr>
+          <w:rFonts w:ascii="Calibri" w:hAnsi="Calibri"/>
+          <w:b/>
+          <w:sz w:val="22"/>
+        </w:rPr>
+        <w:t>7</w:t>
+      </w:r>
+      <w:r>
+        <w:rPr>
+          <w:rFonts w:ascii="Calibri" w:hAnsi="Calibri"/>
+          <w:sz w:val="22"/>
+        </w:rPr>
+        <w:t xml:space="preserve"> kept (including passes).</w:t>
+      </w:r>
+    </w:p>
+    <w:p/>
+    <w:p>
+      <w:r>
+        <w:rPr>
+          <w:rFonts w:ascii="Calibri" w:hAnsi="Calibri"/>
+          <w:sz w:val="22"/>
+        </w:rPr>
+        <w:t xml:space="preserve">There are </w:t>
+      </w:r>
+      <w:r>
+        <w:rPr>
+          <w:rFonts w:ascii="Calibri" w:hAnsi="Calibri"/>
+          <w:b/>
+          <w:sz w:val="22"/>
+        </w:rPr>
+        <w:t>no forced keeps</w:t>
+      </w:r>
+      <w:r>
+        <w:rPr>
+          <w:rFonts w:ascii="Calibri" w:hAnsi="Calibri"/>
+          <w:sz w:val="22"/>
+        </w:rPr>
+        <w:t xml:space="preserve"> of vanity scoring stats outside that rule set.</w:t>
+      </w:r>
+    </w:p>
+    <w:p/>
+    <w:p>
+      <w:pPr>
+        <w:pStyle w:val="Heading3"/>
+      </w:pPr>
+      <w:r>
+        <w:t>League-relative scaling (tested and not used)</w:t>
+      </w:r>
+    </w:p>
+    <w:p/>
+    <w:p>
+      <w:r>
+        <w:rPr>
+          <w:rFonts w:ascii="Calibri" w:hAnsi="Calibri"/>
+          <w:sz w:val="22"/>
+        </w:rPr>
+        <w:t xml:space="preserve">We also tried scoring each rate as </w:t>
+      </w:r>
+      <w:r>
+        <w:rPr>
+          <w:rFonts w:ascii="Calibri" w:hAnsi="Calibri"/>
+          <w:b/>
+          <w:sz w:val="22"/>
+        </w:rPr>
+        <w:t>“how high is this vs peers in the same prior league”</w:t>
+      </w:r>
+      <w:r>
+        <w:rPr>
+          <w:rFonts w:ascii="Calibri" w:hAnsi="Calibri"/>
+          <w:sz w:val="22"/>
+        </w:rPr>
+        <w:t xml:space="preserve"> (within-league z-score or percentile) instead of the raw per-90. That </w:t>
+      </w:r>
+      <w:r>
+        <w:rPr>
+          <w:rFonts w:ascii="Calibri" w:hAnsi="Calibri"/>
+          <w:b/>
+          <w:sz w:val="22"/>
+        </w:rPr>
+        <w:t>did not improve</w:t>
+      </w:r>
+      <w:r>
+        <w:rPr>
+          <w:rFonts w:ascii="Calibri" w:hAnsi="Calibri"/>
+          <w:sz w:val="22"/>
+        </w:rPr>
+        <w:t xml:space="preserve"> prior→Year 1 in Bundesliga stability on FBref, so both sources keep </w:t>
+      </w:r>
+      <w:r>
+        <w:rPr>
+          <w:rFonts w:ascii="Calibri" w:hAnsi="Calibri"/>
+          <w:b/>
+          <w:sz w:val="22"/>
+        </w:rPr>
+        <w:t>absolute per-90 rates</w:t>
+      </w:r>
+      <w:r>
+        <w:rPr>
+          <w:rFonts w:ascii="Calibri" w:hAnsi="Calibri"/>
+          <w:sz w:val="22"/>
+        </w:rPr>
+        <w:t>. On StatsBomb the idea is even less meaningful because priors mix World Cup / Euro / Champions League / clubs.</w:t>
+      </w:r>
+    </w:p>
+    <w:p/>
+    <w:p>
+      <w:pPr>
+        <w:pStyle w:val="Heading3"/>
+      </w:pPr>
+      <w:r>
+        <w:t>Phase 2 — success indicators</w:t>
+      </w:r>
+    </w:p>
+    <w:p/>
+    <w:p>
+      <w:r>
+        <w:rPr>
+          <w:rFonts w:ascii="Calibri" w:hAnsi="Calibri"/>
+          <w:sz w:val="22"/>
+        </w:rPr>
+        <w:t>After the shortlist exists:</w:t>
+      </w:r>
+    </w:p>
+    <w:p/>
+    <w:p>
+      <w:pPr>
+        <w:pStyle w:val="ListBullet"/>
+      </w:pPr>
+      <w:r>
+        <w:rPr>
+          <w:rFonts w:ascii="Calibri" w:hAnsi="Calibri"/>
+          <w:sz w:val="22"/>
+        </w:rPr>
+      </w:r>
+      <w:r>
+        <w:rPr>
+          <w:rFonts w:ascii="Calibri" w:hAnsi="Calibri"/>
+          <w:b/>
+          <w:sz w:val="22"/>
+        </w:rPr>
+        <w:t>Spearman</w:t>
+      </w:r>
+      <w:r>
+        <w:rPr>
+          <w:rFonts w:ascii="Calibri" w:hAnsi="Calibri"/>
+          <w:sz w:val="22"/>
+        </w:rPr>
+        <w:t xml:space="preserve"> tests: prior-season trait </w:t>
+      </w:r>
+      <w:r>
+        <w:rPr>
+          <w:rFonts w:ascii="Calibri" w:hAnsi="Calibri"/>
+          <w:b/>
+          <w:sz w:val="22"/>
+        </w:rPr>
+        <w:t>percentile</w:t>
+      </w:r>
+      <w:r>
+        <w:rPr>
+          <w:rFonts w:ascii="Calibri" w:hAnsi="Calibri"/>
+          <w:sz w:val="22"/>
+        </w:rPr>
+        <w:t xml:space="preserve"> vs </w:t>
+      </w:r>
+      <w:r>
+        <w:rPr>
+          <w:rFonts w:ascii="Calibri" w:hAnsi="Calibri"/>
+          <w:b/>
+          <w:sz w:val="22"/>
+        </w:rPr>
+        <w:t>Year 1 in Bundesliga minutes</w:t>
+      </w:r>
+      <w:r>
+        <w:rPr>
+          <w:rFonts w:ascii="Calibri" w:hAnsi="Calibri"/>
+          <w:sz w:val="22"/>
+        </w:rPr>
+        <w:t xml:space="preserve"> (and secondary outcomes such as minutes percentile and a stable-trait profile score).</w:t>
+      </w:r>
+    </w:p>
+    <w:p>
+      <w:pPr>
+        <w:pStyle w:val="ListBullet"/>
+      </w:pPr>
+      <w:r>
+        <w:rPr>
+          <w:rFonts w:ascii="Calibri" w:hAnsi="Calibri"/>
+          <w:sz w:val="22"/>
+        </w:rPr>
+      </w:r>
+      <w:r>
+        <w:rPr>
+          <w:rFonts w:ascii="Calibri" w:hAnsi="Calibri"/>
+          <w:b/>
+          <w:sz w:val="22"/>
+        </w:rPr>
+        <w:t>Feeder summaries:</w:t>
+      </w:r>
+      <w:r>
+        <w:rPr>
+          <w:rFonts w:ascii="Calibri" w:hAnsi="Calibri"/>
+          <w:sz w:val="22"/>
+        </w:rPr>
+        <w:t xml:space="preserve"> mean Year 1 outcomes by prior league (descriptive).</w:t>
+      </w:r>
+    </w:p>
+    <w:p>
+      <w:pPr>
+        <w:pStyle w:val="ListBullet"/>
+      </w:pPr>
+      <w:r>
+        <w:rPr>
+          <w:rFonts w:ascii="Calibri" w:hAnsi="Calibri"/>
+          <w:sz w:val="22"/>
+        </w:rPr>
+      </w:r>
+      <w:r>
+        <w:rPr>
+          <w:rFonts w:ascii="Calibri" w:hAnsi="Calibri"/>
+          <w:b/>
+          <w:sz w:val="22"/>
+        </w:rPr>
+        <w:t>Exploratory OLS</w:t>
+      </w:r>
+      <w:r>
+        <w:rPr>
+          <w:rFonts w:ascii="Calibri" w:hAnsi="Calibri"/>
+          <w:sz w:val="22"/>
+        </w:rPr>
+        <w:t xml:space="preserve"> on a Big-5 FBref subset (</w:t>
+      </w:r>
+      <w:r>
+        <w:rPr>
+          <w:rFonts w:ascii="Calibri" w:hAnsi="Calibri"/>
+          <w:b/>
+          <w:sz w:val="22"/>
+        </w:rPr>
+        <w:t>N = 117</w:t>
+      </w:r>
+      <w:r>
+        <w:rPr>
+          <w:rFonts w:ascii="Calibri" w:hAnsi="Calibri"/>
+          <w:sz w:val="22"/>
+        </w:rPr>
+        <w:t xml:space="preserve">): Year 1 minutes ~ prior league (Serie A as baseline) + prior minutes + position, then models that add prior trait percentiles. Associative only — not a validated forecast. Headline pattern: </w:t>
+      </w:r>
+      <w:r>
+        <w:rPr>
+          <w:rFonts w:ascii="Calibri" w:hAnsi="Calibri"/>
+          <w:b/>
+          <w:sz w:val="22"/>
+        </w:rPr>
+        <w:t>league gaps look modest</w:t>
+      </w:r>
+      <w:r>
+        <w:rPr>
+          <w:rFonts w:ascii="Calibri" w:hAnsi="Calibri"/>
+          <w:sz w:val="22"/>
+        </w:rPr>
+        <w:t>; adding traits raises fit more than league labels alone (see README / deck for coefficients).</w:t>
+      </w:r>
+    </w:p>
+    <w:p/>
+    <w:p>
+      <w:r>
+        <w:rPr>
+          <w:rFonts w:ascii="Calibri" w:hAnsi="Calibri"/>
+          <w:sz w:val="22"/>
+        </w:rPr>
         <w:t>---</w:t>
       </w:r>
     </w:p>
@@ -247,18 +3919,366 @@
         <w:pStyle w:val="Heading2"/>
       </w:pPr>
       <w:r>
-        <w:t>FBref feeder coverage</w:t>
+        <w:t>What we produced (deliverables)</w:t>
+      </w:r>
+    </w:p>
+    <w:p/>
+    <w:tbl>
+      <w:tblPr>
+        <w:tblStyle w:val="TableGrid"/>
+        <w:tblW w:type="auto" w:w="0"/>
+        <w:tblLook w:firstColumn="1" w:firstRow="1" w:lastColumn="0" w:lastRow="0" w:noHBand="0" w:noVBand="1" w:val="04A0"/>
+      </w:tblPr>
+      <w:tblGrid>
+        <w:gridCol w:w="3120"/>
+        <w:gridCol w:w="3120"/>
+        <w:gridCol w:w="3120"/>
+      </w:tblGrid>
+      <w:tr>
+        <w:tc>
+          <w:tcPr>
+            <w:tcW w:type="dxa" w:w="3120"/>
+          </w:tcPr>
+          <w:p>
+            <w:r>
+              <w:rPr>
+                <w:b/>
+              </w:rPr>
+            </w:r>
+            <w:r>
+              <w:rPr>
+                <w:rFonts w:ascii="Calibri" w:hAnsi="Calibri"/>
+                <w:b/>
+                <w:sz w:val="22"/>
+              </w:rPr>
+              <w:t>#</w:t>
+            </w:r>
+          </w:p>
+        </w:tc>
+        <w:tc>
+          <w:tcPr>
+            <w:tcW w:type="dxa" w:w="3120"/>
+          </w:tcPr>
+          <w:p>
+            <w:r>
+              <w:rPr>
+                <w:b/>
+              </w:rPr>
+            </w:r>
+            <w:r>
+              <w:rPr>
+                <w:rFonts w:ascii="Calibri" w:hAnsi="Calibri"/>
+                <w:b/>
+                <w:sz w:val="22"/>
+              </w:rPr>
+              <w:t>File</w:t>
+            </w:r>
+          </w:p>
+        </w:tc>
+        <w:tc>
+          <w:tcPr>
+            <w:tcW w:type="dxa" w:w="3120"/>
+          </w:tcPr>
+          <w:p>
+            <w:r>
+              <w:rPr>
+                <w:b/>
+              </w:rPr>
+            </w:r>
+            <w:r>
+              <w:rPr>
+                <w:rFonts w:ascii="Calibri" w:hAnsi="Calibri"/>
+                <w:b/>
+                <w:sz w:val="22"/>
+              </w:rPr>
+              <w:t>What a reader gets</w:t>
+            </w:r>
+          </w:p>
+        </w:tc>
+      </w:tr>
+      <w:tr>
+        <w:tc>
+          <w:tcPr>
+            <w:tcW w:type="dxa" w:w="3120"/>
+          </w:tcPr>
+          <w:p>
+            <w:r/>
+            <w:r>
+              <w:rPr>
+                <w:rFonts w:ascii="Calibri" w:hAnsi="Calibri"/>
+                <w:sz w:val="22"/>
+              </w:rPr>
+              <w:t>1</w:t>
+            </w:r>
+          </w:p>
+        </w:tc>
+        <w:tc>
+          <w:tcPr>
+            <w:tcW w:type="dxa" w:w="3120"/>
+          </w:tcPr>
+          <w:p>
+            <w:r/>
+            <w:r>
+              <w:rPr>
+                <w:rFonts w:ascii="Calibri" w:hAnsi="Calibri"/>
+                <w:sz w:val="22"/>
+              </w:rPr>
+              <w:t>`projectproposal.docx` / `projectproposal.txt`</w:t>
+            </w:r>
+          </w:p>
+        </w:tc>
+        <w:tc>
+          <w:tcPr>
+            <w:tcW w:type="dxa" w:w="3120"/>
+          </w:tcPr>
+          <w:p>
+            <w:r/>
+            <w:r>
+              <w:rPr>
+                <w:rFonts w:ascii="Calibri" w:hAnsi="Calibri"/>
+                <w:sz w:val="22"/>
+              </w:rPr>
+              <w:t>This self-contained memo</w:t>
+            </w:r>
+          </w:p>
+        </w:tc>
+      </w:tr>
+      <w:tr>
+        <w:tc>
+          <w:tcPr>
+            <w:tcW w:type="dxa" w:w="3120"/>
+          </w:tcPr>
+          <w:p>
+            <w:r/>
+            <w:r>
+              <w:rPr>
+                <w:rFonts w:ascii="Calibri" w:hAnsi="Calibri"/>
+                <w:sz w:val="22"/>
+              </w:rPr>
+              <w:t>2</w:t>
+            </w:r>
+          </w:p>
+        </w:tc>
+        <w:tc>
+          <w:tcPr>
+            <w:tcW w:type="dxa" w:w="3120"/>
+          </w:tcPr>
+          <w:p>
+            <w:r/>
+            <w:r>
+              <w:rPr>
+                <w:rFonts w:ascii="Calibri" w:hAnsi="Calibri"/>
+                <w:sz w:val="22"/>
+              </w:rPr>
+              <w:t>`bundesliga_transfer_traits.pptx`</w:t>
+            </w:r>
+          </w:p>
+        </w:tc>
+        <w:tc>
+          <w:tcPr>
+            <w:tcW w:type="dxa" w:w="3120"/>
+          </w:tcPr>
+          <w:p>
+            <w:r/>
+            <w:r>
+              <w:rPr>
+                <w:rFonts w:ascii="Calibri" w:hAnsi="Calibri"/>
+                <w:sz w:val="22"/>
+              </w:rPr>
+              <w:t>Method + results deck (steps, tables, conclusion, metric glossary)</w:t>
+            </w:r>
+          </w:p>
+        </w:tc>
+      </w:tr>
+      <w:tr>
+        <w:tc>
+          <w:tcPr>
+            <w:tcW w:type="dxa" w:w="3120"/>
+          </w:tcPr>
+          <w:p>
+            <w:r/>
+            <w:r>
+              <w:rPr>
+                <w:rFonts w:ascii="Calibri" w:hAnsi="Calibri"/>
+                <w:sz w:val="22"/>
+              </w:rPr>
+              <w:t>3</w:t>
+            </w:r>
+          </w:p>
+        </w:tc>
+        <w:tc>
+          <w:tcPr>
+            <w:tcW w:type="dxa" w:w="3120"/>
+          </w:tcPr>
+          <w:p>
+            <w:r/>
+            <w:r>
+              <w:rPr>
+                <w:rFonts w:ascii="Calibri" w:hAnsi="Calibri"/>
+                <w:sz w:val="22"/>
+              </w:rPr>
+              <w:t>`interactive_player_explorer.html`</w:t>
+            </w:r>
+          </w:p>
+        </w:tc>
+        <w:tc>
+          <w:tcPr>
+            <w:tcW w:type="dxa" w:w="3120"/>
+          </w:tcPr>
+          <w:p>
+            <w:r/>
+            <w:r>
+              <w:rPr>
+                <w:rFonts w:ascii="Calibri" w:hAnsi="Calibri"/>
+                <w:sz w:val="22"/>
+              </w:rPr>
+              <w:t>Success summary + player radars (FBref ↔ StatsBomb); open in a browser offline</w:t>
+            </w:r>
+          </w:p>
+        </w:tc>
+      </w:tr>
+      <w:tr>
+        <w:tc>
+          <w:tcPr>
+            <w:tcW w:type="dxa" w:w="3120"/>
+          </w:tcPr>
+          <w:p>
+            <w:r/>
+            <w:r>
+              <w:rPr>
+                <w:rFonts w:ascii="Calibri" w:hAnsi="Calibri"/>
+                <w:sz w:val="22"/>
+              </w:rPr>
+              <w:t>4</w:t>
+            </w:r>
+          </w:p>
+        </w:tc>
+        <w:tc>
+          <w:tcPr>
+            <w:tcW w:type="dxa" w:w="3120"/>
+          </w:tcPr>
+          <w:p>
+            <w:r/>
+            <w:r>
+              <w:rPr>
+                <w:rFonts w:ascii="Calibri" w:hAnsi="Calibri"/>
+                <w:sz w:val="22"/>
+              </w:rPr>
+              <w:t>`stability_redundancy_inspector.html`</w:t>
+            </w:r>
+          </w:p>
+        </w:tc>
+        <w:tc>
+          <w:tcPr>
+            <w:tcW w:type="dxa" w:w="3120"/>
+          </w:tcPr>
+          <w:p>
+            <w:r/>
+            <w:r>
+              <w:rPr>
+                <w:rFonts w:ascii="Calibri" w:hAnsi="Calibri"/>
+                <w:sz w:val="22"/>
+              </w:rPr>
+              <w:t>Combined stability / redundancy inspector for both sources</w:t>
+            </w:r>
+          </w:p>
+        </w:tc>
+      </w:tr>
+      <w:tr>
+        <w:tc>
+          <w:tcPr>
+            <w:tcW w:type="dxa" w:w="3120"/>
+          </w:tcPr>
+          <w:p>
+            <w:r/>
+            <w:r>
+              <w:rPr>
+                <w:rFonts w:ascii="Calibri" w:hAnsi="Calibri"/>
+                <w:sz w:val="22"/>
+              </w:rPr>
+              <w:t>5</w:t>
+            </w:r>
+          </w:p>
+        </w:tc>
+        <w:tc>
+          <w:tcPr>
+            <w:tcW w:type="dxa" w:w="3120"/>
+          </w:tcPr>
+          <w:p>
+            <w:r/>
+            <w:r>
+              <w:rPr>
+                <w:rFonts w:ascii="Calibri" w:hAnsi="Calibri"/>
+                <w:sz w:val="22"/>
+              </w:rPr>
+              <w:t>`README.md`</w:t>
+            </w:r>
+          </w:p>
+        </w:tc>
+        <w:tc>
+          <w:tcPr>
+            <w:tcW w:type="dxa" w:w="3120"/>
+          </w:tcPr>
+          <w:p>
+            <w:r/>
+            <w:r>
+              <w:rPr>
+                <w:rFonts w:ascii="Calibri" w:hAnsi="Calibri"/>
+                <w:sz w:val="22"/>
+              </w:rPr>
+              <w:t>Package notes + feeder-regression tables</w:t>
+            </w:r>
+          </w:p>
+        </w:tc>
+      </w:tr>
+    </w:tbl>
+    <w:p/>
+    <w:p>
+      <w:r>
+        <w:rPr>
+          <w:rFonts w:ascii="Calibri" w:hAnsi="Calibri"/>
+          <w:sz w:val="22"/>
+        </w:rPr>
+        <w:t xml:space="preserve">Headline findings (detail in the deck and explorer): FBref shortlist </w:t>
+      </w:r>
+      <w:r>
+        <w:rPr>
+          <w:rFonts w:ascii="Calibri" w:hAnsi="Calibri"/>
+          <w:b/>
+          <w:sz w:val="22"/>
+        </w:rPr>
+        <w:t>105 → 43 → 32</w:t>
+      </w:r>
+      <w:r>
+        <w:rPr>
+          <w:rFonts w:ascii="Calibri" w:hAnsi="Calibri"/>
+          <w:sz w:val="22"/>
+        </w:rPr>
+        <w:t xml:space="preserve">; StatsBomb </w:t>
+      </w:r>
+      <w:r>
+        <w:rPr>
+          <w:rFonts w:ascii="Calibri" w:hAnsi="Calibri"/>
+          <w:b/>
+          <w:sz w:val="22"/>
+        </w:rPr>
+        <w:t>16 → 7</w:t>
+      </w:r>
+      <w:r>
+        <w:rPr>
+          <w:rFonts w:ascii="Calibri" w:hAnsi="Calibri"/>
+          <w:sz w:val="22"/>
+        </w:rPr>
+        <w:t xml:space="preserve"> (all seven kept). FBref traits most linked to Year 1 in Bundesliga minutes (p &lt; 0.05 in the exploratory trait screen) include final-third passing, shot blocks, progressive carry distance, and box defending. Feeder-league gaps are modest relative to prior trait profile in the exploratory OLS.</w:t>
       </w:r>
     </w:p>
     <w:p/>
     <w:p>
       <w:r>
-        <w:t>Season dumps (slimmed to inbound-roster players): 2. Bundesliga · Eredivisie · Austria · Portugal · Belgium · Swiss · Turkey · Championship · Ligue 2 · Segunda · Serie B · Denmark · Poland · Czech (plus Big Five caches for Year 1 in Bundesliga / Big-5 priors). Working analysis uses 19 leagues populating the FBref tables; paired inbound N = 329.</w:t>
-      </w:r>
-    </w:p>
-    <w:p/>
-    <w:p>
-      <w:r>
+        <w:rPr>
+          <w:rFonts w:ascii="Calibri" w:hAnsi="Calibri"/>
+          <w:sz w:val="22"/>
+        </w:rPr>
         <w:t>---</w:t>
       </w:r>
     </w:p>
@@ -268,23 +4288,212 @@
         <w:pStyle w:val="Heading2"/>
       </w:pPr>
       <w:r>
-        <w:t>Data stack</w:t>
+        <w:t>Steps (how the work was done)</w:t>
       </w:r>
     </w:p>
     <w:p/>
     <w:p>
-      <w:r>
-        <w:t>1. Football Reference (FBref) — primary layer for stability / redundancy / pizza / success at scale (329 pairs · 32 traits).</w:t>
+      <w:pPr>
+        <w:pStyle w:val="ListNumber"/>
+      </w:pPr>
+      <w:r>
+        <w:rPr>
+          <w:rFonts w:ascii="Calibri" w:hAnsi="Calibri"/>
+          <w:sz w:val="22"/>
+        </w:rPr>
+        <w:t xml:space="preserve">Build the inbound cohort: first 1. Bundesliga season in the study window, prior season ≠ 1. Bundesliga, </w:t>
+      </w:r>
+      <w:r>
+        <w:rPr>
+          <w:rFonts w:ascii="Calibri" w:hAnsi="Calibri"/>
+          <w:b/>
+          <w:sz w:val="22"/>
+        </w:rPr>
+        <w:t>and</w:t>
+      </w:r>
+      <w:r>
+        <w:rPr>
+          <w:rFonts w:ascii="Calibri" w:hAnsi="Calibri"/>
+          <w:sz w:val="22"/>
+        </w:rPr>
+        <w:t xml:space="preserve"> clear the minutes floors (FBref prior / Year 1 ≥ </w:t>
+      </w:r>
+      <w:r>
+        <w:rPr>
+          <w:rFonts w:ascii="Calibri" w:hAnsi="Calibri"/>
+          <w:b/>
+          <w:sz w:val="22"/>
+        </w:rPr>
+        <w:t>300′</w:t>
+      </w:r>
+      <w:r>
+        <w:rPr>
+          <w:rFonts w:ascii="Calibri" w:hAnsi="Calibri"/>
+          <w:sz w:val="22"/>
+        </w:rPr>
+        <w:t xml:space="preserve">; StatsBomb prior ≥ </w:t>
+      </w:r>
+      <w:r>
+        <w:rPr>
+          <w:rFonts w:ascii="Calibri" w:hAnsi="Calibri"/>
+          <w:b/>
+          <w:sz w:val="22"/>
+        </w:rPr>
+        <w:t>45′</w:t>
+      </w:r>
+      <w:r>
+        <w:rPr>
+          <w:rFonts w:ascii="Calibri" w:hAnsi="Calibri"/>
+          <w:sz w:val="22"/>
+        </w:rPr>
+        <w:t xml:space="preserve"> / Year 1 ≥ </w:t>
+      </w:r>
+      <w:r>
+        <w:rPr>
+          <w:rFonts w:ascii="Calibri" w:hAnsi="Calibri"/>
+          <w:b/>
+          <w:sz w:val="22"/>
+        </w:rPr>
+        <w:t>30′</w:t>
+      </w:r>
+      <w:r>
+        <w:rPr>
+          <w:rFonts w:ascii="Calibri" w:hAnsi="Calibri"/>
+          <w:sz w:val="22"/>
+        </w:rPr>
+        <w:t>); pull that prior-league season’s stats.</w:t>
       </w:r>
     </w:p>
     <w:p>
-      <w:r>
-        <w:t>2. StatsBomb Open Data — event deep dive + explorer toggle (96 players · 7 traits).</w:t>
+      <w:pPr>
+        <w:pStyle w:val="ListNumber"/>
+      </w:pPr>
+      <w:r>
+        <w:rPr>
+          <w:rFonts w:ascii="Calibri" w:hAnsi="Calibri"/>
+          <w:sz w:val="22"/>
+        </w:rPr>
+      </w:r>
+      <w:r>
+        <w:rPr>
+          <w:rFonts w:ascii="Calibri" w:hAnsi="Calibri"/>
+          <w:b/>
+          <w:sz w:val="22"/>
+        </w:rPr>
+        <w:t>Stability</w:t>
+      </w:r>
+      <w:r>
+        <w:rPr>
+          <w:rFonts w:ascii="Calibri" w:hAnsi="Calibri"/>
+          <w:sz w:val="22"/>
+        </w:rPr>
+        <w:t xml:space="preserve"> — correlate prior → Year 1 in Bundesliga; apply the source-specific Pearson floors above.</w:t>
+      </w:r>
+    </w:p>
+    <w:p>
+      <w:pPr>
+        <w:pStyle w:val="ListNumber"/>
+      </w:pPr>
+      <w:r>
+        <w:rPr>
+          <w:rFonts w:ascii="Calibri" w:hAnsi="Calibri"/>
+          <w:sz w:val="22"/>
+        </w:rPr>
+      </w:r>
+      <w:r>
+        <w:rPr>
+          <w:rFonts w:ascii="Calibri" w:hAnsi="Calibri"/>
+          <w:b/>
+          <w:sz w:val="22"/>
+        </w:rPr>
+        <w:t>Redundancy</w:t>
+      </w:r>
+      <w:r>
+        <w:rPr>
+          <w:rFonts w:ascii="Calibri" w:hAnsi="Calibri"/>
+          <w:sz w:val="22"/>
+        </w:rPr>
+        <w:t xml:space="preserve"> — drop near-duplicates with the pick rules above; shortlist the scout card (</w:t>
+      </w:r>
+      <w:r>
+        <w:rPr>
+          <w:rFonts w:ascii="Calibri" w:hAnsi="Calibri"/>
+          <w:b/>
+          <w:sz w:val="22"/>
+        </w:rPr>
+        <w:t>32</w:t>
+      </w:r>
+      <w:r>
+        <w:rPr>
+          <w:rFonts w:ascii="Calibri" w:hAnsi="Calibri"/>
+          <w:sz w:val="22"/>
+        </w:rPr>
+        <w:t xml:space="preserve"> FBref · </w:t>
+      </w:r>
+      <w:r>
+        <w:rPr>
+          <w:rFonts w:ascii="Calibri" w:hAnsi="Calibri"/>
+          <w:b/>
+          <w:sz w:val="22"/>
+        </w:rPr>
+        <w:t>7</w:t>
+      </w:r>
+      <w:r>
+        <w:rPr>
+          <w:rFonts w:ascii="Calibri" w:hAnsi="Calibri"/>
+          <w:sz w:val="22"/>
+        </w:rPr>
+        <w:t xml:space="preserve"> StatsBomb).</w:t>
+      </w:r>
+    </w:p>
+    <w:p>
+      <w:pPr>
+        <w:pStyle w:val="ListNumber"/>
+      </w:pPr>
+      <w:r>
+        <w:rPr>
+          <w:rFonts w:ascii="Calibri" w:hAnsi="Calibri"/>
+          <w:sz w:val="22"/>
+        </w:rPr>
+      </w:r>
+      <w:r>
+        <w:rPr>
+          <w:rFonts w:ascii="Calibri" w:hAnsi="Calibri"/>
+          <w:b/>
+          <w:sz w:val="22"/>
+        </w:rPr>
+        <w:t>Profiles &amp; significance</w:t>
+      </w:r>
+      <w:r>
+        <w:rPr>
+          <w:rFonts w:ascii="Calibri" w:hAnsi="Calibri"/>
+          <w:sz w:val="22"/>
+        </w:rPr>
+        <w:t xml:space="preserve"> — explorer / pizza graphics; Spearman trait and league tests vs </w:t>
+      </w:r>
+      <w:r>
+        <w:rPr>
+          <w:rFonts w:ascii="Calibri" w:hAnsi="Calibri"/>
+          <w:b/>
+          <w:sz w:val="22"/>
+        </w:rPr>
+        <w:t>Year 1 in Bundesliga minutes</w:t>
+      </w:r>
+      <w:r>
+        <w:rPr>
+          <w:rFonts w:ascii="Calibri" w:hAnsi="Calibri"/>
+          <w:sz w:val="22"/>
+        </w:rPr>
+        <w:t>; exploratory OLS on the Big-5 subset.</w:t>
       </w:r>
     </w:p>
     <w:p/>
     <w:p>
       <w:r>
+        <w:rPr>
+          <w:rFonts w:ascii="Calibri" w:hAnsi="Calibri"/>
+          <w:sz w:val="22"/>
+        </w:rPr>
         <w:t>---</w:t>
       </w:r>
     </w:p>
@@ -294,132 +4503,224 @@
         <w:pStyle w:val="Heading2"/>
       </w:pPr>
       <w:r>
-        <w:t>Deliverables (submit package)</w:t>
-      </w:r>
-    </w:p>
-    <w:p/>
-    <w:p>
-      <w:r>
-        <w:t>| # | File | Description |</w:t>
-      </w:r>
-    </w:p>
-    <w:p>
-      <w:r>
-        <w:t>|---|------|-------------|</w:t>
-      </w:r>
-    </w:p>
-    <w:p>
-      <w:r>
-        <w:t>| 1 | `projectproposal.docx` / `projectproposal.txt` | This proposal |</w:t>
-      </w:r>
-    </w:p>
-    <w:p>
-      <w:r>
-        <w:t>| 2 | `bundesliga_transfer_traits.pptx` | Method + final results deck (includes project steps timeline + conclusion + metric glossary) |</w:t>
-      </w:r>
-    </w:p>
-    <w:p>
-      <w:r>
-        <w:t>| 3 | `interactive_player_explorer.html` | Success summary + player radars (FBref ↔ StatsBomb) |</w:t>
-      </w:r>
-    </w:p>
-    <w:p>
-      <w:r>
-        <w:t>| 4 | `stability_redundancy_inspector.html` | Combined FBref + StatsBomb stability / redundancy inspector |</w:t>
-      </w:r>
-    </w:p>
-    <w:p>
-      <w:r>
-        <w:t>| 5 | `README.md` | Package notes + feeder-regression tables |</w:t>
-      </w:r>
-    </w:p>
-    <w:p/>
-    <w:p>
-      <w:r>
-        <w:t>---</w:t>
+        <w:t>Why this design works for a one-credit / independent-study package</w:t>
       </w:r>
     </w:p>
     <w:p/>
     <w:p>
       <w:pPr>
-        <w:pStyle w:val="Heading2"/>
+        <w:pStyle w:val="ListBullet"/>
       </w:pPr>
       <w:r>
-        <w:t>Steps</w:t>
+        <w:rPr>
+          <w:rFonts w:ascii="Calibri" w:hAnsi="Calibri"/>
+          <w:sz w:val="22"/>
+        </w:rPr>
+      </w:r>
+      <w:r>
+        <w:rPr>
+          <w:rFonts w:ascii="Calibri" w:hAnsi="Calibri"/>
+          <w:b/>
+          <w:sz w:val="22"/>
+        </w:rPr>
+        <w:t>Honest N:</w:t>
+      </w:r>
+      <w:r>
+        <w:rPr>
+          <w:rFonts w:ascii="Calibri" w:hAnsi="Calibri"/>
+          <w:sz w:val="22"/>
+        </w:rPr>
+        <w:t xml:space="preserve"> FBref </w:t>
+      </w:r>
+      <w:r>
+        <w:rPr>
+          <w:rFonts w:ascii="Calibri" w:hAnsi="Calibri"/>
+          <w:b/>
+          <w:sz w:val="22"/>
+        </w:rPr>
+        <w:t>329</w:t>
+      </w:r>
+      <w:r>
+        <w:rPr>
+          <w:rFonts w:ascii="Calibri" w:hAnsi="Calibri"/>
+          <w:sz w:val="22"/>
+        </w:rPr>
+        <w:t xml:space="preserve"> paired seasons for the scale story; StatsBomb </w:t>
+      </w:r>
+      <w:r>
+        <w:rPr>
+          <w:rFonts w:ascii="Calibri" w:hAnsi="Calibri"/>
+          <w:b/>
+          <w:sz w:val="22"/>
+        </w:rPr>
+        <w:t>96</w:t>
+      </w:r>
+      <w:r>
+        <w:rPr>
+          <w:rFonts w:ascii="Calibri" w:hAnsi="Calibri"/>
+          <w:sz w:val="22"/>
+        </w:rPr>
+        <w:t xml:space="preserve"> for event depth — not a claim that open data alone has hundreds of clean feeder→Bundesliga event pairs.</w:t>
+      </w:r>
+    </w:p>
+    <w:p>
+      <w:pPr>
+        <w:pStyle w:val="ListBullet"/>
+      </w:pPr>
+      <w:r>
+        <w:rPr>
+          <w:rFonts w:ascii="Calibri" w:hAnsi="Calibri"/>
+          <w:sz w:val="22"/>
+        </w:rPr>
+      </w:r>
+      <w:r>
+        <w:rPr>
+          <w:rFonts w:ascii="Calibri" w:hAnsi="Calibri"/>
+          <w:b/>
+          <w:sz w:val="22"/>
+        </w:rPr>
+        <w:t>Narrow destination:</w:t>
+      </w:r>
+      <w:r>
+        <w:rPr>
+          <w:rFonts w:ascii="Calibri" w:hAnsi="Calibri"/>
+          <w:sz w:val="22"/>
+        </w:rPr>
+        <w:t xml:space="preserve"> only into the Bundesliga, so “travel” has one clear meaning.</w:t>
+      </w:r>
+    </w:p>
+    <w:p>
+      <w:pPr>
+        <w:pStyle w:val="ListBullet"/>
+      </w:pPr>
+      <w:r>
+        <w:rPr>
+          <w:rFonts w:ascii="Calibri" w:hAnsi="Calibri"/>
+          <w:sz w:val="22"/>
+        </w:rPr>
+      </w:r>
+      <w:r>
+        <w:rPr>
+          <w:rFonts w:ascii="Calibri" w:hAnsi="Calibri"/>
+          <w:b/>
+          <w:sz w:val="22"/>
+        </w:rPr>
+        <w:t>Clear pipeline:</w:t>
+      </w:r>
+      <w:r>
+        <w:rPr>
+          <w:rFonts w:ascii="Calibri" w:hAnsi="Calibri"/>
+          <w:sz w:val="22"/>
+        </w:rPr>
+        <w:t xml:space="preserve"> stability → thresholds → redundancy → explorer → significance, each defined above.</w:t>
+      </w:r>
+    </w:p>
+    <w:p>
+      <w:pPr>
+        <w:pStyle w:val="ListBullet"/>
+      </w:pPr>
+      <w:r>
+        <w:rPr>
+          <w:rFonts w:ascii="Calibri" w:hAnsi="Calibri"/>
+          <w:sz w:val="22"/>
+        </w:rPr>
+      </w:r>
+      <w:r>
+        <w:rPr>
+          <w:rFonts w:ascii="Calibri" w:hAnsi="Calibri"/>
+          <w:b/>
+          <w:sz w:val="22"/>
+        </w:rPr>
+        <w:t>Multi-league FBref:</w:t>
+      </w:r>
+      <w:r>
+        <w:rPr>
+          <w:rFonts w:ascii="Calibri" w:hAnsi="Calibri"/>
+          <w:sz w:val="22"/>
+        </w:rPr>
+        <w:t xml:space="preserve"> same method beyond Big-Five-only anecdotes.</w:t>
+      </w:r>
+    </w:p>
+    <w:p>
+      <w:pPr>
+        <w:pStyle w:val="ListBullet"/>
+      </w:pPr>
+      <w:r>
+        <w:rPr>
+          <w:rFonts w:ascii="Calibri" w:hAnsi="Calibri"/>
+          <w:sz w:val="22"/>
+        </w:rPr>
+      </w:r>
+      <w:r>
+        <w:rPr>
+          <w:rFonts w:ascii="Calibri" w:hAnsi="Calibri"/>
+          <w:b/>
+          <w:sz w:val="22"/>
+        </w:rPr>
+        <w:t>Accurate roles for each source:</w:t>
+      </w:r>
+      <w:r>
+        <w:rPr>
+          <w:rFonts w:ascii="Calibri" w:hAnsi="Calibri"/>
+          <w:sz w:val="22"/>
+        </w:rPr>
+        <w:t xml:space="preserve"> FBref for portable rates and feeder readouts; StatsBomb as a smaller, deeper event check.</w:t>
+      </w:r>
+    </w:p>
+    <w:p>
+      <w:pPr>
+        <w:pStyle w:val="ListBullet"/>
+      </w:pPr>
+      <w:r>
+        <w:rPr>
+          <w:rFonts w:ascii="Calibri" w:hAnsi="Calibri"/>
+          <w:sz w:val="22"/>
+        </w:rPr>
+      </w:r>
+      <w:r>
+        <w:rPr>
+          <w:rFonts w:ascii="Calibri" w:hAnsi="Calibri"/>
+          <w:b/>
+          <w:sz w:val="22"/>
+        </w:rPr>
+        <w:t>Self-contained package:</w:t>
+      </w:r>
+      <w:r>
+        <w:rPr>
+          <w:rFonts w:ascii="Calibri" w:hAnsi="Calibri"/>
+          <w:sz w:val="22"/>
+        </w:rPr>
+        <w:t xml:space="preserve"> memo + deck + HTML tools; regenerable analysis tables stay local (`results/`, gitignored) while headline numbers live in this memo, the README, and the deck.</w:t>
       </w:r>
     </w:p>
     <w:p/>
     <w:p>
       <w:r>
-        <w:t>- Build the inbound cohort: first 1. Bundesliga season in the study window, prior season ≠ 1. Bundesliga, and clear the minutes floors (FBref prior/Year 1 in Bundesliga ≥ 300′; StatsBomb prior ≥ 45′ / Year 1 in Bundesliga ≥ 30′); pull that prior-league season’s stats</w:t>
-      </w:r>
-    </w:p>
-    <w:p>
-      <w:r>
-        <w:t>- Stability — correlate prior → Year 1 in Bundesliga; choose source-specific thresholds so we keep enough metrics without pretending weak correlations are portable</w:t>
-      </w:r>
-    </w:p>
-    <w:p>
-      <w:r>
-        <w:t>- Redundancy — drop near-duplicates with contextual keep rules; shortlist the scout card (32 FBref · 7 StatsBomb)</w:t>
-      </w:r>
-    </w:p>
-    <w:p>
-      <w:r>
-        <w:t>- Profiles &amp; significance — explorer / pizza graphics; Spearman trait &amp; league tests vs Year 1 in Bundesliga minutes</w:t>
-      </w:r>
-    </w:p>
-    <w:p/>
-    <w:p>
-      <w:r>
-        <w:t>---</w:t>
-      </w:r>
-    </w:p>
-    <w:p/>
-    <w:p>
-      <w:pPr>
-        <w:pStyle w:val="Heading2"/>
-      </w:pPr>
-      <w:r>
-        <w:t>Why this works?</w:t>
-      </w:r>
-    </w:p>
-    <w:p/>
-    <w:p>
-      <w:r>
-        <w:t>- Honest N: FBref 329 paired seasons for the scale story; StatsBomb 96 for event depth — not a claim that open data alone has hundreds of clean feeder→Bundesliga pairs.</w:t>
-      </w:r>
-    </w:p>
-    <w:p>
-      <w:r>
-        <w:t>- Narrow: only into the Bundesliga.</w:t>
-      </w:r>
-    </w:p>
-    <w:p>
-      <w:r>
-        <w:t>- Clear pipeline: stability → thresholds → redundancy → explorer → significance.</w:t>
-      </w:r>
-    </w:p>
-    <w:p>
-      <w:r>
-        <w:t>- Multi-league FBref: same method beyond Big-5-only anecdotes.</w:t>
-      </w:r>
-    </w:p>
-    <w:p>
-      <w:r>
-        <w:t>- Accurate where it matters: FBref for portable rates + feeder readouts; StatsBomb as a smaller, deeper event check.</w:t>
-      </w:r>
-    </w:p>
-    <w:p/>
-    <w:p>
-      <w:r>
-        <w:t>Attributions: Football Reference / Sports Reference; StatsBomb Open Data (where used).</w:t>
+        <w:rPr>
+          <w:rFonts w:ascii="Calibri" w:hAnsi="Calibri"/>
+          <w:sz w:val="22"/>
+        </w:rPr>
+      </w:r>
+      <w:r>
+        <w:rPr>
+          <w:rFonts w:ascii="Calibri" w:hAnsi="Calibri"/>
+          <w:b/>
+          <w:sz w:val="22"/>
+        </w:rPr>
+        <w:t>Attributions:</w:t>
+      </w:r>
+      <w:r>
+        <w:rPr>
+          <w:rFonts w:ascii="Calibri" w:hAnsi="Calibri"/>
+          <w:sz w:val="22"/>
+        </w:rPr>
+        <w:t xml:space="preserve"> Football Reference / Sports Reference; StatsBomb Open Data (where used).</w:t>
       </w:r>
     </w:p>
     <w:p/>
     <w:sectPr>
       <w:pgSz w:w="12240" w:h="15840"/>
-      <w:pgMar w:top="1440" w:right="1800" w:bottom="1440" w:left="1800" w:header="720" w:footer="720" w:gutter="0"/>
+      <w:pgMar w:top="1224" w:right="1440" w:bottom="1224" w:left="1440" w:header="720" w:footer="720" w:gutter="0"/>
       <w:cols w:space="720"/>
       <w:docGrid w:linePitch="360"/>
     </w:sectPr>

</xml_diff>

<commit_message>
Align submit deliverables to the five package outputs only.
List deck, README, both HTML tools, and the proposal once in the README, proposal, and closing PPT slide.

Co-authored-by: Cursor <cursoragent@cursor.com>
</commit_message>
<xml_diff>
--- a/projectproposal.docx
+++ b/projectproposal.docx
@@ -1735,7 +1735,15 @@
         <w:pStyle w:val="Heading1"/>
       </w:pPr>
       <w:r>
+        <w:rPr>
+          <w:b/>
+        </w:rPr>
         <w:t>What we produced (deliverables)</w:t>
+      </w:r>
+    </w:p>
+    <w:p>
+      <w:r>
+        <w:t>These five files are the package outputs:</w:t>
       </w:r>
     </w:p>
     <w:tbl>
@@ -1798,7 +1806,7 @@
           </w:tcPr>
           <w:p>
             <w:r>
-              <w:t>`projectproposal.docx` / `projectproposal.txt`</w:t>
+              <w:t>bundesliga_transfer_traits.pptx</w:t>
             </w:r>
           </w:p>
         </w:tc>
@@ -1808,7 +1816,7 @@
           </w:tcPr>
           <w:p>
             <w:r>
-              <w:t>This self-contained memo</w:t>
+              <w:t>Method + results deck (steps, tables, conclusion, metric glossary)</w:t>
             </w:r>
           </w:p>
         </w:tc>
@@ -1830,7 +1838,7 @@
           </w:tcPr>
           <w:p>
             <w:r>
-              <w:t>`bundesliga_transfer_traits.pptx`</w:t>
+              <w:t>README.md</w:t>
             </w:r>
           </w:p>
         </w:tc>
@@ -1840,7 +1848,7 @@
           </w:tcPr>
           <w:p>
             <w:r>
-              <w:t>Method + results deck (steps, tables, conclusion, metric glossary)</w:t>
+              <w:t>Package overview + prior-league regression tables</w:t>
             </w:r>
           </w:p>
         </w:tc>
@@ -1862,7 +1870,7 @@
           </w:tcPr>
           <w:p>
             <w:r>
-              <w:t>`interactive_player_explorer.html`</w:t>
+              <w:t>interactive_player_explorer.html</w:t>
             </w:r>
           </w:p>
         </w:tc>
@@ -1894,7 +1902,7 @@
           </w:tcPr>
           <w:p>
             <w:r>
-              <w:t>`stability_redundancy_inspector.html`</w:t>
+              <w:t>stability_redundancy_inspector.html</w:t>
             </w:r>
           </w:p>
         </w:tc>
@@ -1926,7 +1934,7 @@
           </w:tcPr>
           <w:p>
             <w:r>
-              <w:t>`README.md`</w:t>
+              <w:t>projectproposal.docx</w:t>
             </w:r>
           </w:p>
         </w:tc>
@@ -1936,7 +1944,7 @@
           </w:tcPr>
           <w:p>
             <w:r>
-              <w:t>Package notes + prior-league regression tables</w:t>
+              <w:t>This self-contained memo (Word); projectproposal.txt is the plain-text source of the same memo</w:t>
             </w:r>
           </w:p>
         </w:tc>

</xml_diff>